<commit_message>
Report: fix page-flow spacing, change supervisor to Suchi Sharma
Co-Authored-By: Claude Opus 5.5 (1M context) <noreply@anthropic.com>
</commit_message>
<xml_diff>
--- a/docs/ExpenseSplitter_Project_Report.docx
+++ b/docs/ExpenseSplitter_Project_Report.docx
@@ -355,6 +355,9 @@
         <w:gridCol w:w="4333"/>
       </w:tblGrid>
       <w:tr>
+        <w:trPr>
+          <w:cantSplit/>
+        </w:trPr>
         <w:tc>
           <w:tcPr>
             <w:tcW w:w="4333" w:type="dxa"/>
@@ -421,7 +424,7 @@
               <w:spacing w:after="200"/>
             </w:pPr>
             <w:r>
-              <w:t>Harsh Gupta</w:t>
+              <w:t>Suchi Sharma</w:t>
             </w:r>
           </w:p>
           <w:p>
@@ -534,7 +537,7 @@
           <w:r>
             <w:fldChar w:fldCharType="separate"/>
           </w:r>
-          <w:hyperlink w:anchor="_Toc244083319" w:history="1">
+          <w:hyperlink w:anchor="_Toc244083914" w:history="1">
             <w:r>
               <w:rPr>
                 <w:rStyle w:val="Hyperlink"/>
@@ -558,7 +561,7 @@
               <w:rPr>
                 <w:noProof/>
               </w:rPr>
-              <w:instrText xml:space="preserve"> PAGEREF _Toc244083319 \h </w:instrText>
+              <w:instrText xml:space="preserve"> PAGEREF _Toc244083914 \h </w:instrText>
             </w:r>
             <w:r>
               <w:rPr>
@@ -598,7 +601,7 @@
               <w14:ligatures w14:val="standardContextual"/>
             </w:rPr>
           </w:pPr>
-          <w:hyperlink w:anchor="_Toc244083320" w:history="1">
+          <w:hyperlink w:anchor="_Toc244083915" w:history="1">
             <w:r>
               <w:rPr>
                 <w:rStyle w:val="Hyperlink"/>
@@ -622,7 +625,7 @@
               <w:rPr>
                 <w:noProof/>
               </w:rPr>
-              <w:instrText xml:space="preserve"> PAGEREF _Toc244083320 \h </w:instrText>
+              <w:instrText xml:space="preserve"> PAGEREF _Toc244083915 \h </w:instrText>
             </w:r>
             <w:r>
               <w:rPr>
@@ -662,7 +665,7 @@
               <w14:ligatures w14:val="standardContextual"/>
             </w:rPr>
           </w:pPr>
-          <w:hyperlink w:anchor="_Toc244083321" w:history="1">
+          <w:hyperlink w:anchor="_Toc244083916" w:history="1">
             <w:r>
               <w:rPr>
                 <w:rStyle w:val="Hyperlink"/>
@@ -686,7 +689,7 @@
               <w:rPr>
                 <w:noProof/>
               </w:rPr>
-              <w:instrText xml:space="preserve"> PAGEREF _Toc244083321 \h </w:instrText>
+              <w:instrText xml:space="preserve"> PAGEREF _Toc244083916 \h </w:instrText>
             </w:r>
             <w:r>
               <w:rPr>
@@ -703,7 +706,7 @@
               <w:rPr>
                 <w:noProof/>
               </w:rPr>
-              <w:t>7</w:t>
+              <w:t>6</w:t>
             </w:r>
             <w:r>
               <w:rPr>
@@ -727,7 +730,7 @@
               <w14:ligatures w14:val="standardContextual"/>
             </w:rPr>
           </w:pPr>
-          <w:hyperlink w:anchor="_Toc244083322" w:history="1">
+          <w:hyperlink w:anchor="_Toc244083917" w:history="1">
             <w:r>
               <w:rPr>
                 <w:rStyle w:val="Hyperlink"/>
@@ -767,7 +770,7 @@
               <w:rPr>
                 <w:noProof/>
               </w:rPr>
-              <w:instrText xml:space="preserve"> PAGEREF _Toc244083322 \h </w:instrText>
+              <w:instrText xml:space="preserve"> PAGEREF _Toc244083917 \h </w:instrText>
             </w:r>
             <w:r>
               <w:rPr>
@@ -784,7 +787,7 @@
               <w:rPr>
                 <w:noProof/>
               </w:rPr>
-              <w:t>7</w:t>
+              <w:t>6</w:t>
             </w:r>
             <w:r>
               <w:rPr>
@@ -808,7 +811,7 @@
               <w14:ligatures w14:val="standardContextual"/>
             </w:rPr>
           </w:pPr>
-          <w:hyperlink w:anchor="_Toc244083323" w:history="1">
+          <w:hyperlink w:anchor="_Toc244083918" w:history="1">
             <w:r>
               <w:rPr>
                 <w:rStyle w:val="Hyperlink"/>
@@ -848,7 +851,7 @@
               <w:rPr>
                 <w:noProof/>
               </w:rPr>
-              <w:instrText xml:space="preserve"> PAGEREF _Toc244083323 \h </w:instrText>
+              <w:instrText xml:space="preserve"> PAGEREF _Toc244083918 \h </w:instrText>
             </w:r>
             <w:r>
               <w:rPr>
@@ -865,7 +868,7 @@
               <w:rPr>
                 <w:noProof/>
               </w:rPr>
-              <w:t>7</w:t>
+              <w:t>6</w:t>
             </w:r>
             <w:r>
               <w:rPr>
@@ -889,7 +892,7 @@
               <w14:ligatures w14:val="standardContextual"/>
             </w:rPr>
           </w:pPr>
-          <w:hyperlink w:anchor="_Toc244083324" w:history="1">
+          <w:hyperlink w:anchor="_Toc244083919" w:history="1">
             <w:r>
               <w:rPr>
                 <w:rStyle w:val="Hyperlink"/>
@@ -929,7 +932,7 @@
               <w:rPr>
                 <w:noProof/>
               </w:rPr>
-              <w:instrText xml:space="preserve"> PAGEREF _Toc244083324 \h </w:instrText>
+              <w:instrText xml:space="preserve"> PAGEREF _Toc244083919 \h </w:instrText>
             </w:r>
             <w:r>
               <w:rPr>
@@ -946,7 +949,7 @@
               <w:rPr>
                 <w:noProof/>
               </w:rPr>
-              <w:t>8</w:t>
+              <w:t>7</w:t>
             </w:r>
             <w:r>
               <w:rPr>
@@ -970,7 +973,7 @@
               <w14:ligatures w14:val="standardContextual"/>
             </w:rPr>
           </w:pPr>
-          <w:hyperlink w:anchor="_Toc244083325" w:history="1">
+          <w:hyperlink w:anchor="_Toc244083920" w:history="1">
             <w:r>
               <w:rPr>
                 <w:rStyle w:val="Hyperlink"/>
@@ -1010,7 +1013,7 @@
               <w:rPr>
                 <w:noProof/>
               </w:rPr>
-              <w:instrText xml:space="preserve"> PAGEREF _Toc244083325 \h </w:instrText>
+              <w:instrText xml:space="preserve"> PAGEREF _Toc244083920 \h </w:instrText>
             </w:r>
             <w:r>
               <w:rPr>
@@ -1027,7 +1030,7 @@
               <w:rPr>
                 <w:noProof/>
               </w:rPr>
-              <w:t>9</w:t>
+              <w:t>8</w:t>
             </w:r>
             <w:r>
               <w:rPr>
@@ -1051,7 +1054,7 @@
               <w14:ligatures w14:val="standardContextual"/>
             </w:rPr>
           </w:pPr>
-          <w:hyperlink w:anchor="_Toc244083326" w:history="1">
+          <w:hyperlink w:anchor="_Toc244083921" w:history="1">
             <w:r>
               <w:rPr>
                 <w:rStyle w:val="Hyperlink"/>
@@ -1091,7 +1094,7 @@
               <w:rPr>
                 <w:noProof/>
               </w:rPr>
-              <w:instrText xml:space="preserve"> PAGEREF _Toc244083326 \h </w:instrText>
+              <w:instrText xml:space="preserve"> PAGEREF _Toc244083921 \h </w:instrText>
             </w:r>
             <w:r>
               <w:rPr>
@@ -1108,7 +1111,7 @@
               <w:rPr>
                 <w:noProof/>
               </w:rPr>
-              <w:t>9</w:t>
+              <w:t>8</w:t>
             </w:r>
             <w:r>
               <w:rPr>
@@ -1131,7 +1134,7 @@
               <w14:ligatures w14:val="standardContextual"/>
             </w:rPr>
           </w:pPr>
-          <w:hyperlink w:anchor="_Toc244083327" w:history="1">
+          <w:hyperlink w:anchor="_Toc244083922" w:history="1">
             <w:r>
               <w:rPr>
                 <w:rStyle w:val="Hyperlink"/>
@@ -1155,7 +1158,7 @@
               <w:rPr>
                 <w:noProof/>
               </w:rPr>
-              <w:instrText xml:space="preserve"> PAGEREF _Toc244083327 \h </w:instrText>
+              <w:instrText xml:space="preserve"> PAGEREF _Toc244083922 \h </w:instrText>
             </w:r>
             <w:r>
               <w:rPr>
@@ -1172,7 +1175,7 @@
               <w:rPr>
                 <w:noProof/>
               </w:rPr>
-              <w:t>10</w:t>
+              <w:t>9</w:t>
             </w:r>
             <w:r>
               <w:rPr>
@@ -1196,7 +1199,7 @@
               <w14:ligatures w14:val="standardContextual"/>
             </w:rPr>
           </w:pPr>
-          <w:hyperlink w:anchor="_Toc244083328" w:history="1">
+          <w:hyperlink w:anchor="_Toc244083923" w:history="1">
             <w:r>
               <w:rPr>
                 <w:rStyle w:val="Hyperlink"/>
@@ -1236,7 +1239,7 @@
               <w:rPr>
                 <w:noProof/>
               </w:rPr>
-              <w:instrText xml:space="preserve"> PAGEREF _Toc244083328 \h </w:instrText>
+              <w:instrText xml:space="preserve"> PAGEREF _Toc244083923 \h </w:instrText>
             </w:r>
             <w:r>
               <w:rPr>
@@ -1253,7 +1256,7 @@
               <w:rPr>
                 <w:noProof/>
               </w:rPr>
-              <w:t>10</w:t>
+              <w:t>9</w:t>
             </w:r>
             <w:r>
               <w:rPr>
@@ -1277,7 +1280,7 @@
               <w14:ligatures w14:val="standardContextual"/>
             </w:rPr>
           </w:pPr>
-          <w:hyperlink w:anchor="_Toc244083329" w:history="1">
+          <w:hyperlink w:anchor="_Toc244083924" w:history="1">
             <w:r>
               <w:rPr>
                 <w:rStyle w:val="Hyperlink"/>
@@ -1317,7 +1320,7 @@
               <w:rPr>
                 <w:noProof/>
               </w:rPr>
-              <w:instrText xml:space="preserve"> PAGEREF _Toc244083329 \h </w:instrText>
+              <w:instrText xml:space="preserve"> PAGEREF _Toc244083924 \h </w:instrText>
             </w:r>
             <w:r>
               <w:rPr>
@@ -1334,7 +1337,7 @@
               <w:rPr>
                 <w:noProof/>
               </w:rPr>
-              <w:t>10</w:t>
+              <w:t>9</w:t>
             </w:r>
             <w:r>
               <w:rPr>
@@ -1358,7 +1361,7 @@
               <w14:ligatures w14:val="standardContextual"/>
             </w:rPr>
           </w:pPr>
-          <w:hyperlink w:anchor="_Toc244083330" w:history="1">
+          <w:hyperlink w:anchor="_Toc244083925" w:history="1">
             <w:r>
               <w:rPr>
                 <w:rStyle w:val="Hyperlink"/>
@@ -1398,7 +1401,7 @@
               <w:rPr>
                 <w:noProof/>
               </w:rPr>
-              <w:instrText xml:space="preserve"> PAGEREF _Toc244083330 \h </w:instrText>
+              <w:instrText xml:space="preserve"> PAGEREF _Toc244083925 \h </w:instrText>
             </w:r>
             <w:r>
               <w:rPr>
@@ -1415,7 +1418,7 @@
               <w:rPr>
                 <w:noProof/>
               </w:rPr>
-              <w:t>11</w:t>
+              <w:t>10</w:t>
             </w:r>
             <w:r>
               <w:rPr>
@@ -1439,7 +1442,7 @@
               <w14:ligatures w14:val="standardContextual"/>
             </w:rPr>
           </w:pPr>
-          <w:hyperlink w:anchor="_Toc244083331" w:history="1">
+          <w:hyperlink w:anchor="_Toc244083926" w:history="1">
             <w:r>
               <w:rPr>
                 <w:rStyle w:val="Hyperlink"/>
@@ -1479,7 +1482,7 @@
               <w:rPr>
                 <w:noProof/>
               </w:rPr>
-              <w:instrText xml:space="preserve"> PAGEREF _Toc244083331 \h </w:instrText>
+              <w:instrText xml:space="preserve"> PAGEREF _Toc244083926 \h </w:instrText>
             </w:r>
             <w:r>
               <w:rPr>
@@ -1496,7 +1499,7 @@
               <w:rPr>
                 <w:noProof/>
               </w:rPr>
-              <w:t>11</w:t>
+              <w:t>10</w:t>
             </w:r>
             <w:r>
               <w:rPr>
@@ -1520,7 +1523,7 @@
               <w14:ligatures w14:val="standardContextual"/>
             </w:rPr>
           </w:pPr>
-          <w:hyperlink w:anchor="_Toc244083332" w:history="1">
+          <w:hyperlink w:anchor="_Toc244083927" w:history="1">
             <w:r>
               <w:rPr>
                 <w:rStyle w:val="Hyperlink"/>
@@ -1560,7 +1563,7 @@
               <w:rPr>
                 <w:noProof/>
               </w:rPr>
-              <w:instrText xml:space="preserve"> PAGEREF _Toc244083332 \h </w:instrText>
+              <w:instrText xml:space="preserve"> PAGEREF _Toc244083927 \h </w:instrText>
             </w:r>
             <w:r>
               <w:rPr>
@@ -1577,7 +1580,7 @@
               <w:rPr>
                 <w:noProof/>
               </w:rPr>
-              <w:t>12</w:t>
+              <w:t>11</w:t>
             </w:r>
             <w:r>
               <w:rPr>
@@ -1601,7 +1604,7 @@
               <w14:ligatures w14:val="standardContextual"/>
             </w:rPr>
           </w:pPr>
-          <w:hyperlink w:anchor="_Toc244083333" w:history="1">
+          <w:hyperlink w:anchor="_Toc244083928" w:history="1">
             <w:r>
               <w:rPr>
                 <w:rStyle w:val="Hyperlink"/>
@@ -1641,7 +1644,7 @@
               <w:rPr>
                 <w:noProof/>
               </w:rPr>
-              <w:instrText xml:space="preserve"> PAGEREF _Toc244083333 \h </w:instrText>
+              <w:instrText xml:space="preserve"> PAGEREF _Toc244083928 \h </w:instrText>
             </w:r>
             <w:r>
               <w:rPr>
@@ -1658,7 +1661,7 @@
               <w:rPr>
                 <w:noProof/>
               </w:rPr>
-              <w:t>12</w:t>
+              <w:t>11</w:t>
             </w:r>
             <w:r>
               <w:rPr>
@@ -1681,7 +1684,7 @@
               <w14:ligatures w14:val="standardContextual"/>
             </w:rPr>
           </w:pPr>
-          <w:hyperlink w:anchor="_Toc244083334" w:history="1">
+          <w:hyperlink w:anchor="_Toc244083929" w:history="1">
             <w:r>
               <w:rPr>
                 <w:rStyle w:val="Hyperlink"/>
@@ -1705,7 +1708,7 @@
               <w:rPr>
                 <w:noProof/>
               </w:rPr>
-              <w:instrText xml:space="preserve"> PAGEREF _Toc244083334 \h </w:instrText>
+              <w:instrText xml:space="preserve"> PAGEREF _Toc244083929 \h </w:instrText>
             </w:r>
             <w:r>
               <w:rPr>
@@ -1722,7 +1725,7 @@
               <w:rPr>
                 <w:noProof/>
               </w:rPr>
-              <w:t>14</w:t>
+              <w:t>12</w:t>
             </w:r>
             <w:r>
               <w:rPr>
@@ -1746,7 +1749,7 @@
               <w14:ligatures w14:val="standardContextual"/>
             </w:rPr>
           </w:pPr>
-          <w:hyperlink w:anchor="_Toc244083335" w:history="1">
+          <w:hyperlink w:anchor="_Toc244083930" w:history="1">
             <w:r>
               <w:rPr>
                 <w:rStyle w:val="Hyperlink"/>
@@ -1786,7 +1789,7 @@
               <w:rPr>
                 <w:noProof/>
               </w:rPr>
-              <w:instrText xml:space="preserve"> PAGEREF _Toc244083335 \h </w:instrText>
+              <w:instrText xml:space="preserve"> PAGEREF _Toc244083930 \h </w:instrText>
             </w:r>
             <w:r>
               <w:rPr>
@@ -1803,7 +1806,7 @@
               <w:rPr>
                 <w:noProof/>
               </w:rPr>
-              <w:t>14</w:t>
+              <w:t>12</w:t>
             </w:r>
             <w:r>
               <w:rPr>
@@ -1827,7 +1830,7 @@
               <w14:ligatures w14:val="standardContextual"/>
             </w:rPr>
           </w:pPr>
-          <w:hyperlink w:anchor="_Toc244083336" w:history="1">
+          <w:hyperlink w:anchor="_Toc244083931" w:history="1">
             <w:r>
               <w:rPr>
                 <w:rStyle w:val="Hyperlink"/>
@@ -1867,7 +1870,7 @@
               <w:rPr>
                 <w:noProof/>
               </w:rPr>
-              <w:instrText xml:space="preserve"> PAGEREF _Toc244083336 \h </w:instrText>
+              <w:instrText xml:space="preserve"> PAGEREF _Toc244083931 \h </w:instrText>
             </w:r>
             <w:r>
               <w:rPr>
@@ -1884,7 +1887,7 @@
               <w:rPr>
                 <w:noProof/>
               </w:rPr>
-              <w:t>14</w:t>
+              <w:t>12</w:t>
             </w:r>
             <w:r>
               <w:rPr>
@@ -1908,7 +1911,7 @@
               <w14:ligatures w14:val="standardContextual"/>
             </w:rPr>
           </w:pPr>
-          <w:hyperlink w:anchor="_Toc244083337" w:history="1">
+          <w:hyperlink w:anchor="_Toc244083932" w:history="1">
             <w:r>
               <w:rPr>
                 <w:rStyle w:val="Hyperlink"/>
@@ -1948,7 +1951,7 @@
               <w:rPr>
                 <w:noProof/>
               </w:rPr>
-              <w:instrText xml:space="preserve"> PAGEREF _Toc244083337 \h </w:instrText>
+              <w:instrText xml:space="preserve"> PAGEREF _Toc244083932 \h </w:instrText>
             </w:r>
             <w:r>
               <w:rPr>
@@ -1965,7 +1968,7 @@
               <w:rPr>
                 <w:noProof/>
               </w:rPr>
-              <w:t>15</w:t>
+              <w:t>13</w:t>
             </w:r>
             <w:r>
               <w:rPr>
@@ -1989,7 +1992,7 @@
               <w14:ligatures w14:val="standardContextual"/>
             </w:rPr>
           </w:pPr>
-          <w:hyperlink w:anchor="_Toc244083338" w:history="1">
+          <w:hyperlink w:anchor="_Toc244083933" w:history="1">
             <w:r>
               <w:rPr>
                 <w:rStyle w:val="Hyperlink"/>
@@ -2029,7 +2032,7 @@
               <w:rPr>
                 <w:noProof/>
               </w:rPr>
-              <w:instrText xml:space="preserve"> PAGEREF _Toc244083338 \h </w:instrText>
+              <w:instrText xml:space="preserve"> PAGEREF _Toc244083933 \h </w:instrText>
             </w:r>
             <w:r>
               <w:rPr>
@@ -2046,7 +2049,7 @@
               <w:rPr>
                 <w:noProof/>
               </w:rPr>
-              <w:t>16</w:t>
+              <w:t>14</w:t>
             </w:r>
             <w:r>
               <w:rPr>
@@ -2070,7 +2073,7 @@
               <w14:ligatures w14:val="standardContextual"/>
             </w:rPr>
           </w:pPr>
-          <w:hyperlink w:anchor="_Toc244083339" w:history="1">
+          <w:hyperlink w:anchor="_Toc244083934" w:history="1">
             <w:r>
               <w:rPr>
                 <w:rStyle w:val="Hyperlink"/>
@@ -2110,7 +2113,7 @@
               <w:rPr>
                 <w:noProof/>
               </w:rPr>
-              <w:instrText xml:space="preserve"> PAGEREF _Toc244083339 \h </w:instrText>
+              <w:instrText xml:space="preserve"> PAGEREF _Toc244083934 \h </w:instrText>
             </w:r>
             <w:r>
               <w:rPr>
@@ -2127,7 +2130,7 @@
               <w:rPr>
                 <w:noProof/>
               </w:rPr>
-              <w:t>16</w:t>
+              <w:t>14</w:t>
             </w:r>
             <w:r>
               <w:rPr>
@@ -2151,7 +2154,7 @@
               <w14:ligatures w14:val="standardContextual"/>
             </w:rPr>
           </w:pPr>
-          <w:hyperlink w:anchor="_Toc244083340" w:history="1">
+          <w:hyperlink w:anchor="_Toc244083935" w:history="1">
             <w:r>
               <w:rPr>
                 <w:rStyle w:val="Hyperlink"/>
@@ -2191,7 +2194,7 @@
               <w:rPr>
                 <w:noProof/>
               </w:rPr>
-              <w:instrText xml:space="preserve"> PAGEREF _Toc244083340 \h </w:instrText>
+              <w:instrText xml:space="preserve"> PAGEREF _Toc244083935 \h </w:instrText>
             </w:r>
             <w:r>
               <w:rPr>
@@ -2208,7 +2211,7 @@
               <w:rPr>
                 <w:noProof/>
               </w:rPr>
-              <w:t>17</w:t>
+              <w:t>15</w:t>
             </w:r>
             <w:r>
               <w:rPr>
@@ -2231,7 +2234,7 @@
               <w14:ligatures w14:val="standardContextual"/>
             </w:rPr>
           </w:pPr>
-          <w:hyperlink w:anchor="_Toc244083341" w:history="1">
+          <w:hyperlink w:anchor="_Toc244083936" w:history="1">
             <w:r>
               <w:rPr>
                 <w:rStyle w:val="Hyperlink"/>
@@ -2255,7 +2258,7 @@
               <w:rPr>
                 <w:noProof/>
               </w:rPr>
-              <w:instrText xml:space="preserve"> PAGEREF _Toc244083341 \h </w:instrText>
+              <w:instrText xml:space="preserve"> PAGEREF _Toc244083936 \h </w:instrText>
             </w:r>
             <w:r>
               <w:rPr>
@@ -2272,7 +2275,7 @@
               <w:rPr>
                 <w:noProof/>
               </w:rPr>
-              <w:t>21</w:t>
+              <w:t>19</w:t>
             </w:r>
             <w:r>
               <w:rPr>
@@ -2296,7 +2299,7 @@
               <w14:ligatures w14:val="standardContextual"/>
             </w:rPr>
           </w:pPr>
-          <w:hyperlink w:anchor="_Toc244083342" w:history="1">
+          <w:hyperlink w:anchor="_Toc244083937" w:history="1">
             <w:r>
               <w:rPr>
                 <w:rStyle w:val="Hyperlink"/>
@@ -2336,7 +2339,7 @@
               <w:rPr>
                 <w:noProof/>
               </w:rPr>
-              <w:instrText xml:space="preserve"> PAGEREF _Toc244083342 \h </w:instrText>
+              <w:instrText xml:space="preserve"> PAGEREF _Toc244083937 \h </w:instrText>
             </w:r>
             <w:r>
               <w:rPr>
@@ -2353,7 +2356,7 @@
               <w:rPr>
                 <w:noProof/>
               </w:rPr>
-              <w:t>21</w:t>
+              <w:t>19</w:t>
             </w:r>
             <w:r>
               <w:rPr>
@@ -2376,7 +2379,7 @@
               <w14:ligatures w14:val="standardContextual"/>
             </w:rPr>
           </w:pPr>
-          <w:hyperlink w:anchor="_Toc244083343" w:history="1">
+          <w:hyperlink w:anchor="_Toc244083938" w:history="1">
             <w:r>
               <w:rPr>
                 <w:rStyle w:val="Hyperlink"/>
@@ -2400,7 +2403,7 @@
               <w:rPr>
                 <w:noProof/>
               </w:rPr>
-              <w:instrText xml:space="preserve"> PAGEREF _Toc244083343 \h </w:instrText>
+              <w:instrText xml:space="preserve"> PAGEREF _Toc244083938 \h </w:instrText>
             </w:r>
             <w:r>
               <w:rPr>
@@ -2417,7 +2420,7 @@
               <w:rPr>
                 <w:noProof/>
               </w:rPr>
-              <w:t>31</w:t>
+              <w:t>29</w:t>
             </w:r>
             <w:r>
               <w:rPr>
@@ -2441,7 +2444,7 @@
               <w14:ligatures w14:val="standardContextual"/>
             </w:rPr>
           </w:pPr>
-          <w:hyperlink w:anchor="_Toc244083344" w:history="1">
+          <w:hyperlink w:anchor="_Toc244083939" w:history="1">
             <w:r>
               <w:rPr>
                 <w:rStyle w:val="Hyperlink"/>
@@ -2481,7 +2484,7 @@
               <w:rPr>
                 <w:noProof/>
               </w:rPr>
-              <w:instrText xml:space="preserve"> PAGEREF _Toc244083344 \h </w:instrText>
+              <w:instrText xml:space="preserve"> PAGEREF _Toc244083939 \h </w:instrText>
             </w:r>
             <w:r>
               <w:rPr>
@@ -2498,7 +2501,7 @@
               <w:rPr>
                 <w:noProof/>
               </w:rPr>
-              <w:t>31</w:t>
+              <w:t>29</w:t>
             </w:r>
             <w:r>
               <w:rPr>
@@ -2522,7 +2525,7 @@
               <w14:ligatures w14:val="standardContextual"/>
             </w:rPr>
           </w:pPr>
-          <w:hyperlink w:anchor="_Toc244083345" w:history="1">
+          <w:hyperlink w:anchor="_Toc244083940" w:history="1">
             <w:r>
               <w:rPr>
                 <w:rStyle w:val="Hyperlink"/>
@@ -2562,7 +2565,7 @@
               <w:rPr>
                 <w:noProof/>
               </w:rPr>
-              <w:instrText xml:space="preserve"> PAGEREF _Toc244083345 \h </w:instrText>
+              <w:instrText xml:space="preserve"> PAGEREF _Toc244083940 \h </w:instrText>
             </w:r>
             <w:r>
               <w:rPr>
@@ -2579,7 +2582,7 @@
               <w:rPr>
                 <w:noProof/>
               </w:rPr>
-              <w:t>32</w:t>
+              <w:t>30</w:t>
             </w:r>
             <w:r>
               <w:rPr>
@@ -2602,7 +2605,7 @@
               <w14:ligatures w14:val="standardContextual"/>
             </w:rPr>
           </w:pPr>
-          <w:hyperlink w:anchor="_Toc244083346" w:history="1">
+          <w:hyperlink w:anchor="_Toc244083941" w:history="1">
             <w:r>
               <w:rPr>
                 <w:rStyle w:val="Hyperlink"/>
@@ -2626,7 +2629,7 @@
               <w:rPr>
                 <w:noProof/>
               </w:rPr>
-              <w:instrText xml:space="preserve"> PAGEREF _Toc244083346 \h </w:instrText>
+              <w:instrText xml:space="preserve"> PAGEREF _Toc244083941 \h </w:instrText>
             </w:r>
             <w:r>
               <w:rPr>
@@ -2643,7 +2646,7 @@
               <w:rPr>
                 <w:noProof/>
               </w:rPr>
-              <w:t>33</w:t>
+              <w:t>31</w:t>
             </w:r>
             <w:r>
               <w:rPr>
@@ -2666,7 +2669,7 @@
               <w14:ligatures w14:val="standardContextual"/>
             </w:rPr>
           </w:pPr>
-          <w:hyperlink w:anchor="_Toc244083347" w:history="1">
+          <w:hyperlink w:anchor="_Toc244083942" w:history="1">
             <w:r>
               <w:rPr>
                 <w:rStyle w:val="Hyperlink"/>
@@ -2690,7 +2693,7 @@
               <w:rPr>
                 <w:noProof/>
               </w:rPr>
-              <w:instrText xml:space="preserve"> PAGEREF _Toc244083347 \h </w:instrText>
+              <w:instrText xml:space="preserve"> PAGEREF _Toc244083942 \h </w:instrText>
             </w:r>
             <w:r>
               <w:rPr>
@@ -2707,7 +2710,7 @@
               <w:rPr>
                 <w:noProof/>
               </w:rPr>
-              <w:t>34</w:t>
+              <w:t>32</w:t>
             </w:r>
             <w:r>
               <w:rPr>
@@ -2731,7 +2734,7 @@
               <w14:ligatures w14:val="standardContextual"/>
             </w:rPr>
           </w:pPr>
-          <w:hyperlink w:anchor="_Toc244083348" w:history="1">
+          <w:hyperlink w:anchor="_Toc244083943" w:history="1">
             <w:r>
               <w:rPr>
                 <w:rStyle w:val="Hyperlink"/>
@@ -2771,7 +2774,7 @@
               <w:rPr>
                 <w:noProof/>
               </w:rPr>
-              <w:instrText xml:space="preserve"> PAGEREF _Toc244083348 \h </w:instrText>
+              <w:instrText xml:space="preserve"> PAGEREF _Toc244083943 \h </w:instrText>
             </w:r>
             <w:r>
               <w:rPr>
@@ -2788,7 +2791,7 @@
               <w:rPr>
                 <w:noProof/>
               </w:rPr>
-              <w:t>34</w:t>
+              <w:t>32</w:t>
             </w:r>
             <w:r>
               <w:rPr>
@@ -2812,7 +2815,7 @@
               <w14:ligatures w14:val="standardContextual"/>
             </w:rPr>
           </w:pPr>
-          <w:hyperlink w:anchor="_Toc244083349" w:history="1">
+          <w:hyperlink w:anchor="_Toc244083944" w:history="1">
             <w:r>
               <w:rPr>
                 <w:rStyle w:val="Hyperlink"/>
@@ -2852,7 +2855,7 @@
               <w:rPr>
                 <w:noProof/>
               </w:rPr>
-              <w:instrText xml:space="preserve"> PAGEREF _Toc244083349 \h </w:instrText>
+              <w:instrText xml:space="preserve"> PAGEREF _Toc244083944 \h </w:instrText>
             </w:r>
             <w:r>
               <w:rPr>
@@ -2869,7 +2872,7 @@
               <w:rPr>
                 <w:noProof/>
               </w:rPr>
-              <w:t>34</w:t>
+              <w:t>32</w:t>
             </w:r>
             <w:r>
               <w:rPr>
@@ -2893,7 +2896,7 @@
               <w14:ligatures w14:val="standardContextual"/>
             </w:rPr>
           </w:pPr>
-          <w:hyperlink w:anchor="_Toc244083350" w:history="1">
+          <w:hyperlink w:anchor="_Toc244083945" w:history="1">
             <w:r>
               <w:rPr>
                 <w:rStyle w:val="Hyperlink"/>
@@ -2933,7 +2936,7 @@
               <w:rPr>
                 <w:noProof/>
               </w:rPr>
-              <w:instrText xml:space="preserve"> PAGEREF _Toc244083350 \h </w:instrText>
+              <w:instrText xml:space="preserve"> PAGEREF _Toc244083945 \h </w:instrText>
             </w:r>
             <w:r>
               <w:rPr>
@@ -2950,7 +2953,7 @@
               <w:rPr>
                 <w:noProof/>
               </w:rPr>
-              <w:t>35</w:t>
+              <w:t>33</w:t>
             </w:r>
             <w:r>
               <w:rPr>
@@ -2974,7 +2977,7 @@
               <w14:ligatures w14:val="standardContextual"/>
             </w:rPr>
           </w:pPr>
-          <w:hyperlink w:anchor="_Toc244083351" w:history="1">
+          <w:hyperlink w:anchor="_Toc244083946" w:history="1">
             <w:r>
               <w:rPr>
                 <w:rStyle w:val="Hyperlink"/>
@@ -3014,7 +3017,7 @@
               <w:rPr>
                 <w:noProof/>
               </w:rPr>
-              <w:instrText xml:space="preserve"> PAGEREF _Toc244083351 \h </w:instrText>
+              <w:instrText xml:space="preserve"> PAGEREF _Toc244083946 \h </w:instrText>
             </w:r>
             <w:r>
               <w:rPr>
@@ -3031,7 +3034,7 @@
               <w:rPr>
                 <w:noProof/>
               </w:rPr>
-              <w:t>36</w:t>
+              <w:t>34</w:t>
             </w:r>
             <w:r>
               <w:rPr>
@@ -3053,9 +3056,8 @@
         <w:pStyle w:val="Heading1"/>
         <w:pageBreakBefore/>
       </w:pPr>
-      <w:bookmarkStart w:id="0" w:name="_Toc244083319"/>
-      <w:r>
-        <w:lastRenderedPageBreak/>
+      <w:bookmarkStart w:id="0" w:name="_Toc244083914"/>
+      <w:r>
         <w:t>List of Figures</w:t>
       </w:r>
       <w:bookmarkEnd w:id="0"/>
@@ -3089,7 +3091,7 @@
           <w:r>
             <w:fldChar w:fldCharType="separate"/>
           </w:r>
-          <w:hyperlink w:anchor="_Toc244083352" w:history="1">
+          <w:hyperlink w:anchor="_Toc244083947" w:history="1">
             <w:r>
               <w:rPr>
                 <w:rStyle w:val="Hyperlink"/>
@@ -3113,7 +3115,7 @@
               <w:rPr>
                 <w:noProof/>
               </w:rPr>
-              <w:instrText xml:space="preserve"> PAGEREF _Toc244083352 \h </w:instrText>
+              <w:instrText xml:space="preserve"> PAGEREF _Toc244083947 \h </w:instrText>
             </w:r>
             <w:r>
               <w:rPr>
@@ -3130,7 +3132,7 @@
               <w:rPr>
                 <w:noProof/>
               </w:rPr>
-              <w:t>9</w:t>
+              <w:t>8</w:t>
             </w:r>
             <w:r>
               <w:rPr>
@@ -3153,7 +3155,7 @@
               <w14:ligatures w14:val="standardContextual"/>
             </w:rPr>
           </w:pPr>
-          <w:hyperlink w:anchor="_Toc244083353" w:history="1">
+          <w:hyperlink w:anchor="_Toc244083948" w:history="1">
             <w:r>
               <w:rPr>
                 <w:rStyle w:val="Hyperlink"/>
@@ -3177,7 +3179,7 @@
               <w:rPr>
                 <w:noProof/>
               </w:rPr>
-              <w:instrText xml:space="preserve"> PAGEREF _Toc244083353 \h </w:instrText>
+              <w:instrText xml:space="preserve"> PAGEREF _Toc244083948 \h </w:instrText>
             </w:r>
             <w:r>
               <w:rPr>
@@ -3194,7 +3196,7 @@
               <w:rPr>
                 <w:noProof/>
               </w:rPr>
-              <w:t>17</w:t>
+              <w:t>15</w:t>
             </w:r>
             <w:r>
               <w:rPr>
@@ -3217,7 +3219,7 @@
               <w14:ligatures w14:val="standardContextual"/>
             </w:rPr>
           </w:pPr>
-          <w:hyperlink w:anchor="_Toc244083354" w:history="1">
+          <w:hyperlink w:anchor="_Toc244083949" w:history="1">
             <w:r>
               <w:rPr>
                 <w:rStyle w:val="Hyperlink"/>
@@ -3241,7 +3243,7 @@
               <w:rPr>
                 <w:noProof/>
               </w:rPr>
-              <w:instrText xml:space="preserve"> PAGEREF _Toc244083354 \h </w:instrText>
+              <w:instrText xml:space="preserve"> PAGEREF _Toc244083949 \h </w:instrText>
             </w:r>
             <w:r>
               <w:rPr>
@@ -3258,7 +3260,7 @@
               <w:rPr>
                 <w:noProof/>
               </w:rPr>
-              <w:t>18</w:t>
+              <w:t>16</w:t>
             </w:r>
             <w:r>
               <w:rPr>
@@ -3281,7 +3283,7 @@
               <w14:ligatures w14:val="standardContextual"/>
             </w:rPr>
           </w:pPr>
-          <w:hyperlink w:anchor="_Toc244083355" w:history="1">
+          <w:hyperlink w:anchor="_Toc244083950" w:history="1">
             <w:r>
               <w:rPr>
                 <w:rStyle w:val="Hyperlink"/>
@@ -3305,7 +3307,7 @@
               <w:rPr>
                 <w:noProof/>
               </w:rPr>
-              <w:instrText xml:space="preserve"> PAGEREF _Toc244083355 \h </w:instrText>
+              <w:instrText xml:space="preserve"> PAGEREF _Toc244083950 \h </w:instrText>
             </w:r>
             <w:r>
               <w:rPr>
@@ -3322,7 +3324,7 @@
               <w:rPr>
                 <w:noProof/>
               </w:rPr>
-              <w:t>18</w:t>
+              <w:t>16</w:t>
             </w:r>
             <w:r>
               <w:rPr>
@@ -3345,7 +3347,7 @@
               <w14:ligatures w14:val="standardContextual"/>
             </w:rPr>
           </w:pPr>
-          <w:hyperlink w:anchor="_Toc244083356" w:history="1">
+          <w:hyperlink w:anchor="_Toc244083951" w:history="1">
             <w:r>
               <w:rPr>
                 <w:rStyle w:val="Hyperlink"/>
@@ -3369,7 +3371,7 @@
               <w:rPr>
                 <w:noProof/>
               </w:rPr>
-              <w:instrText xml:space="preserve"> PAGEREF _Toc244083356 \h </w:instrText>
+              <w:instrText xml:space="preserve"> PAGEREF _Toc244083951 \h </w:instrText>
             </w:r>
             <w:r>
               <w:rPr>
@@ -3386,7 +3388,7 @@
               <w:rPr>
                 <w:noProof/>
               </w:rPr>
-              <w:t>19</w:t>
+              <w:t>17</w:t>
             </w:r>
             <w:r>
               <w:rPr>
@@ -3409,7 +3411,7 @@
               <w14:ligatures w14:val="standardContextual"/>
             </w:rPr>
           </w:pPr>
-          <w:hyperlink w:anchor="_Toc244083357" w:history="1">
+          <w:hyperlink w:anchor="_Toc244083952" w:history="1">
             <w:r>
               <w:rPr>
                 <w:rStyle w:val="Hyperlink"/>
@@ -3433,7 +3435,7 @@
               <w:rPr>
                 <w:noProof/>
               </w:rPr>
-              <w:instrText xml:space="preserve"> PAGEREF _Toc244083357 \h </w:instrText>
+              <w:instrText xml:space="preserve"> PAGEREF _Toc244083952 \h </w:instrText>
             </w:r>
             <w:r>
               <w:rPr>
@@ -3450,7 +3452,7 @@
               <w:rPr>
                 <w:noProof/>
               </w:rPr>
-              <w:t>24</w:t>
+              <w:t>22</w:t>
             </w:r>
             <w:r>
               <w:rPr>
@@ -3473,7 +3475,7 @@
               <w14:ligatures w14:val="standardContextual"/>
             </w:rPr>
           </w:pPr>
-          <w:hyperlink w:anchor="_Toc244083358" w:history="1">
+          <w:hyperlink w:anchor="_Toc244083953" w:history="1">
             <w:r>
               <w:rPr>
                 <w:rStyle w:val="Hyperlink"/>
@@ -3497,7 +3499,7 @@
               <w:rPr>
                 <w:noProof/>
               </w:rPr>
-              <w:instrText xml:space="preserve"> PAGEREF _Toc244083358 \h </w:instrText>
+              <w:instrText xml:space="preserve"> PAGEREF _Toc244083953 \h </w:instrText>
             </w:r>
             <w:r>
               <w:rPr>
@@ -3514,7 +3516,7 @@
               <w:rPr>
                 <w:noProof/>
               </w:rPr>
-              <w:t>24</w:t>
+              <w:t>22</w:t>
             </w:r>
             <w:r>
               <w:rPr>
@@ -3537,7 +3539,7 @@
               <w14:ligatures w14:val="standardContextual"/>
             </w:rPr>
           </w:pPr>
-          <w:hyperlink w:anchor="_Toc244083359" w:history="1">
+          <w:hyperlink w:anchor="_Toc244083954" w:history="1">
             <w:r>
               <w:rPr>
                 <w:rStyle w:val="Hyperlink"/>
@@ -3561,7 +3563,7 @@
               <w:rPr>
                 <w:noProof/>
               </w:rPr>
-              <w:instrText xml:space="preserve"> PAGEREF _Toc244083359 \h </w:instrText>
+              <w:instrText xml:space="preserve"> PAGEREF _Toc244083954 \h </w:instrText>
             </w:r>
             <w:r>
               <w:rPr>
@@ -3578,7 +3580,7 @@
               <w:rPr>
                 <w:noProof/>
               </w:rPr>
-              <w:t>25</w:t>
+              <w:t>23</w:t>
             </w:r>
             <w:r>
               <w:rPr>
@@ -3601,7 +3603,7 @@
               <w14:ligatures w14:val="standardContextual"/>
             </w:rPr>
           </w:pPr>
-          <w:hyperlink w:anchor="_Toc244083360" w:history="1">
+          <w:hyperlink w:anchor="_Toc244083955" w:history="1">
             <w:r>
               <w:rPr>
                 <w:rStyle w:val="Hyperlink"/>
@@ -3625,7 +3627,7 @@
               <w:rPr>
                 <w:noProof/>
               </w:rPr>
-              <w:instrText xml:space="preserve"> PAGEREF _Toc244083360 \h </w:instrText>
+              <w:instrText xml:space="preserve"> PAGEREF _Toc244083955 \h </w:instrText>
             </w:r>
             <w:r>
               <w:rPr>
@@ -3642,7 +3644,7 @@
               <w:rPr>
                 <w:noProof/>
               </w:rPr>
-              <w:t>25</w:t>
+              <w:t>23</w:t>
             </w:r>
             <w:r>
               <w:rPr>
@@ -3665,7 +3667,7 @@
               <w14:ligatures w14:val="standardContextual"/>
             </w:rPr>
           </w:pPr>
-          <w:hyperlink w:anchor="_Toc244083361" w:history="1">
+          <w:hyperlink w:anchor="_Toc244083956" w:history="1">
             <w:r>
               <w:rPr>
                 <w:rStyle w:val="Hyperlink"/>
@@ -3689,7 +3691,7 @@
               <w:rPr>
                 <w:noProof/>
               </w:rPr>
-              <w:instrText xml:space="preserve"> PAGEREF _Toc244083361 \h </w:instrText>
+              <w:instrText xml:space="preserve"> PAGEREF _Toc244083956 \h </w:instrText>
             </w:r>
             <w:r>
               <w:rPr>
@@ -3706,7 +3708,7 @@
               <w:rPr>
                 <w:noProof/>
               </w:rPr>
-              <w:t>26</w:t>
+              <w:t>24</w:t>
             </w:r>
             <w:r>
               <w:rPr>
@@ -3729,7 +3731,7 @@
               <w14:ligatures w14:val="standardContextual"/>
             </w:rPr>
           </w:pPr>
-          <w:hyperlink w:anchor="_Toc244083362" w:history="1">
+          <w:hyperlink w:anchor="_Toc244083957" w:history="1">
             <w:r>
               <w:rPr>
                 <w:rStyle w:val="Hyperlink"/>
@@ -3753,7 +3755,7 @@
               <w:rPr>
                 <w:noProof/>
               </w:rPr>
-              <w:instrText xml:space="preserve"> PAGEREF _Toc244083362 \h </w:instrText>
+              <w:instrText xml:space="preserve"> PAGEREF _Toc244083957 \h </w:instrText>
             </w:r>
             <w:r>
               <w:rPr>
@@ -3770,7 +3772,7 @@
               <w:rPr>
                 <w:noProof/>
               </w:rPr>
-              <w:t>26</w:t>
+              <w:t>24</w:t>
             </w:r>
             <w:r>
               <w:rPr>
@@ -3793,7 +3795,7 @@
               <w14:ligatures w14:val="standardContextual"/>
             </w:rPr>
           </w:pPr>
-          <w:hyperlink w:anchor="_Toc244083363" w:history="1">
+          <w:hyperlink w:anchor="_Toc244083958" w:history="1">
             <w:r>
               <w:rPr>
                 <w:rStyle w:val="Hyperlink"/>
@@ -3817,7 +3819,7 @@
               <w:rPr>
                 <w:noProof/>
               </w:rPr>
-              <w:instrText xml:space="preserve"> PAGEREF _Toc244083363 \h </w:instrText>
+              <w:instrText xml:space="preserve"> PAGEREF _Toc244083958 \h </w:instrText>
             </w:r>
             <w:r>
               <w:rPr>
@@ -3834,7 +3836,7 @@
               <w:rPr>
                 <w:noProof/>
               </w:rPr>
-              <w:t>27</w:t>
+              <w:t>24</w:t>
             </w:r>
             <w:r>
               <w:rPr>
@@ -3857,7 +3859,7 @@
               <w14:ligatures w14:val="standardContextual"/>
             </w:rPr>
           </w:pPr>
-          <w:hyperlink w:anchor="_Toc244083364" w:history="1">
+          <w:hyperlink w:anchor="_Toc244083959" w:history="1">
             <w:r>
               <w:rPr>
                 <w:rStyle w:val="Hyperlink"/>
@@ -3881,7 +3883,7 @@
               <w:rPr>
                 <w:noProof/>
               </w:rPr>
-              <w:instrText xml:space="preserve"> PAGEREF _Toc244083364 \h </w:instrText>
+              <w:instrText xml:space="preserve"> PAGEREF _Toc244083959 \h </w:instrText>
             </w:r>
             <w:r>
               <w:rPr>
@@ -3898,7 +3900,7 @@
               <w:rPr>
                 <w:noProof/>
               </w:rPr>
-              <w:t>27</w:t>
+              <w:t>25</w:t>
             </w:r>
             <w:r>
               <w:rPr>
@@ -3921,7 +3923,7 @@
               <w14:ligatures w14:val="standardContextual"/>
             </w:rPr>
           </w:pPr>
-          <w:hyperlink w:anchor="_Toc244083365" w:history="1">
+          <w:hyperlink w:anchor="_Toc244083960" w:history="1">
             <w:r>
               <w:rPr>
                 <w:rStyle w:val="Hyperlink"/>
@@ -3945,7 +3947,7 @@
               <w:rPr>
                 <w:noProof/>
               </w:rPr>
-              <w:instrText xml:space="preserve"> PAGEREF _Toc244083365 \h </w:instrText>
+              <w:instrText xml:space="preserve"> PAGEREF _Toc244083960 \h </w:instrText>
             </w:r>
             <w:r>
               <w:rPr>
@@ -3962,7 +3964,7 @@
               <w:rPr>
                 <w:noProof/>
               </w:rPr>
-              <w:t>28</w:t>
+              <w:t>25</w:t>
             </w:r>
             <w:r>
               <w:rPr>
@@ -3985,7 +3987,7 @@
               <w14:ligatures w14:val="standardContextual"/>
             </w:rPr>
           </w:pPr>
-          <w:hyperlink w:anchor="_Toc244083366" w:history="1">
+          <w:hyperlink w:anchor="_Toc244083961" w:history="1">
             <w:r>
               <w:rPr>
                 <w:rStyle w:val="Hyperlink"/>
@@ -4009,7 +4011,7 @@
               <w:rPr>
                 <w:noProof/>
               </w:rPr>
-              <w:instrText xml:space="preserve"> PAGEREF _Toc244083366 \h </w:instrText>
+              <w:instrText xml:space="preserve"> PAGEREF _Toc244083961 \h </w:instrText>
             </w:r>
             <w:r>
               <w:rPr>
@@ -4026,7 +4028,7 @@
               <w:rPr>
                 <w:noProof/>
               </w:rPr>
-              <w:t>29</w:t>
+              <w:t>27</w:t>
             </w:r>
             <w:r>
               <w:rPr>
@@ -4048,7 +4050,7 @@
         <w:pStyle w:val="Heading1"/>
         <w:spacing w:before="480"/>
       </w:pPr>
-      <w:bookmarkStart w:id="1" w:name="_Toc244083320"/>
+      <w:bookmarkStart w:id="1" w:name="_Toc244083915"/>
       <w:r>
         <w:t>List of Tables</w:t>
       </w:r>
@@ -4083,7 +4085,7 @@
           <w:r>
             <w:fldChar w:fldCharType="separate"/>
           </w:r>
-          <w:hyperlink w:anchor="_Toc244083367" w:history="1">
+          <w:hyperlink w:anchor="_Toc244083962" w:history="1">
             <w:r>
               <w:rPr>
                 <w:rStyle w:val="Hyperlink"/>
@@ -4107,7 +4109,7 @@
               <w:rPr>
                 <w:noProof/>
               </w:rPr>
-              <w:instrText xml:space="preserve"> PAGEREF _Toc244083367 \h </w:instrText>
+              <w:instrText xml:space="preserve"> PAGEREF _Toc244083962 \h </w:instrText>
             </w:r>
             <w:r>
               <w:rPr>
@@ -4124,7 +4126,7 @@
               <w:rPr>
                 <w:noProof/>
               </w:rPr>
-              <w:t>10</w:t>
+              <w:t>9</w:t>
             </w:r>
             <w:r>
               <w:rPr>
@@ -4147,7 +4149,7 @@
               <w14:ligatures w14:val="standardContextual"/>
             </w:rPr>
           </w:pPr>
-          <w:hyperlink w:anchor="_Toc244083368" w:history="1">
+          <w:hyperlink w:anchor="_Toc244083963" w:history="1">
             <w:r>
               <w:rPr>
                 <w:rStyle w:val="Hyperlink"/>
@@ -4171,7 +4173,7 @@
               <w:rPr>
                 <w:noProof/>
               </w:rPr>
-              <w:instrText xml:space="preserve"> PAGEREF _Toc244083368 \h </w:instrText>
+              <w:instrText xml:space="preserve"> PAGEREF _Toc244083963 \h </w:instrText>
             </w:r>
             <w:r>
               <w:rPr>
@@ -4188,7 +4190,7 @@
               <w:rPr>
                 <w:noProof/>
               </w:rPr>
-              <w:t>11</w:t>
+              <w:t>10</w:t>
             </w:r>
             <w:r>
               <w:rPr>
@@ -4211,7 +4213,7 @@
               <w14:ligatures w14:val="standardContextual"/>
             </w:rPr>
           </w:pPr>
-          <w:hyperlink w:anchor="_Toc244083369" w:history="1">
+          <w:hyperlink w:anchor="_Toc244083964" w:history="1">
             <w:r>
               <w:rPr>
                 <w:rStyle w:val="Hyperlink"/>
@@ -4235,7 +4237,7 @@
               <w:rPr>
                 <w:noProof/>
               </w:rPr>
-              <w:instrText xml:space="preserve"> PAGEREF _Toc244083369 \h </w:instrText>
+              <w:instrText xml:space="preserve"> PAGEREF _Toc244083964 \h </w:instrText>
             </w:r>
             <w:r>
               <w:rPr>
@@ -4252,7 +4254,7 @@
               <w:rPr>
                 <w:noProof/>
               </w:rPr>
-              <w:t>14</w:t>
+              <w:t>12</w:t>
             </w:r>
             <w:r>
               <w:rPr>
@@ -4275,7 +4277,7 @@
               <w14:ligatures w14:val="standardContextual"/>
             </w:rPr>
           </w:pPr>
-          <w:hyperlink w:anchor="_Toc244083370" w:history="1">
+          <w:hyperlink w:anchor="_Toc244083965" w:history="1">
             <w:r>
               <w:rPr>
                 <w:rStyle w:val="Hyperlink"/>
@@ -4299,7 +4301,7 @@
               <w:rPr>
                 <w:noProof/>
               </w:rPr>
-              <w:instrText xml:space="preserve"> PAGEREF _Toc244083370 \h </w:instrText>
+              <w:instrText xml:space="preserve"> PAGEREF _Toc244083965 \h </w:instrText>
             </w:r>
             <w:r>
               <w:rPr>
@@ -4316,7 +4318,7 @@
               <w:rPr>
                 <w:noProof/>
               </w:rPr>
-              <w:t>16</w:t>
+              <w:t>14</w:t>
             </w:r>
             <w:r>
               <w:rPr>
@@ -4339,7 +4341,7 @@
               <w14:ligatures w14:val="standardContextual"/>
             </w:rPr>
           </w:pPr>
-          <w:hyperlink w:anchor="_Toc244083371" w:history="1">
+          <w:hyperlink w:anchor="_Toc244083966" w:history="1">
             <w:r>
               <w:rPr>
                 <w:rStyle w:val="Hyperlink"/>
@@ -4363,7 +4365,7 @@
               <w:rPr>
                 <w:noProof/>
               </w:rPr>
-              <w:instrText xml:space="preserve"> PAGEREF _Toc244083371 \h </w:instrText>
+              <w:instrText xml:space="preserve"> PAGEREF _Toc244083966 \h </w:instrText>
             </w:r>
             <w:r>
               <w:rPr>
@@ -4380,7 +4382,7 @@
               <w:rPr>
                 <w:noProof/>
               </w:rPr>
-              <w:t>21</w:t>
+              <w:t>19</w:t>
             </w:r>
             <w:r>
               <w:rPr>
@@ -4403,7 +4405,7 @@
               <w14:ligatures w14:val="standardContextual"/>
             </w:rPr>
           </w:pPr>
-          <w:hyperlink w:anchor="_Toc244083372" w:history="1">
+          <w:hyperlink w:anchor="_Toc244083967" w:history="1">
             <w:r>
               <w:rPr>
                 <w:rStyle w:val="Hyperlink"/>
@@ -4427,7 +4429,7 @@
               <w:rPr>
                 <w:noProof/>
               </w:rPr>
-              <w:instrText xml:space="preserve"> PAGEREF _Toc244083372 \h </w:instrText>
+              <w:instrText xml:space="preserve"> PAGEREF _Toc244083967 \h </w:instrText>
             </w:r>
             <w:r>
               <w:rPr>
@@ -4444,7 +4446,7 @@
               <w:rPr>
                 <w:noProof/>
               </w:rPr>
-              <w:t>22</w:t>
+              <w:t>20</w:t>
             </w:r>
             <w:r>
               <w:rPr>
@@ -4467,7 +4469,7 @@
               <w14:ligatures w14:val="standardContextual"/>
             </w:rPr>
           </w:pPr>
-          <w:hyperlink w:anchor="_Toc244083373" w:history="1">
+          <w:hyperlink w:anchor="_Toc244083968" w:history="1">
             <w:r>
               <w:rPr>
                 <w:rStyle w:val="Hyperlink"/>
@@ -4491,7 +4493,7 @@
               <w:rPr>
                 <w:noProof/>
               </w:rPr>
-              <w:instrText xml:space="preserve"> PAGEREF _Toc244083373 \h </w:instrText>
+              <w:instrText xml:space="preserve"> PAGEREF _Toc244083968 \h </w:instrText>
             </w:r>
             <w:r>
               <w:rPr>
@@ -4508,7 +4510,7 @@
               <w:rPr>
                 <w:noProof/>
               </w:rPr>
-              <w:t>22</w:t>
+              <w:t>21</w:t>
             </w:r>
             <w:r>
               <w:rPr>
@@ -4531,7 +4533,7 @@
               <w14:ligatures w14:val="standardContextual"/>
             </w:rPr>
           </w:pPr>
-          <w:hyperlink w:anchor="_Toc244083374" w:history="1">
+          <w:hyperlink w:anchor="_Toc244083969" w:history="1">
             <w:r>
               <w:rPr>
                 <w:rStyle w:val="Hyperlink"/>
@@ -4555,7 +4557,7 @@
               <w:rPr>
                 <w:noProof/>
               </w:rPr>
-              <w:instrText xml:space="preserve"> PAGEREF _Toc244083374 \h </w:instrText>
+              <w:instrText xml:space="preserve"> PAGEREF _Toc244083969 \h </w:instrText>
             </w:r>
             <w:r>
               <w:rPr>
@@ -4572,7 +4574,7 @@
               <w:rPr>
                 <w:noProof/>
               </w:rPr>
-              <w:t>23</w:t>
+              <w:t>21</w:t>
             </w:r>
             <w:r>
               <w:rPr>
@@ -4595,7 +4597,7 @@
               <w14:ligatures w14:val="standardContextual"/>
             </w:rPr>
           </w:pPr>
-          <w:hyperlink w:anchor="_Toc244083375" w:history="1">
+          <w:hyperlink w:anchor="_Toc244083970" w:history="1">
             <w:r>
               <w:rPr>
                 <w:rStyle w:val="Hyperlink"/>
@@ -4619,7 +4621,7 @@
               <w:rPr>
                 <w:noProof/>
               </w:rPr>
-              <w:instrText xml:space="preserve"> PAGEREF _Toc244083375 \h </w:instrText>
+              <w:instrText xml:space="preserve"> PAGEREF _Toc244083970 \h </w:instrText>
             </w:r>
             <w:r>
               <w:rPr>
@@ -4636,7 +4638,7 @@
               <w:rPr>
                 <w:noProof/>
               </w:rPr>
-              <w:t>28</w:t>
+              <w:t>26</w:t>
             </w:r>
             <w:r>
               <w:rPr>
@@ -4659,7 +4661,7 @@
               <w14:ligatures w14:val="standardContextual"/>
             </w:rPr>
           </w:pPr>
-          <w:hyperlink w:anchor="_Toc244083376" w:history="1">
+          <w:hyperlink w:anchor="_Toc244083971" w:history="1">
             <w:r>
               <w:rPr>
                 <w:rStyle w:val="Hyperlink"/>
@@ -4683,7 +4685,7 @@
               <w:rPr>
                 <w:noProof/>
               </w:rPr>
-              <w:instrText xml:space="preserve"> PAGEREF _Toc244083376 \h </w:instrText>
+              <w:instrText xml:space="preserve"> PAGEREF _Toc244083971 \h </w:instrText>
             </w:r>
             <w:r>
               <w:rPr>
@@ -4700,7 +4702,7 @@
               <w:rPr>
                 <w:noProof/>
               </w:rPr>
-              <w:t>30</w:t>
+              <w:t>28</w:t>
             </w:r>
             <w:r>
               <w:rPr>
@@ -4723,7 +4725,7 @@
               <w14:ligatures w14:val="standardContextual"/>
             </w:rPr>
           </w:pPr>
-          <w:hyperlink w:anchor="_Toc244083377" w:history="1">
+          <w:hyperlink w:anchor="_Toc244083972" w:history="1">
             <w:r>
               <w:rPr>
                 <w:rStyle w:val="Hyperlink"/>
@@ -4747,7 +4749,7 @@
               <w:rPr>
                 <w:noProof/>
               </w:rPr>
-              <w:instrText xml:space="preserve"> PAGEREF _Toc244083377 \h </w:instrText>
+              <w:instrText xml:space="preserve"> PAGEREF _Toc244083972 \h </w:instrText>
             </w:r>
             <w:r>
               <w:rPr>
@@ -4764,7 +4766,7 @@
               <w:rPr>
                 <w:noProof/>
               </w:rPr>
-              <w:t>34</w:t>
+              <w:t>32</w:t>
             </w:r>
             <w:r>
               <w:rPr>
@@ -4787,7 +4789,7 @@
               <w14:ligatures w14:val="standardContextual"/>
             </w:rPr>
           </w:pPr>
-          <w:hyperlink w:anchor="_Toc244083378" w:history="1">
+          <w:hyperlink w:anchor="_Toc244083973" w:history="1">
             <w:r>
               <w:rPr>
                 <w:rStyle w:val="Hyperlink"/>
@@ -4811,7 +4813,7 @@
               <w:rPr>
                 <w:noProof/>
               </w:rPr>
-              <w:instrText xml:space="preserve"> PAGEREF _Toc244083378 \h </w:instrText>
+              <w:instrText xml:space="preserve"> PAGEREF _Toc244083973 \h </w:instrText>
             </w:r>
             <w:r>
               <w:rPr>
@@ -4828,7 +4830,7 @@
               <w:rPr>
                 <w:noProof/>
               </w:rPr>
-              <w:t>34</w:t>
+              <w:t>32</w:t>
             </w:r>
             <w:r>
               <w:rPr>
@@ -4858,7 +4860,6 @@
           <w:sz w:val="32"/>
           <w:szCs w:val="32"/>
         </w:rPr>
-        <w:lastRenderedPageBreak/>
         <w:t>ABSTRACT</w:t>
       </w:r>
     </w:p>
@@ -4877,7 +4878,7 @@
         <w:jc w:val="both"/>
       </w:pPr>
       <w:r>
-        <w:t>The system is written entirely in JavaScript: a React 18 single-page frontend built with Vite, and a Node.js REST backend built with Express 4. The backend follows a layered controller–service–repository architecture and applies three design patterns: Strategy for the three split methods (EQUAL, PERCENTAGE and EXACT), kept in a map and chosen at run time from the request; Observer for the side effects of adding an expense (an AuditLogger that stores an activity log and a NotificationService); and Singleton for a ConfigService holding the currency symbol and rounding rules. Adding an expense is one unit of work, so an invalid split rolls back the expense, its shares and its log together.</w:t>
+        <w:t>The system is written entirely in JavaScript: a React 18 single-page frontend built with Vite and a Node.js REST backend built with Express 4, in a layered controller–service–repository architecture. It applies three design patterns: Strategy for the three split methods (EQUAL, PERCENTAGE and EXACT), chosen at run time from the request; Observer for the side effects of adding an expense (an AuditLogger and a NotificationService); and Singleton for a ConfigService holding the currency and rounding rules. Adding an expense is one unit of work, so an invalid split rolls back the expense, its shares and its log together.</w:t>
       </w:r>
     </w:p>
     <w:p>
@@ -4886,7 +4887,7 @@
         <w:jc w:val="both"/>
       </w:pPr>
       <w:r>
-        <w:t>Net balances are computed with array methods (reduce and flatMap) and settlements with a greedy algorithm over two binary-heap priority queues of creditors and debtors, which needs at most n − 1 payments for n members. Money is rounded to two decimals with a half-up rule applied to the decimal text of each amount, and any paisa left over by rounding is assigned to one participant so that shares always add up exactly. A central error-handling middleware turns custom exceptions into clean JSON errors with the correct HTTP status codes.</w:t>
+        <w:t>Net balances are computed with array methods (reduce and flatMap) and settlements with a greedy algorithm over two binary-heap priority queues, which needs at most n − 1 payments for n members. Money is rounded half-up to two decimals, and any paisa left over is assigned to one participant so that shares always add up exactly. A central error middleware returns clean JSON errors with the correct HTTP status codes.</w:t>
       </w:r>
     </w:p>
     <w:p>
@@ -4895,7 +4896,7 @@
         <w:jc w:val="both"/>
       </w:pPr>
       <w:r>
-        <w:t>The application was validated with a node:test suite of unit and HTTP integration tests and a Postman collection of 41 requests and 59 assertions executed with Newman, all of which passed. The code is hosted on GitHub and deployed on Vercel. Testing also showed that the greedy settlement, although never worse than n − 1 payments, is not always the true minimum (it matched the optimum in 100% of random four-member groups but 75.7% of eight-member groups), a known property of the hard debt-simplification problem that is reported openly and addressed in future work.</w:t>
+        <w:t>The application was validated with a node:test suite and a Postman collection of 41 requests and 59 assertions run with Newman, all of which passed; it is hosted on GitHub and deployed on Vercel. Testing also showed that the greedy settlement, though never worse than n − 1 payments, is not always the true minimum (optimal in 100% of random four-member groups but 75.7% of eight-member groups), which is reported openly and addressed in future work.</w:t>
       </w:r>
     </w:p>
     <w:p>
@@ -4907,7 +4908,6 @@
           <w:b/>
           <w:bCs/>
         </w:rPr>
-        <w:lastRenderedPageBreak/>
         <w:t>Keywords:</w:t>
       </w:r>
       <w:r>
@@ -4922,9 +4922,8 @@
         <w:pStyle w:val="Heading1"/>
         <w:pageBreakBefore/>
       </w:pPr>
-      <w:bookmarkStart w:id="2" w:name="_Toc244083321"/>
-      <w:r>
-        <w:lastRenderedPageBreak/>
+      <w:bookmarkStart w:id="2" w:name="_Toc244083916"/>
+      <w:r>
         <w:t>CHAPTER 1.</w:t>
       </w:r>
       <w:r>
@@ -4940,7 +4939,7 @@
           <w:tab w:val="left" w:pos="720"/>
         </w:tabs>
       </w:pPr>
-      <w:bookmarkStart w:id="3" w:name="_Toc244083322"/>
+      <w:bookmarkStart w:id="3" w:name="_Toc244083917"/>
       <w:r>
         <w:t>1.1.</w:t>
       </w:r>
@@ -5020,7 +5019,7 @@
           <w:tab w:val="left" w:pos="720"/>
         </w:tabs>
       </w:pPr>
-      <w:bookmarkStart w:id="4" w:name="_Toc244083323"/>
+      <w:bookmarkStart w:id="4" w:name="_Toc244083918"/>
       <w:r>
         <w:t>1.2.</w:t>
       </w:r>
@@ -5053,7 +5052,6 @@
         <w:rPr>
           <w:b/>
         </w:rPr>
-        <w:lastRenderedPageBreak/>
         <w:t>Bookkeeping errors.</w:t>
       </w:r>
       <w:r>
@@ -5136,7 +5134,7 @@
           <w:tab w:val="left" w:pos="720"/>
         </w:tabs>
       </w:pPr>
-      <w:bookmarkStart w:id="5" w:name="_Toc244083324"/>
+      <w:bookmarkStart w:id="5" w:name="_Toc244083919"/>
       <w:r>
         <w:t>1.3.</w:t>
       </w:r>
@@ -5269,7 +5267,6 @@
         <w:rPr>
           <w:b/>
         </w:rPr>
-        <w:lastRenderedPageBreak/>
         <w:t>Documentation and deployment</w:t>
       </w:r>
       <w:r>
@@ -5283,7 +5280,7 @@
           <w:tab w:val="left" w:pos="720"/>
         </w:tabs>
       </w:pPr>
-      <w:bookmarkStart w:id="6" w:name="_Toc244083325"/>
+      <w:bookmarkStart w:id="6" w:name="_Toc244083920"/>
       <w:r>
         <w:t>1.4.</w:t>
       </w:r>
@@ -5352,7 +5349,7 @@
       <w:pPr>
         <w:pStyle w:val="FigureCaption"/>
       </w:pPr>
-      <w:bookmarkStart w:id="7" w:name="_Toc244083352"/>
+      <w:bookmarkStart w:id="7" w:name="_Toc244083947"/>
       <w:r>
         <w:t>Figure 1.1  Gantt chart of the project schedule</w:t>
       </w:r>
@@ -5365,7 +5362,7 @@
           <w:tab w:val="left" w:pos="720"/>
         </w:tabs>
       </w:pPr>
-      <w:bookmarkStart w:id="8" w:name="_Toc244083326"/>
+      <w:bookmarkStart w:id="8" w:name="_Toc244083921"/>
       <w:r>
         <w:t>1.5.</w:t>
       </w:r>
@@ -5480,9 +5477,8 @@
         <w:pStyle w:val="Heading1"/>
         <w:pageBreakBefore/>
       </w:pPr>
-      <w:bookmarkStart w:id="9" w:name="_Toc244083327"/>
-      <w:r>
-        <w:lastRenderedPageBreak/>
+      <w:bookmarkStart w:id="9" w:name="_Toc244083922"/>
+      <w:r>
         <w:t>CHAPTER 2.</w:t>
       </w:r>
       <w:r>
@@ -5498,7 +5494,7 @@
           <w:tab w:val="left" w:pos="720"/>
         </w:tabs>
       </w:pPr>
-      <w:bookmarkStart w:id="10" w:name="_Toc244083328"/>
+      <w:bookmarkStart w:id="10" w:name="_Toc244083923"/>
       <w:r>
         <w:t>2.1.</w:t>
       </w:r>
@@ -5513,7 +5509,7 @@
         <w:pStyle w:val="TableCaption"/>
         <w:keepNext/>
       </w:pPr>
-      <w:bookmarkStart w:id="11" w:name="_Toc244083367"/>
+      <w:bookmarkStart w:id="11" w:name="_Toc244083962"/>
       <w:r>
         <w:t>Table 2.1  Timeline of key findings related to the problem</w:t>
       </w:r>
@@ -5694,6 +5690,7 @@
           </w:tcPr>
           <w:p>
             <w:pPr>
+              <w:keepNext/>
               <w:keepLines/>
             </w:pPr>
             <w:r>
@@ -5723,6 +5720,7 @@
           </w:tcPr>
           <w:p>
             <w:pPr>
+              <w:keepNext/>
               <w:keepLines/>
             </w:pPr>
             <w:r>
@@ -5757,6 +5755,7 @@
           </w:tcPr>
           <w:p>
             <w:pPr>
+              <w:keepNext/>
               <w:keepLines/>
             </w:pPr>
             <w:r>
@@ -5786,6 +5785,7 @@
           </w:tcPr>
           <w:p>
             <w:pPr>
+              <w:keepNext/>
               <w:keepLines/>
             </w:pPr>
             <w:r>
@@ -5820,6 +5820,7 @@
           </w:tcPr>
           <w:p>
             <w:pPr>
+              <w:keepNext/>
               <w:keepLines/>
             </w:pPr>
             <w:r>
@@ -5849,6 +5850,7 @@
           </w:tcPr>
           <w:p>
             <w:pPr>
+              <w:keepNext/>
               <w:keepLines/>
             </w:pPr>
             <w:r>
@@ -5883,6 +5885,7 @@
           </w:tcPr>
           <w:p>
             <w:pPr>
+              <w:keepNext/>
               <w:keepLines/>
             </w:pPr>
             <w:r>
@@ -5912,6 +5915,7 @@
           </w:tcPr>
           <w:p>
             <w:pPr>
+              <w:keepNext/>
               <w:keepLines/>
             </w:pPr>
             <w:r>
@@ -5946,6 +5950,7 @@
           </w:tcPr>
           <w:p>
             <w:pPr>
+              <w:keepNext/>
               <w:keepLines/>
             </w:pPr>
             <w:r>
@@ -5975,6 +5980,7 @@
           </w:tcPr>
           <w:p>
             <w:pPr>
+              <w:keepNext/>
               <w:keepLines/>
             </w:pPr>
             <w:r>
@@ -6009,6 +6015,7 @@
           </w:tcPr>
           <w:p>
             <w:pPr>
+              <w:keepNext/>
               <w:keepLines/>
             </w:pPr>
             <w:r>
@@ -6038,6 +6045,7 @@
           </w:tcPr>
           <w:p>
             <w:pPr>
+              <w:keepNext/>
               <w:keepLines/>
             </w:pPr>
             <w:r>
@@ -6072,6 +6080,7 @@
           </w:tcPr>
           <w:p>
             <w:pPr>
+              <w:keepNext/>
               <w:keepLines/>
             </w:pPr>
             <w:r>
@@ -6101,6 +6110,7 @@
           </w:tcPr>
           <w:p>
             <w:pPr>
+              <w:keepNext/>
               <w:keepLines/>
             </w:pPr>
             <w:r>
@@ -6135,6 +6145,7 @@
           </w:tcPr>
           <w:p>
             <w:pPr>
+              <w:keepNext/>
               <w:keepLines/>
             </w:pPr>
             <w:r>
@@ -6164,6 +6175,7 @@
           </w:tcPr>
           <w:p>
             <w:pPr>
+              <w:keepNext/>
               <w:keepLines/>
             </w:pPr>
             <w:r>
@@ -6198,6 +6210,7 @@
           </w:tcPr>
           <w:p>
             <w:pPr>
+              <w:keepNext/>
               <w:keepLines/>
             </w:pPr>
             <w:r>
@@ -6227,6 +6240,7 @@
           </w:tcPr>
           <w:p>
             <w:pPr>
+              <w:keepNext/>
               <w:keepLines/>
             </w:pPr>
             <w:r>
@@ -6261,6 +6275,7 @@
           </w:tcPr>
           <w:p>
             <w:pPr>
+              <w:keepNext/>
               <w:keepLines/>
             </w:pPr>
             <w:r>
@@ -6290,6 +6305,7 @@
           </w:tcPr>
           <w:p>
             <w:pPr>
+              <w:keepNext/>
               <w:keepLines/>
             </w:pPr>
             <w:r>
@@ -6377,7 +6393,7 @@
           <w:tab w:val="left" w:pos="720"/>
         </w:tabs>
       </w:pPr>
-      <w:bookmarkStart w:id="12" w:name="_Toc244083329"/>
+      <w:bookmarkStart w:id="12" w:name="_Toc244083924"/>
       <w:r>
         <w:t>2.2.</w:t>
       </w:r>
@@ -6470,7 +6486,6 @@
         <w:rPr>
           <w:b/>
         </w:rPr>
-        <w:lastRenderedPageBreak/>
         <w:t>Chat messages and notes.</w:t>
       </w:r>
       <w:r>
@@ -6504,7 +6519,7 @@
           <w:tab w:val="left" w:pos="720"/>
         </w:tabs>
       </w:pPr>
-      <w:bookmarkStart w:id="13" w:name="_Toc244083330"/>
+      <w:bookmarkStart w:id="13" w:name="_Toc244083925"/>
       <w:r>
         <w:t>2.3.</w:t>
       </w:r>
@@ -6519,7 +6534,7 @@
         <w:pStyle w:val="TableCaption"/>
         <w:keepNext/>
       </w:pPr>
-      <w:bookmarkStart w:id="14" w:name="_Toc244083368"/>
+      <w:bookmarkStart w:id="14" w:name="_Toc244083963"/>
       <w:r>
         <w:t>Table 2.2  Analysis of reviewed literature and solutions</w:t>
       </w:r>
@@ -6826,6 +6841,7 @@
           </w:tcPr>
           <w:p>
             <w:pPr>
+              <w:keepNext/>
               <w:keepLines/>
             </w:pPr>
             <w:r>
@@ -6855,6 +6871,7 @@
           </w:tcPr>
           <w:p>
             <w:pPr>
+              <w:keepNext/>
               <w:keepLines/>
             </w:pPr>
             <w:r>
@@ -6884,6 +6901,7 @@
           </w:tcPr>
           <w:p>
             <w:pPr>
+              <w:keepNext/>
               <w:keepLines/>
             </w:pPr>
             <w:r>
@@ -6913,6 +6931,7 @@
           </w:tcPr>
           <w:p>
             <w:pPr>
+              <w:keepNext/>
               <w:keepLines/>
             </w:pPr>
             <w:r>
@@ -6947,6 +6966,7 @@
           </w:tcPr>
           <w:p>
             <w:pPr>
+              <w:keepNext/>
               <w:keepLines/>
             </w:pPr>
             <w:r>
@@ -6976,6 +6996,7 @@
           </w:tcPr>
           <w:p>
             <w:pPr>
+              <w:keepNext/>
               <w:keepLines/>
             </w:pPr>
             <w:r>
@@ -7005,6 +7026,7 @@
           </w:tcPr>
           <w:p>
             <w:pPr>
+              <w:keepNext/>
               <w:keepLines/>
             </w:pPr>
             <w:r>
@@ -7034,6 +7056,7 @@
           </w:tcPr>
           <w:p>
             <w:pPr>
+              <w:keepNext/>
               <w:keepLines/>
             </w:pPr>
             <w:r>
@@ -7068,6 +7091,7 @@
           </w:tcPr>
           <w:p>
             <w:pPr>
+              <w:keepNext/>
               <w:keepLines/>
             </w:pPr>
             <w:r>
@@ -7097,6 +7121,7 @@
           </w:tcPr>
           <w:p>
             <w:pPr>
+              <w:keepNext/>
               <w:keepLines/>
             </w:pPr>
             <w:r>
@@ -7126,6 +7151,7 @@
           </w:tcPr>
           <w:p>
             <w:pPr>
+              <w:keepNext/>
               <w:keepLines/>
             </w:pPr>
             <w:r>
@@ -7155,6 +7181,7 @@
           </w:tcPr>
           <w:p>
             <w:pPr>
+              <w:keepNext/>
               <w:keepLines/>
             </w:pPr>
             <w:r>
@@ -7189,6 +7216,7 @@
           </w:tcPr>
           <w:p>
             <w:pPr>
+              <w:keepNext/>
               <w:keepLines/>
             </w:pPr>
             <w:r>
@@ -7218,6 +7246,7 @@
           </w:tcPr>
           <w:p>
             <w:pPr>
+              <w:keepNext/>
               <w:keepLines/>
             </w:pPr>
             <w:r>
@@ -7247,6 +7276,7 @@
           </w:tcPr>
           <w:p>
             <w:pPr>
+              <w:keepNext/>
               <w:keepLines/>
             </w:pPr>
             <w:r>
@@ -7276,6 +7306,7 @@
           </w:tcPr>
           <w:p>
             <w:pPr>
+              <w:keepNext/>
               <w:keepLines/>
             </w:pPr>
             <w:r>
@@ -7421,7 +7452,7 @@
           <w:tab w:val="left" w:pos="720"/>
         </w:tabs>
       </w:pPr>
-      <w:bookmarkStart w:id="15" w:name="_Toc244083331"/>
+      <w:bookmarkStart w:id="15" w:name="_Toc244083926"/>
       <w:r>
         <w:t>2.4.</w:t>
       </w:r>
@@ -7456,9 +7487,8 @@
           <w:tab w:val="left" w:pos="720"/>
         </w:tabs>
       </w:pPr>
-      <w:bookmarkStart w:id="16" w:name="_Toc244083332"/>
-      <w:r>
-        <w:lastRenderedPageBreak/>
+      <w:bookmarkStart w:id="16" w:name="_Toc244083927"/>
+      <w:r>
         <w:t>2.5.</w:t>
       </w:r>
       <w:r>
@@ -7479,7 +7509,7 @@
         <w:t>What is to be done:</w:t>
       </w:r>
       <w:r>
-        <w:t xml:space="preserve"> build a full-stack web application through which a group can register members, record expenses paid by one member and split among several using EQUAL, PERCENTAGE or EXACT rules, view each member’s net balance, obtain a short list of payments that settles the group, record those payments as they happen, and delete expenses, payments, users and groups safely.</w:t>
+        <w:t xml:space="preserve"> build a full-stack web application through which a group can register members, record expenses split by EQUAL, PERCENTAGE or EXACT rules, view each member’s net balance, obtain a short list of payments that settles the group, record those payments, and delete expenses, payments, users and groups safely.</w:t>
       </w:r>
     </w:p>
     <w:p>
@@ -7494,7 +7524,7 @@
         <w:t>How it is to be done:</w:t>
       </w:r>
       <w:r>
-        <w:t xml:space="preserve"> a React single-page frontend (built with Vite) calling a Node.js/Express REST backend; a layered controller–service–repository architecture; the Strategy, Observer and Singleton patterns; all-or-nothing expense creation; array methods for balances; a priority-queue greedy settlement; central error-handling middleware; testing with node:test and Postman/Newman; hosting on GitHub and deployment on Vercel.</w:t>
+        <w:t xml:space="preserve"> a React frontend (Vite) calling a Node.js/Express REST API; a controller–service–repository architecture; the Strategy, Observer and Singleton patterns; all-or-nothing expense creation; a priority-queue greedy settlement; central error middleware; testing with node:test and Postman/Newman; deployment on Vercel.</w:t>
       </w:r>
     </w:p>
     <w:p>
@@ -7519,7 +7549,7 @@
           <w:tab w:val="left" w:pos="720"/>
         </w:tabs>
       </w:pPr>
-      <w:bookmarkStart w:id="17" w:name="_Toc244083333"/>
+      <w:bookmarkStart w:id="17" w:name="_Toc244083928"/>
       <w:r>
         <w:t>2.6.</w:t>
       </w:r>
@@ -7624,8 +7654,7 @@
         <w:jc w:val="both"/>
       </w:pPr>
       <w:r>
-        <w:lastRenderedPageBreak/>
-        <w:t>Validate the system with automated tests: a node:test suite and a Postman collection with at least 50 assertions covering success and error paths, and deploy the application so that it can be used from a browser.</w:t>
+        <w:t>Validate the system with a node:test suite and a Postman collection of at least 50 assertions covering success and error paths, and deploy it on the web.</w:t>
       </w:r>
     </w:p>
     <w:p>
@@ -7633,9 +7662,8 @@
         <w:pStyle w:val="Heading1"/>
         <w:pageBreakBefore/>
       </w:pPr>
-      <w:bookmarkStart w:id="18" w:name="_Toc244083334"/>
-      <w:r>
-        <w:lastRenderedPageBreak/>
+      <w:bookmarkStart w:id="18" w:name="_Toc244083929"/>
+      <w:r>
         <w:t>CHAPTER 3.</w:t>
       </w:r>
       <w:r>
@@ -7651,7 +7679,7 @@
           <w:tab w:val="left" w:pos="720"/>
         </w:tabs>
       </w:pPr>
-      <w:bookmarkStart w:id="19" w:name="_Toc244083335"/>
+      <w:bookmarkStart w:id="19" w:name="_Toc244083930"/>
       <w:r>
         <w:t>3.1.</w:t>
       </w:r>
@@ -7675,7 +7703,7 @@
         <w:pStyle w:val="TableCaption"/>
         <w:keepNext/>
       </w:pPr>
-      <w:bookmarkStart w:id="20" w:name="_Toc244083369"/>
+      <w:bookmarkStart w:id="20" w:name="_Toc244083964"/>
       <w:r>
         <w:t>Table 3.1  Evaluation of candidate features</w:t>
       </w:r>
@@ -7919,6 +7947,7 @@
           </w:tcPr>
           <w:p>
             <w:pPr>
+              <w:keepNext/>
               <w:keepLines/>
             </w:pPr>
             <w:r>
@@ -7948,6 +7977,7 @@
           </w:tcPr>
           <w:p>
             <w:pPr>
+              <w:keepNext/>
               <w:keepLines/>
             </w:pPr>
             <w:r>
@@ -7977,6 +8007,7 @@
           </w:tcPr>
           <w:p>
             <w:pPr>
+              <w:keepNext/>
               <w:keepLines/>
             </w:pPr>
             <w:r>
@@ -8011,6 +8042,7 @@
           </w:tcPr>
           <w:p>
             <w:pPr>
+              <w:keepNext/>
               <w:keepLines/>
             </w:pPr>
             <w:r>
@@ -8040,6 +8072,7 @@
           </w:tcPr>
           <w:p>
             <w:pPr>
+              <w:keepNext/>
               <w:keepLines/>
             </w:pPr>
             <w:r>
@@ -8069,6 +8102,7 @@
           </w:tcPr>
           <w:p>
             <w:pPr>
+              <w:keepNext/>
               <w:keepLines/>
             </w:pPr>
             <w:r>
@@ -8103,6 +8137,7 @@
           </w:tcPr>
           <w:p>
             <w:pPr>
+              <w:keepNext/>
               <w:keepLines/>
             </w:pPr>
             <w:r>
@@ -8132,6 +8167,7 @@
           </w:tcPr>
           <w:p>
             <w:pPr>
+              <w:keepNext/>
               <w:keepLines/>
             </w:pPr>
             <w:r>
@@ -8161,6 +8197,7 @@
           </w:tcPr>
           <w:p>
             <w:pPr>
+              <w:keepNext/>
               <w:keepLines/>
             </w:pPr>
             <w:r>
@@ -8195,6 +8232,7 @@
           </w:tcPr>
           <w:p>
             <w:pPr>
+              <w:keepNext/>
               <w:keepLines/>
             </w:pPr>
             <w:r>
@@ -8224,6 +8262,7 @@
           </w:tcPr>
           <w:p>
             <w:pPr>
+              <w:keepNext/>
               <w:keepLines/>
             </w:pPr>
             <w:r>
@@ -8253,6 +8292,7 @@
           </w:tcPr>
           <w:p>
             <w:pPr>
+              <w:keepNext/>
               <w:keepLines/>
             </w:pPr>
             <w:r>
@@ -8287,6 +8327,7 @@
           </w:tcPr>
           <w:p>
             <w:pPr>
+              <w:keepNext/>
               <w:keepLines/>
             </w:pPr>
             <w:r>
@@ -8316,6 +8357,7 @@
           </w:tcPr>
           <w:p>
             <w:pPr>
+              <w:keepNext/>
               <w:keepLines/>
             </w:pPr>
             <w:r>
@@ -8345,6 +8387,7 @@
           </w:tcPr>
           <w:p>
             <w:pPr>
+              <w:keepNext/>
               <w:keepLines/>
             </w:pPr>
             <w:r>
@@ -8379,6 +8422,7 @@
           </w:tcPr>
           <w:p>
             <w:pPr>
+              <w:keepNext/>
               <w:keepLines/>
             </w:pPr>
             <w:r>
@@ -8408,6 +8452,7 @@
           </w:tcPr>
           <w:p>
             <w:pPr>
+              <w:keepNext/>
               <w:keepLines/>
             </w:pPr>
             <w:r>
@@ -8437,6 +8482,7 @@
           </w:tcPr>
           <w:p>
             <w:pPr>
+              <w:keepNext/>
               <w:keepLines/>
             </w:pPr>
             <w:r>
@@ -8471,6 +8517,7 @@
           </w:tcPr>
           <w:p>
             <w:pPr>
+              <w:keepNext/>
               <w:keepLines/>
             </w:pPr>
             <w:r>
@@ -8500,6 +8547,7 @@
           </w:tcPr>
           <w:p>
             <w:pPr>
+              <w:keepNext/>
               <w:keepLines/>
             </w:pPr>
             <w:r>
@@ -8529,6 +8577,7 @@
           </w:tcPr>
           <w:p>
             <w:pPr>
+              <w:keepNext/>
               <w:keepLines/>
             </w:pPr>
             <w:r>
@@ -8563,6 +8612,7 @@
           </w:tcPr>
           <w:p>
             <w:pPr>
+              <w:keepNext/>
               <w:keepLines/>
             </w:pPr>
             <w:r>
@@ -8592,6 +8642,7 @@
           </w:tcPr>
           <w:p>
             <w:pPr>
+              <w:keepNext/>
               <w:keepLines/>
             </w:pPr>
             <w:r>
@@ -8621,6 +8672,7 @@
           </w:tcPr>
           <w:p>
             <w:pPr>
+              <w:keepNext/>
               <w:keepLines/>
             </w:pPr>
             <w:r>
@@ -8655,6 +8707,7 @@
           </w:tcPr>
           <w:p>
             <w:pPr>
+              <w:keepNext/>
               <w:keepLines/>
             </w:pPr>
             <w:r>
@@ -8684,6 +8737,7 @@
           </w:tcPr>
           <w:p>
             <w:pPr>
+              <w:keepNext/>
               <w:keepLines/>
             </w:pPr>
             <w:r>
@@ -8713,6 +8767,7 @@
           </w:tcPr>
           <w:p>
             <w:pPr>
+              <w:keepNext/>
               <w:keepLines/>
             </w:pPr>
             <w:r>
@@ -8747,6 +8802,7 @@
           </w:tcPr>
           <w:p>
             <w:pPr>
+              <w:keepNext/>
               <w:keepLines/>
             </w:pPr>
             <w:r>
@@ -8776,6 +8832,7 @@
           </w:tcPr>
           <w:p>
             <w:pPr>
+              <w:keepNext/>
               <w:keepLines/>
             </w:pPr>
             <w:r>
@@ -8805,6 +8862,7 @@
           </w:tcPr>
           <w:p>
             <w:pPr>
+              <w:keepNext/>
               <w:keepLines/>
             </w:pPr>
             <w:r>
@@ -8839,6 +8897,7 @@
           </w:tcPr>
           <w:p>
             <w:pPr>
+              <w:keepNext/>
               <w:keepLines/>
             </w:pPr>
             <w:r>
@@ -8868,6 +8927,7 @@
           </w:tcPr>
           <w:p>
             <w:pPr>
+              <w:keepNext/>
               <w:keepLines/>
             </w:pPr>
             <w:r>
@@ -8897,6 +8957,7 @@
           </w:tcPr>
           <w:p>
             <w:pPr>
+              <w:keepNext/>
               <w:keepLines/>
             </w:pPr>
             <w:r>
@@ -8931,6 +8992,7 @@
           </w:tcPr>
           <w:p>
             <w:pPr>
+              <w:keepNext/>
               <w:keepLines/>
             </w:pPr>
             <w:r>
@@ -8960,6 +9022,7 @@
           </w:tcPr>
           <w:p>
             <w:pPr>
+              <w:keepNext/>
               <w:keepLines/>
             </w:pPr>
             <w:r>
@@ -8989,6 +9052,7 @@
           </w:tcPr>
           <w:p>
             <w:pPr>
+              <w:keepNext/>
               <w:keepLines/>
             </w:pPr>
             <w:r>
@@ -9105,7 +9169,7 @@
           <w:tab w:val="left" w:pos="720"/>
         </w:tabs>
       </w:pPr>
-      <w:bookmarkStart w:id="21" w:name="_Toc244083336"/>
+      <w:bookmarkStart w:id="21" w:name="_Toc244083931"/>
       <w:r>
         <w:t>3.2.</w:t>
       </w:r>
@@ -9177,7 +9241,6 @@
         <w:rPr>
           <w:b/>
         </w:rPr>
-        <w:lastRenderedPageBreak/>
         <w:t>Ethical:</w:t>
       </w:r>
       <w:r>
@@ -9271,7 +9334,7 @@
           <w:tab w:val="left" w:pos="720"/>
         </w:tabs>
       </w:pPr>
-      <w:bookmarkStart w:id="22" w:name="_Toc244083337"/>
+      <w:bookmarkStart w:id="22" w:name="_Toc244083932"/>
       <w:r>
         <w:t>3.3.</w:t>
       </w:r>
@@ -9375,7 +9438,6 @@
         <w:rPr>
           <w:b/>
         </w:rPr>
-        <w:lastRenderedPageBreak/>
         <w:t>Modified:</w:t>
       </w:r>
       <w:r>
@@ -9409,7 +9471,7 @@
           <w:tab w:val="left" w:pos="720"/>
         </w:tabs>
       </w:pPr>
-      <w:bookmarkStart w:id="23" w:name="_Toc244083338"/>
+      <w:bookmarkStart w:id="23" w:name="_Toc244083933"/>
       <w:r>
         <w:t>3.4.</w:t>
       </w:r>
@@ -9440,7 +9502,7 @@
         <w:t>Design A — Plain Node.js http server with conditional logic.</w:t>
       </w:r>
       <w:r>
-        <w:t xml:space="preserve"> A single request handler parses every URL by hand, the split method is chosen with an if-else or switch on the split type, balances are stored and updated manually on every change, errors are handled with try-catch in each branch, and the page is built by concatenating HTML strings in the browser.</w:t>
+        <w:t xml:space="preserve"> One request handler parses every URL by hand, the split method is chosen with an if-else chain, balances are stored and updated manually, errors are caught in every branch, and the page is built from HTML strings.</w:t>
       </w:r>
     </w:p>
     <w:p>
@@ -9452,10 +9514,10 @@
         <w:rPr>
           <w:b/>
         </w:rPr>
-        <w:t>Design B — Layered Express backend with a React frontend and design patterns (selected).</w:t>
-      </w:r>
-      <w:r>
-        <w:t xml:space="preserve"> Express routers only translate HTTP into method calls; services hold the business rules; repositories provide storage; split methods are Strategy classes in a Map; side effects are Observer listeners; expense creation runs in a transactional() unit of work; errors are mapped centrally by one error middleware; and the interface is a set of React components that re-render from state.</w:t>
+        <w:t>Design B — Layered Express backend with a React frontend (selected).</w:t>
+      </w:r>
+      <w:r>
+        <w:t xml:space="preserve"> Routers translate HTTP into method calls; services hold the business rules; repositories store data; split methods are Strategy classes; side effects are Observer listeners; expense creation runs in a transactional() unit of work; one error middleware maps errors; and the interface is built from React components.</w:t>
       </w:r>
     </w:p>
     <w:p>
@@ -9465,7 +9527,7 @@
           <w:tab w:val="left" w:pos="720"/>
         </w:tabs>
       </w:pPr>
-      <w:bookmarkStart w:id="24" w:name="_Toc244083339"/>
+      <w:bookmarkStart w:id="24" w:name="_Toc244083934"/>
       <w:r>
         <w:t>3.5.</w:t>
       </w:r>
@@ -9480,7 +9542,7 @@
         <w:pStyle w:val="TableCaption"/>
         <w:keepNext/>
       </w:pPr>
-      <w:bookmarkStart w:id="25" w:name="_Toc244083370"/>
+      <w:bookmarkStart w:id="25" w:name="_Toc244083965"/>
       <w:r>
         <w:t>Table 3.2  Comparison of alternative designs</w:t>
       </w:r>
@@ -9664,7 +9726,7 @@
               <w:rPr>
                 <w:sz w:val="20"/>
               </w:rPr>
-              <w:t>High: manual URL parsing, JSON parsing, routing</w:t>
+              <w:t>Manual URL and JSON parsing</w:t>
             </w:r>
           </w:p>
         </w:tc>
@@ -9694,7 +9756,7 @@
               <w:rPr>
                 <w:sz w:val="20"/>
               </w:rPr>
-              <w:t>Low: express.json(), Router, route parameters</w:t>
+              <w:t>express.json(), Router, params</w:t>
             </w:r>
           </w:p>
         </w:tc>
@@ -9722,6 +9784,7 @@
           </w:tcPr>
           <w:p>
             <w:pPr>
+              <w:keepNext/>
               <w:keepLines/>
             </w:pPr>
             <w:r>
@@ -9751,13 +9814,14 @@
           </w:tcPr>
           <w:p>
             <w:pPr>
-              <w:keepLines/>
-            </w:pPr>
-            <w:r>
-              <w:rPr>
-                <w:sz w:val="20"/>
-              </w:rPr>
-              <w:t>Edit the if-else chain (breaks Open/Closed)</w:t>
+              <w:keepNext/>
+              <w:keepLines/>
+            </w:pPr>
+            <w:r>
+              <w:rPr>
+                <w:sz w:val="20"/>
+              </w:rPr>
+              <w:t>Edit the if-else chain</w:t>
             </w:r>
           </w:p>
         </w:tc>
@@ -9780,13 +9844,14 @@
           </w:tcPr>
           <w:p>
             <w:pPr>
-              <w:keepLines/>
-            </w:pPr>
-            <w:r>
-              <w:rPr>
-                <w:sz w:val="20"/>
-              </w:rPr>
-              <w:t>Add one SplitStrategy subclass and register it</w:t>
+              <w:keepNext/>
+              <w:keepLines/>
+            </w:pPr>
+            <w:r>
+              <w:rPr>
+                <w:sz w:val="20"/>
+              </w:rPr>
+              <w:t>Add one SplitStrategy subclass</w:t>
             </w:r>
           </w:p>
         </w:tc>
@@ -9814,6 +9879,7 @@
           </w:tcPr>
           <w:p>
             <w:pPr>
+              <w:keepNext/>
               <w:keepLines/>
             </w:pPr>
             <w:r>
@@ -9843,13 +9909,14 @@
           </w:tcPr>
           <w:p>
             <w:pPr>
-              <w:keepLines/>
-            </w:pPr>
-            <w:r>
-              <w:rPr>
-                <w:sz w:val="20"/>
-              </w:rPr>
-              <w:t>Manual clean-up; easy to forget</w:t>
+              <w:keepNext/>
+              <w:keepLines/>
+            </w:pPr>
+            <w:r>
+              <w:rPr>
+                <w:sz w:val="20"/>
+              </w:rPr>
+              <w:t>Manual clean-up</w:t>
             </w:r>
           </w:p>
         </w:tc>
@@ -9872,13 +9939,14 @@
           </w:tcPr>
           <w:p>
             <w:pPr>
-              <w:keepLines/>
-            </w:pPr>
-            <w:r>
-              <w:rPr>
-                <w:sz w:val="20"/>
-              </w:rPr>
-              <w:t>transactional() rolls back automatically</w:t>
+              <w:keepNext/>
+              <w:keepLines/>
+            </w:pPr>
+            <w:r>
+              <w:rPr>
+                <w:sz w:val="20"/>
+              </w:rPr>
+              <w:t>transactional() rolls back</w:t>
             </w:r>
           </w:p>
         </w:tc>
@@ -9906,6 +9974,7 @@
           </w:tcPr>
           <w:p>
             <w:pPr>
+              <w:keepNext/>
               <w:keepLines/>
             </w:pPr>
             <w:r>
@@ -9935,6 +10004,7 @@
           </w:tcPr>
           <w:p>
             <w:pPr>
+              <w:keepNext/>
               <w:keepLines/>
             </w:pPr>
             <w:r>
@@ -9964,13 +10034,14 @@
           </w:tcPr>
           <w:p>
             <w:pPr>
-              <w:keepLines/>
-            </w:pPr>
-            <w:r>
-              <w:rPr>
-                <w:sz w:val="20"/>
-              </w:rPr>
-              <w:t>One error middleware for the whole API</w:t>
+              <w:keepNext/>
+              <w:keepLines/>
+            </w:pPr>
+            <w:r>
+              <w:rPr>
+                <w:sz w:val="20"/>
+              </w:rPr>
+              <w:t>One error middleware</w:t>
             </w:r>
           </w:p>
         </w:tc>
@@ -9998,6 +10069,7 @@
           </w:tcPr>
           <w:p>
             <w:pPr>
+              <w:keepNext/>
               <w:keepLines/>
             </w:pPr>
             <w:r>
@@ -10027,13 +10099,14 @@
           </w:tcPr>
           <w:p>
             <w:pPr>
-              <w:keepLines/>
-            </w:pPr>
-            <w:r>
-              <w:rPr>
-                <w:sz w:val="20"/>
-              </w:rPr>
-              <w:t>Stored value can drift after deletes</w:t>
+              <w:keepNext/>
+              <w:keepLines/>
+            </w:pPr>
+            <w:r>
+              <w:rPr>
+                <w:sz w:val="20"/>
+              </w:rPr>
+              <w:t>Stored value can drift</w:t>
             </w:r>
           </w:p>
         </w:tc>
@@ -10056,13 +10129,14 @@
           </w:tcPr>
           <w:p>
             <w:pPr>
-              <w:keepLines/>
-            </w:pPr>
-            <w:r>
-              <w:rPr>
-                <w:sz w:val="20"/>
-              </w:rPr>
-              <w:t>Computed from source data every time</w:t>
+              <w:keepNext/>
+              <w:keepLines/>
+            </w:pPr>
+            <w:r>
+              <w:rPr>
+                <w:sz w:val="20"/>
+              </w:rPr>
+              <w:t>Computed from source data</w:t>
             </w:r>
           </w:p>
         </w:tc>
@@ -10090,6 +10164,7 @@
           </w:tcPr>
           <w:p>
             <w:pPr>
+              <w:keepNext/>
               <w:keepLines/>
             </w:pPr>
             <w:r>
@@ -10119,6 +10194,7 @@
           </w:tcPr>
           <w:p>
             <w:pPr>
+              <w:keepNext/>
               <w:keepLines/>
             </w:pPr>
             <w:r>
@@ -10148,13 +10224,14 @@
           </w:tcPr>
           <w:p>
             <w:pPr>
-              <w:keepLines/>
-            </w:pPr>
-            <w:r>
-              <w:rPr>
-                <w:sz w:val="20"/>
-              </w:rPr>
-              <w:t>Services tested directly with node:test</w:t>
+              <w:keepNext/>
+              <w:keepLines/>
+            </w:pPr>
+            <w:r>
+              <w:rPr>
+                <w:sz w:val="20"/>
+              </w:rPr>
+              <w:t>Services tested with node:test</w:t>
             </w:r>
           </w:p>
         </w:tc>
@@ -10182,6 +10259,7 @@
           </w:tcPr>
           <w:p>
             <w:pPr>
+              <w:keepNext/>
               <w:keepLines/>
             </w:pPr>
             <w:r>
@@ -10211,13 +10289,14 @@
           </w:tcPr>
           <w:p>
             <w:pPr>
-              <w:keepLines/>
-            </w:pPr>
-            <w:r>
-              <w:rPr>
-                <w:sz w:val="20"/>
-              </w:rPr>
-              <w:t>Partial (no frontend framework)</w:t>
+              <w:keepNext/>
+              <w:keepLines/>
+            </w:pPr>
+            <w:r>
+              <w:rPr>
+                <w:sz w:val="20"/>
+              </w:rPr>
+              <w:t>Partial (no UI framework)</w:t>
             </w:r>
           </w:p>
         </w:tc>
@@ -10240,13 +10319,14 @@
           </w:tcPr>
           <w:p>
             <w:pPr>
-              <w:keepLines/>
-            </w:pPr>
-            <w:r>
-              <w:rPr>
-                <w:sz w:val="20"/>
-              </w:rPr>
-              <w:t>Complete — React, Node.js, Express, REST, patterns</w:t>
+              <w:keepNext/>
+              <w:keepLines/>
+            </w:pPr>
+            <w:r>
+              <w:rPr>
+                <w:sz w:val="20"/>
+              </w:rPr>
+              <w:t>Complete: React, Express, REST</w:t>
             </w:r>
           </w:p>
         </w:tc>
@@ -10280,7 +10360,6 @@
               <w:rPr>
                 <w:sz w:val="20"/>
               </w:rPr>
-              <w:lastRenderedPageBreak/>
               <w:t>Learning curve</w:t>
             </w:r>
           </w:p>
@@ -10339,7 +10418,7 @@
               <w:rPr>
                 <w:sz w:val="20"/>
               </w:rPr>
-              <w:t>Higher, but mirrors industry practice</w:t>
+              <w:t>Higher, mirrors industry practice</w:t>
             </w:r>
           </w:p>
         </w:tc>
@@ -10366,7 +10445,7 @@
           <w:tab w:val="left" w:pos="720"/>
         </w:tabs>
       </w:pPr>
-      <w:bookmarkStart w:id="26" w:name="_Toc244083340"/>
+      <w:bookmarkStart w:id="26" w:name="_Toc244083935"/>
       <w:r>
         <w:t>3.6.</w:t>
       </w:r>
@@ -10435,7 +10514,7 @@
       <w:pPr>
         <w:pStyle w:val="FigureCaption"/>
       </w:pPr>
-      <w:bookmarkStart w:id="27" w:name="_Toc244083353"/>
+      <w:bookmarkStart w:id="27" w:name="_Toc244083948"/>
       <w:r>
         <w:t>Figure 3.1  Block diagram of the layered architecture</w:t>
       </w:r>
@@ -10459,7 +10538,6 @@
         <w:rPr>
           <w:noProof/>
         </w:rPr>
-        <w:lastRenderedPageBreak/>
         <w:drawing>
           <wp:inline distT="0" distB="0" distL="0" distR="0" wp14:anchorId="4A088EB2" wp14:editId="455721E6">
             <wp:extent cx="5486400" cy="4105399"/>
@@ -10501,7 +10579,7 @@
       <w:pPr>
         <w:pStyle w:val="FigureCaption"/>
       </w:pPr>
-      <w:bookmarkStart w:id="28" w:name="_Toc244083354"/>
+      <w:bookmarkStart w:id="28" w:name="_Toc244083949"/>
       <w:r>
         <w:t>Figure 3.2  Data model of the application (entities and relationships)</w:t>
       </w:r>
@@ -10566,7 +10644,7 @@
       <w:pPr>
         <w:pStyle w:val="FigureCaption"/>
       </w:pPr>
-      <w:bookmarkStart w:id="29" w:name="_Toc244083355"/>
+      <w:bookmarkStart w:id="29" w:name="_Toc244083950"/>
       <w:r>
         <w:t>Figure 3.3  Class diagram of the Strategy, Observer and Singleton patterns</w:t>
       </w:r>
@@ -10581,7 +10659,6 @@
         <w:rPr>
           <w:noProof/>
         </w:rPr>
-        <w:lastRenderedPageBreak/>
         <w:drawing>
           <wp:inline distT="0" distB="0" distL="0" distR="0" wp14:anchorId="36EF20B8" wp14:editId="71E8F586">
             <wp:extent cx="4206240" cy="5898594"/>
@@ -10623,7 +10700,7 @@
       <w:pPr>
         <w:pStyle w:val="FigureCaption"/>
       </w:pPr>
-      <w:bookmarkStart w:id="30" w:name="_Toc244083356"/>
+      <w:bookmarkStart w:id="30" w:name="_Toc244083951"/>
       <w:r>
         <w:t>Figure 3.4  Flowchart of the transactional add-expense operation</w:t>
       </w:r>
@@ -10708,7 +10785,6 @@
         <w:jc w:val="both"/>
       </w:pPr>
       <w:r>
-        <w:lastRenderedPageBreak/>
         <w:t>Put every member with net &gt; 0 into a max-heap of creditors and every member with net &lt; 0 into a max-heap of debtors keyed by |net| (a binary-heap PriorityQueue with an arrow-function comparator [17]).</w:t>
       </w:r>
     </w:p>
@@ -10759,9 +10835,8 @@
         <w:pStyle w:val="Heading1"/>
         <w:pageBreakBefore/>
       </w:pPr>
-      <w:bookmarkStart w:id="31" w:name="_Toc244083341"/>
-      <w:r>
-        <w:lastRenderedPageBreak/>
+      <w:bookmarkStart w:id="31" w:name="_Toc244083936"/>
+      <w:r>
         <w:t>CHAPTER 4.</w:t>
       </w:r>
       <w:r>
@@ -10777,7 +10852,7 @@
           <w:tab w:val="left" w:pos="720"/>
         </w:tabs>
       </w:pPr>
-      <w:bookmarkStart w:id="32" w:name="_Toc244083342"/>
+      <w:bookmarkStart w:id="32" w:name="_Toc244083937"/>
       <w:r>
         <w:t>4.1.</w:t>
       </w:r>
@@ -10800,7 +10875,7 @@
         <w:pStyle w:val="TableCaption"/>
         <w:keepNext/>
       </w:pPr>
-      <w:bookmarkStart w:id="33" w:name="_Toc244083371"/>
+      <w:bookmarkStart w:id="33" w:name="_Toc244083966"/>
       <w:r>
         <w:t>Table 4.1  Tools used in the project</w:t>
       </w:r>
@@ -10981,6 +11056,7 @@
           </w:tcPr>
           <w:p>
             <w:pPr>
+              <w:keepNext/>
               <w:keepLines/>
             </w:pPr>
             <w:r>
@@ -11010,6 +11086,7 @@
           </w:tcPr>
           <w:p>
             <w:pPr>
+              <w:keepNext/>
               <w:keepLines/>
             </w:pPr>
             <w:r>
@@ -11044,6 +11121,7 @@
           </w:tcPr>
           <w:p>
             <w:pPr>
+              <w:keepNext/>
               <w:keepLines/>
             </w:pPr>
             <w:r>
@@ -11073,6 +11151,7 @@
           </w:tcPr>
           <w:p>
             <w:pPr>
+              <w:keepNext/>
               <w:keepLines/>
             </w:pPr>
             <w:r>
@@ -11107,6 +11186,7 @@
           </w:tcPr>
           <w:p>
             <w:pPr>
+              <w:keepNext/>
               <w:keepLines/>
             </w:pPr>
             <w:r>
@@ -11136,6 +11216,7 @@
           </w:tcPr>
           <w:p>
             <w:pPr>
+              <w:keepNext/>
               <w:keepLines/>
             </w:pPr>
             <w:r>
@@ -11170,6 +11251,7 @@
           </w:tcPr>
           <w:p>
             <w:pPr>
+              <w:keepNext/>
               <w:keepLines/>
             </w:pPr>
             <w:r>
@@ -11199,6 +11281,7 @@
           </w:tcPr>
           <w:p>
             <w:pPr>
+              <w:keepNext/>
               <w:keepLines/>
             </w:pPr>
             <w:r>
@@ -11233,6 +11316,7 @@
           </w:tcPr>
           <w:p>
             <w:pPr>
+              <w:keepNext/>
               <w:keepLines/>
             </w:pPr>
             <w:r>
@@ -11262,6 +11346,7 @@
           </w:tcPr>
           <w:p>
             <w:pPr>
+              <w:keepNext/>
               <w:keepLines/>
             </w:pPr>
             <w:r>
@@ -11296,6 +11381,7 @@
           </w:tcPr>
           <w:p>
             <w:pPr>
+              <w:keepNext/>
               <w:keepLines/>
             </w:pPr>
             <w:r>
@@ -11325,6 +11411,7 @@
           </w:tcPr>
           <w:p>
             <w:pPr>
+              <w:keepNext/>
               <w:keepLines/>
             </w:pPr>
             <w:r>
@@ -11359,6 +11446,7 @@
           </w:tcPr>
           <w:p>
             <w:pPr>
+              <w:keepNext/>
               <w:keepLines/>
             </w:pPr>
             <w:r>
@@ -11388,6 +11476,7 @@
           </w:tcPr>
           <w:p>
             <w:pPr>
+              <w:keepNext/>
               <w:keepLines/>
             </w:pPr>
             <w:r>
@@ -11422,6 +11511,7 @@
           </w:tcPr>
           <w:p>
             <w:pPr>
+              <w:keepNext/>
               <w:keepLines/>
             </w:pPr>
             <w:r>
@@ -11451,6 +11541,7 @@
           </w:tcPr>
           <w:p>
             <w:pPr>
+              <w:keepNext/>
               <w:keepLines/>
             </w:pPr>
             <w:r>
@@ -11485,6 +11576,7 @@
           </w:tcPr>
           <w:p>
             <w:pPr>
+              <w:keepNext/>
               <w:keepLines/>
             </w:pPr>
             <w:r>
@@ -11514,6 +11606,7 @@
           </w:tcPr>
           <w:p>
             <w:pPr>
+              <w:keepNext/>
               <w:keepLines/>
             </w:pPr>
             <w:r>
@@ -11697,7 +11790,6 @@
         <w:pStyle w:val="Heading3"/>
       </w:pPr>
       <w:r>
-        <w:lastRenderedPageBreak/>
         <w:t>4.1.3. Split strategies</w:t>
       </w:r>
     </w:p>
@@ -11715,7 +11807,7 @@
         <w:pStyle w:val="TableCaption"/>
         <w:keepNext/>
       </w:pPr>
-      <w:bookmarkStart w:id="34" w:name="_Toc244083372"/>
+      <w:bookmarkStart w:id="34" w:name="_Toc244083967"/>
       <w:r>
         <w:t>Table 4.2  Split strategies</w:t>
       </w:r>
@@ -12085,6 +12177,7 @@
           </w:tcPr>
           <w:p>
             <w:pPr>
+              <w:keepNext/>
               <w:keepLines/>
             </w:pPr>
             <w:r>
@@ -12114,6 +12207,7 @@
           </w:tcPr>
           <w:p>
             <w:pPr>
+              <w:keepNext/>
               <w:keepLines/>
             </w:pPr>
             <w:r>
@@ -12143,6 +12237,7 @@
           </w:tcPr>
           <w:p>
             <w:pPr>
+              <w:keepNext/>
               <w:keepLines/>
             </w:pPr>
             <w:r>
@@ -12172,6 +12267,7 @@
           </w:tcPr>
           <w:p>
             <w:pPr>
+              <w:keepNext/>
               <w:keepLines/>
             </w:pPr>
             <w:r>
@@ -12201,6 +12297,7 @@
           </w:tcPr>
           <w:p>
             <w:pPr>
+              <w:keepNext/>
               <w:keepLines/>
             </w:pPr>
             <w:r>
@@ -12416,7 +12513,7 @@
         <w:pStyle w:val="TableCaption"/>
         <w:keepNext/>
       </w:pPr>
-      <w:bookmarkStart w:id="35" w:name="_Toc244083373"/>
+      <w:bookmarkStart w:id="35" w:name="_Toc244083968"/>
       <w:r>
         <w:t>Table 4.3  Balances for the demonstration scenario</w:t>
       </w:r>
@@ -12723,6 +12820,7 @@
           </w:tcPr>
           <w:p>
             <w:pPr>
+              <w:keepNext/>
               <w:keepLines/>
             </w:pPr>
             <w:r>
@@ -12752,6 +12850,7 @@
           </w:tcPr>
           <w:p>
             <w:pPr>
+              <w:keepNext/>
               <w:keepLines/>
             </w:pPr>
             <w:r>
@@ -12781,6 +12880,7 @@
           </w:tcPr>
           <w:p>
             <w:pPr>
+              <w:keepNext/>
               <w:keepLines/>
             </w:pPr>
             <w:r>
@@ -12810,6 +12910,7 @@
           </w:tcPr>
           <w:p>
             <w:pPr>
+              <w:keepNext/>
               <w:keepLines/>
             </w:pPr>
             <w:r>
@@ -12844,6 +12945,7 @@
           </w:tcPr>
           <w:p>
             <w:pPr>
+              <w:keepNext/>
               <w:keepLines/>
             </w:pPr>
             <w:r>
@@ -12873,6 +12975,7 @@
           </w:tcPr>
           <w:p>
             <w:pPr>
+              <w:keepNext/>
               <w:keepLines/>
             </w:pPr>
             <w:r>
@@ -12902,6 +13005,7 @@
           </w:tcPr>
           <w:p>
             <w:pPr>
+              <w:keepNext/>
               <w:keepLines/>
             </w:pPr>
             <w:r>
@@ -12931,6 +13035,7 @@
           </w:tcPr>
           <w:p>
             <w:pPr>
+              <w:keepNext/>
               <w:keepLines/>
             </w:pPr>
             <w:r>
@@ -12971,7 +13076,6 @@
               <w:rPr>
                 <w:sz w:val="20"/>
               </w:rPr>
-              <w:lastRenderedPageBreak/>
               <w:t>Diya</w:t>
             </w:r>
           </w:p>
@@ -13092,7 +13196,7 @@
         <w:pStyle w:val="TableCaption"/>
         <w:keepNext/>
       </w:pPr>
-      <w:bookmarkStart w:id="36" w:name="_Toc244083374"/>
+      <w:bookmarkStart w:id="36" w:name="_Toc244083969"/>
       <w:r>
         <w:t>Table 4.4  REST endpoints</w:t>
       </w:r>
@@ -15718,11 +15822,7 @@
         <w:jc w:val="both"/>
       </w:pPr>
       <w:r>
-        <w:t xml:space="preserve">The React interface is built with Vite and served by the same Express server at http://localhost:8080 (and by Vercel in production). App.jsx keeps the shared state and </w:t>
-      </w:r>
-      <w:r>
-        <w:lastRenderedPageBreak/>
-        <w:t>loads data through a small api() helper based on fetch(); components such as ExpenseForm and GroupPanel keep their own form state with useState. It uses a ledger-style design with light and dark themes, and a console strip at the bottom shows every request with its method, URL, status code and JSON body. Figures 4.1 to 4.8 show the main screens; Figures 4.9 and 4.10 show the automated test runs.</w:t>
+        <w:t>The React interface is built with Vite and served by the same Express server at http://localhost:8080 (and by Vercel in production). App.jsx keeps the shared state and loads data through a small api() helper based on fetch(); components such as ExpenseForm and GroupPanel keep their own form state with useState. It uses a ledger-style design with light and dark themes, and a console strip at the bottom shows every request with its method, URL, status code and JSON body. Figures 4.1 to 4.8 show the main screens; Figures 4.9 and 4.10 show the automated test runs.</w:t>
       </w:r>
     </w:p>
     <w:p>
@@ -15775,7 +15875,7 @@
       <w:pPr>
         <w:pStyle w:val="FigureCaption"/>
       </w:pPr>
-      <w:bookmarkStart w:id="37" w:name="_Toc244083357"/>
+      <w:bookmarkStart w:id="37" w:name="_Toc244083952"/>
       <w:r>
         <w:t>Figure 4.1  Dashboard after loading the demonstration data (light theme)</w:t>
       </w:r>
@@ -15831,7 +15931,7 @@
       <w:pPr>
         <w:pStyle w:val="FigureCaption"/>
       </w:pPr>
-      <w:bookmarkStart w:id="38" w:name="_Toc244083358"/>
+      <w:bookmarkStart w:id="38" w:name="_Toc244083953"/>
       <w:r>
         <w:t>Figure 4.2  PERCENTAGE split with the live split meter showing 10% unallocated</w:t>
       </w:r>
@@ -15846,7 +15946,6 @@
         <w:rPr>
           <w:noProof/>
         </w:rPr>
-        <w:lastRenderedPageBreak/>
         <w:drawing>
           <wp:inline distT="0" distB="0" distL="0" distR="0" wp14:anchorId="2BB059F8" wp14:editId="27785723">
             <wp:extent cx="5486400" cy="2943035"/>
@@ -15888,7 +15987,7 @@
       <w:pPr>
         <w:pStyle w:val="FigureCaption"/>
       </w:pPr>
-      <w:bookmarkStart w:id="39" w:name="_Toc244083359"/>
+      <w:bookmarkStart w:id="39" w:name="_Toc244083954"/>
       <w:r>
         <w:t>Figure 4.3  The server rejects the invalid split with 400 Bad Request</w:t>
       </w:r>
@@ -15944,7 +16043,7 @@
       <w:pPr>
         <w:pStyle w:val="FigureCaption"/>
       </w:pPr>
-      <w:bookmarkStart w:id="40" w:name="_Toc244083360"/>
+      <w:bookmarkStart w:id="40" w:name="_Toc244083955"/>
       <w:r>
         <w:t>Figure 4.4  Expense list with per-member shares and the AuditLogger activity feed</w:t>
       </w:r>
@@ -15959,7 +16058,6 @@
         <w:rPr>
           <w:noProof/>
         </w:rPr>
-        <w:lastRenderedPageBreak/>
         <w:drawing>
           <wp:inline distT="0" distB="0" distL="0" distR="0" wp14:anchorId="52D72B67" wp14:editId="23A8E1F7">
             <wp:extent cx="3108960" cy="2635857"/>
@@ -16001,7 +16099,7 @@
       <w:pPr>
         <w:pStyle w:val="FigureCaption"/>
       </w:pPr>
-      <w:bookmarkStart w:id="41" w:name="_Toc244083361"/>
+      <w:bookmarkStart w:id="41" w:name="_Toc244083956"/>
       <w:r>
         <w:t>Figure 4.5  Settle-up slip after a partial payment, with Settle buttons and payment history</w:t>
       </w:r>
@@ -16057,7 +16155,7 @@
       <w:pPr>
         <w:pStyle w:val="FigureCaption"/>
       </w:pPr>
-      <w:bookmarkStart w:id="42" w:name="_Toc244083362"/>
+      <w:bookmarkStart w:id="42" w:name="_Toc244083957"/>
       <w:r>
         <w:t>Figure 4.6  Deleting a member who still has expenses returns 409 Conflict</w:t>
       </w:r>
@@ -16072,10 +16170,9 @@
         <w:rPr>
           <w:noProof/>
         </w:rPr>
-        <w:lastRenderedPageBreak/>
         <w:drawing>
           <wp:inline distT="0" distB="0" distL="0" distR="0" wp14:anchorId="6F4903DB" wp14:editId="5F25CF95">
-            <wp:extent cx="4206240" cy="3505200"/>
+            <wp:extent cx="2700000" cy="2250000"/>
             <wp:effectExtent l="0" t="0" r="0" b="0"/>
             <wp:docPr id="14" name="Picture 14"/>
             <wp:cNvGraphicFramePr>
@@ -16097,7 +16194,7 @@
                   <pic:spPr>
                     <a:xfrm>
                       <a:off x="0" y="0"/>
-                      <a:ext cx="4206240" cy="3505200"/>
+                      <a:ext cx="2700000" cy="2250000"/>
                     </a:xfrm>
                     <a:prstGeom prst="rect">
                       <a:avLst/>
@@ -16114,7 +16211,7 @@
       <w:pPr>
         <w:pStyle w:val="FigureCaption"/>
       </w:pPr>
-      <w:bookmarkStart w:id="43" w:name="_Toc244083363"/>
+      <w:bookmarkStart w:id="43" w:name="_Toc244083958"/>
       <w:r>
         <w:t>Figure 4.7  Inline confirmation before deleting a group</w:t>
       </w:r>
@@ -16170,7 +16267,7 @@
       <w:pPr>
         <w:pStyle w:val="FigureCaption"/>
       </w:pPr>
-      <w:bookmarkStart w:id="44" w:name="_Toc244083364"/>
+      <w:bookmarkStart w:id="44" w:name="_Toc244083959"/>
       <w:r>
         <w:t>Figure 4.8  Dashboard in the dark theme</w:t>
       </w:r>
@@ -16185,7 +16282,6 @@
         <w:rPr>
           <w:noProof/>
         </w:rPr>
-        <w:lastRenderedPageBreak/>
         <w:drawing>
           <wp:inline distT="0" distB="0" distL="0" distR="0" wp14:anchorId="6699452B" wp14:editId="20FF6F1F">
             <wp:extent cx="5486400" cy="3113532"/>
@@ -16227,7 +16323,7 @@
       <w:pPr>
         <w:pStyle w:val="FigureCaption"/>
       </w:pPr>
-      <w:bookmarkStart w:id="45" w:name="_Toc244083365"/>
+      <w:bookmarkStart w:id="45" w:name="_Toc244083960"/>
       <w:r>
         <w:t>Figure 4.9  Backend test suite run with npm test (node:test, 6 tests, 0 failures)</w:t>
       </w:r>
@@ -16255,7 +16351,7 @@
         <w:pStyle w:val="TableCaption"/>
         <w:keepNext/>
       </w:pPr>
-      <w:bookmarkStart w:id="46" w:name="_Toc244083375"/>
+      <w:bookmarkStart w:id="46" w:name="_Toc244083970"/>
       <w:r>
         <w:t>Table 4.5  Functional test cases and results</w:t>
       </w:r>
@@ -17415,7 +17511,6 @@
               <w:rPr>
                 <w:sz w:val="20"/>
               </w:rPr>
-              <w:lastRenderedPageBreak/>
               <w:t>9</w:t>
             </w:r>
           </w:p>
@@ -18774,7 +18869,7 @@
       <w:pPr>
         <w:pStyle w:val="FigureCaption"/>
       </w:pPr>
-      <w:bookmarkStart w:id="47" w:name="_Toc244083366"/>
+      <w:bookmarkStart w:id="47" w:name="_Toc244083961"/>
       <w:r>
         <w:t>Figure 4.10  Newman run of the Postman collection (last two folders and summary)</w:t>
       </w:r>
@@ -18789,7 +18884,6 @@
         <w:rPr>
           <w:b/>
         </w:rPr>
-        <w:lastRenderedPageBreak/>
         <w:t>Quality of the greedy settlement.</w:t>
       </w:r>
       <w:r>
@@ -18801,7 +18895,7 @@
         <w:pStyle w:val="TableCaption"/>
         <w:keepNext/>
       </w:pPr>
-      <w:bookmarkStart w:id="48" w:name="_Toc244083376"/>
+      <w:bookmarkStart w:id="48" w:name="_Toc244083971"/>
       <w:r>
         <w:t>Table 4.6  Greedy settlement compared with the exact minimum</w:t>
       </w:r>
@@ -19108,6 +19202,7 @@
           </w:tcPr>
           <w:p>
             <w:pPr>
+              <w:keepNext/>
               <w:keepLines/>
             </w:pPr>
             <w:r>
@@ -19137,6 +19232,7 @@
           </w:tcPr>
           <w:p>
             <w:pPr>
+              <w:keepNext/>
               <w:keepLines/>
             </w:pPr>
             <w:r>
@@ -19166,6 +19262,7 @@
           </w:tcPr>
           <w:p>
             <w:pPr>
+              <w:keepNext/>
               <w:keepLines/>
             </w:pPr>
             <w:r>
@@ -19195,6 +19292,7 @@
           </w:tcPr>
           <w:p>
             <w:pPr>
+              <w:keepNext/>
               <w:keepLines/>
             </w:pPr>
             <w:r>
@@ -19229,6 +19327,7 @@
           </w:tcPr>
           <w:p>
             <w:pPr>
+              <w:keepNext/>
               <w:keepLines/>
             </w:pPr>
             <w:r>
@@ -19258,6 +19357,7 @@
           </w:tcPr>
           <w:p>
             <w:pPr>
+              <w:keepNext/>
               <w:keepLines/>
             </w:pPr>
             <w:r>
@@ -19287,6 +19387,7 @@
           </w:tcPr>
           <w:p>
             <w:pPr>
+              <w:keepNext/>
               <w:keepLines/>
             </w:pPr>
             <w:r>
@@ -19316,6 +19417,7 @@
           </w:tcPr>
           <w:p>
             <w:pPr>
+              <w:keepNext/>
               <w:keepLines/>
             </w:pPr>
             <w:r>
@@ -19350,6 +19452,7 @@
           </w:tcPr>
           <w:p>
             <w:pPr>
+              <w:keepNext/>
               <w:keepLines/>
             </w:pPr>
             <w:r>
@@ -19379,6 +19482,7 @@
           </w:tcPr>
           <w:p>
             <w:pPr>
+              <w:keepNext/>
               <w:keepLines/>
             </w:pPr>
             <w:r>
@@ -19408,6 +19512,7 @@
           </w:tcPr>
           <w:p>
             <w:pPr>
+              <w:keepNext/>
               <w:keepLines/>
             </w:pPr>
             <w:r>
@@ -19437,6 +19542,7 @@
           </w:tcPr>
           <w:p>
             <w:pPr>
+              <w:keepNext/>
               <w:keepLines/>
             </w:pPr>
             <w:r>
@@ -19471,6 +19577,7 @@
           </w:tcPr>
           <w:p>
             <w:pPr>
+              <w:keepNext/>
               <w:keepLines/>
             </w:pPr>
             <w:r>
@@ -19500,6 +19607,7 @@
           </w:tcPr>
           <w:p>
             <w:pPr>
+              <w:keepNext/>
               <w:keepLines/>
             </w:pPr>
             <w:r>
@@ -19529,6 +19637,7 @@
           </w:tcPr>
           <w:p>
             <w:pPr>
+              <w:keepNext/>
               <w:keepLines/>
             </w:pPr>
             <w:r>
@@ -19558,6 +19667,7 @@
           </w:tcPr>
           <w:p>
             <w:pPr>
+              <w:keepNext/>
               <w:keepLines/>
             </w:pPr>
             <w:r>
@@ -19592,6 +19702,7 @@
           </w:tcPr>
           <w:p>
             <w:pPr>
+              <w:keepNext/>
               <w:keepLines/>
             </w:pPr>
             <w:r>
@@ -19621,6 +19732,7 @@
           </w:tcPr>
           <w:p>
             <w:pPr>
+              <w:keepNext/>
               <w:keepLines/>
             </w:pPr>
             <w:r>
@@ -19650,6 +19762,7 @@
           </w:tcPr>
           <w:p>
             <w:pPr>
+              <w:keepNext/>
               <w:keepLines/>
             </w:pPr>
             <w:r>
@@ -19679,6 +19792,7 @@
           </w:tcPr>
           <w:p>
             <w:pPr>
+              <w:keepNext/>
               <w:keepLines/>
             </w:pPr>
             <w:r>
@@ -19713,6 +19827,7 @@
           </w:tcPr>
           <w:p>
             <w:pPr>
+              <w:keepNext/>
               <w:keepLines/>
             </w:pPr>
             <w:r>
@@ -19742,6 +19857,7 @@
           </w:tcPr>
           <w:p>
             <w:pPr>
+              <w:keepNext/>
               <w:keepLines/>
             </w:pPr>
             <w:r>
@@ -19771,6 +19887,7 @@
           </w:tcPr>
           <w:p>
             <w:pPr>
+              <w:keepNext/>
               <w:keepLines/>
             </w:pPr>
             <w:r>
@@ -19800,6 +19917,7 @@
           </w:tcPr>
           <w:p>
             <w:pPr>
+              <w:keepNext/>
               <w:keepLines/>
             </w:pPr>
             <w:r>
@@ -19952,9 +20070,8 @@
         <w:pStyle w:val="Heading1"/>
         <w:pageBreakBefore/>
       </w:pPr>
-      <w:bookmarkStart w:id="49" w:name="_Toc244083343"/>
-      <w:r>
-        <w:lastRenderedPageBreak/>
+      <w:bookmarkStart w:id="49" w:name="_Toc244083938"/>
+      <w:r>
         <w:t>CHAPTER 5.</w:t>
       </w:r>
       <w:r>
@@ -19970,7 +20087,7 @@
           <w:tab w:val="left" w:pos="720"/>
         </w:tabs>
       </w:pPr>
-      <w:bookmarkStart w:id="50" w:name="_Toc244083344"/>
+      <w:bookmarkStart w:id="50" w:name="_Toc244083939"/>
       <w:r>
         <w:t>5.1.</w:t>
       </w:r>
@@ -20072,11 +20189,7 @@
         <w:jc w:val="both"/>
       </w:pPr>
       <w:r>
-        <w:t xml:space="preserve">Deleting users and groups and recording settle-up payments were added after the original specification, which required new integrity rules (409 for users still in </w:t>
-      </w:r>
-      <w:r>
-        <w:lastRenderedPageBreak/>
-        <w:t>expenses or payments, cascade for groups, and payments limited to the amount owed).</w:t>
+        <w:t>Deleting users and groups and recording settle-up payments were added after the original specification, which required new integrity rules (409 for users still in expenses or payments, cascade for groups, and payments limited to the amount owed).</w:t>
       </w:r>
     </w:p>
     <w:p>
@@ -20100,7 +20213,7 @@
           <w:tab w:val="left" w:pos="720"/>
         </w:tabs>
       </w:pPr>
-      <w:bookmarkStart w:id="51" w:name="_Toc244083345"/>
+      <w:bookmarkStart w:id="51" w:name="_Toc244083940"/>
       <w:r>
         <w:t>5.2.</w:t>
       </w:r>
@@ -20275,9 +20388,8 @@
         <w:pStyle w:val="Heading1"/>
         <w:pageBreakBefore/>
       </w:pPr>
-      <w:bookmarkStart w:id="52" w:name="_Toc244083346"/>
-      <w:r>
-        <w:lastRenderedPageBreak/>
+      <w:bookmarkStart w:id="52" w:name="_Toc244083941"/>
+      <w:r>
         <w:t>REFERENCES</w:t>
       </w:r>
       <w:bookmarkEnd w:id="52"/>
@@ -20779,9 +20891,8 @@
         <w:pStyle w:val="Heading1"/>
         <w:pageBreakBefore/>
       </w:pPr>
-      <w:bookmarkStart w:id="53" w:name="_Toc244083347"/>
-      <w:r>
-        <w:lastRenderedPageBreak/>
+      <w:bookmarkStart w:id="53" w:name="_Toc244083942"/>
+      <w:r>
         <w:t>APPENDIX</w:t>
       </w:r>
       <w:bookmarkEnd w:id="53"/>
@@ -20793,7 +20904,7 @@
           <w:tab w:val="left" w:pos="720"/>
         </w:tabs>
       </w:pPr>
-      <w:bookmarkStart w:id="54" w:name="_Toc244083348"/>
+      <w:bookmarkStart w:id="54" w:name="_Toc244083943"/>
       <w:r>
         <w:t>A.</w:t>
       </w:r>
@@ -20808,7 +20919,7 @@
         <w:pStyle w:val="TableCaption"/>
         <w:keepNext/>
       </w:pPr>
-      <w:bookmarkStart w:id="55" w:name="_Toc244083377"/>
+      <w:bookmarkStart w:id="55" w:name="_Toc244083972"/>
       <w:r>
         <w:t>Table A.1  Design checklist</w:t>
       </w:r>
@@ -21052,6 +21163,7 @@
           </w:tcPr>
           <w:p>
             <w:pPr>
+              <w:keepNext/>
               <w:keepLines/>
             </w:pPr>
             <w:r>
@@ -21081,6 +21193,7 @@
           </w:tcPr>
           <w:p>
             <w:pPr>
+              <w:keepNext/>
               <w:keepLines/>
             </w:pPr>
             <w:r>
@@ -21110,6 +21223,7 @@
           </w:tcPr>
           <w:p>
             <w:pPr>
+              <w:keepNext/>
               <w:keepLines/>
             </w:pPr>
             <w:r>
@@ -21144,6 +21258,7 @@
           </w:tcPr>
           <w:p>
             <w:pPr>
+              <w:keepNext/>
               <w:keepLines/>
             </w:pPr>
             <w:r>
@@ -21173,6 +21288,7 @@
           </w:tcPr>
           <w:p>
             <w:pPr>
+              <w:keepNext/>
               <w:keepLines/>
             </w:pPr>
             <w:r>
@@ -21202,6 +21318,7 @@
           </w:tcPr>
           <w:p>
             <w:pPr>
+              <w:keepNext/>
               <w:keepLines/>
             </w:pPr>
             <w:r>
@@ -21236,6 +21353,7 @@
           </w:tcPr>
           <w:p>
             <w:pPr>
+              <w:keepNext/>
               <w:keepLines/>
             </w:pPr>
             <w:r>
@@ -21265,6 +21383,7 @@
           </w:tcPr>
           <w:p>
             <w:pPr>
+              <w:keepNext/>
               <w:keepLines/>
             </w:pPr>
             <w:r>
@@ -21294,6 +21413,7 @@
           </w:tcPr>
           <w:p>
             <w:pPr>
+              <w:keepNext/>
               <w:keepLines/>
             </w:pPr>
             <w:r>
@@ -21328,6 +21448,7 @@
           </w:tcPr>
           <w:p>
             <w:pPr>
+              <w:keepNext/>
               <w:keepLines/>
             </w:pPr>
             <w:r>
@@ -21357,6 +21478,7 @@
           </w:tcPr>
           <w:p>
             <w:pPr>
+              <w:keepNext/>
               <w:keepLines/>
             </w:pPr>
             <w:r>
@@ -21386,6 +21508,7 @@
           </w:tcPr>
           <w:p>
             <w:pPr>
+              <w:keepNext/>
               <w:keepLines/>
             </w:pPr>
             <w:r>
@@ -21420,6 +21543,7 @@
           </w:tcPr>
           <w:p>
             <w:pPr>
+              <w:keepNext/>
               <w:keepLines/>
             </w:pPr>
             <w:r>
@@ -21449,6 +21573,7 @@
           </w:tcPr>
           <w:p>
             <w:pPr>
+              <w:keepNext/>
               <w:keepLines/>
             </w:pPr>
             <w:r>
@@ -21478,6 +21603,7 @@
           </w:tcPr>
           <w:p>
             <w:pPr>
+              <w:keepNext/>
               <w:keepLines/>
             </w:pPr>
             <w:r>
@@ -21512,6 +21638,7 @@
           </w:tcPr>
           <w:p>
             <w:pPr>
+              <w:keepNext/>
               <w:keepLines/>
             </w:pPr>
             <w:r>
@@ -21541,6 +21668,7 @@
           </w:tcPr>
           <w:p>
             <w:pPr>
+              <w:keepNext/>
               <w:keepLines/>
             </w:pPr>
             <w:r>
@@ -21570,6 +21698,7 @@
           </w:tcPr>
           <w:p>
             <w:pPr>
+              <w:keepNext/>
               <w:keepLines/>
             </w:pPr>
             <w:r>
@@ -21604,6 +21733,7 @@
           </w:tcPr>
           <w:p>
             <w:pPr>
+              <w:keepNext/>
               <w:keepLines/>
             </w:pPr>
             <w:r>
@@ -21633,6 +21763,7 @@
           </w:tcPr>
           <w:p>
             <w:pPr>
+              <w:keepNext/>
               <w:keepLines/>
             </w:pPr>
             <w:r>
@@ -21662,6 +21793,7 @@
           </w:tcPr>
           <w:p>
             <w:pPr>
+              <w:keepNext/>
               <w:keepLines/>
             </w:pPr>
             <w:r>
@@ -21696,6 +21828,7 @@
           </w:tcPr>
           <w:p>
             <w:pPr>
+              <w:keepNext/>
               <w:keepLines/>
             </w:pPr>
             <w:r>
@@ -21725,6 +21858,7 @@
           </w:tcPr>
           <w:p>
             <w:pPr>
+              <w:keepNext/>
               <w:keepLines/>
             </w:pPr>
             <w:r>
@@ -21754,6 +21888,7 @@
           </w:tcPr>
           <w:p>
             <w:pPr>
+              <w:keepNext/>
               <w:keepLines/>
             </w:pPr>
             <w:r>
@@ -21870,7 +22005,7 @@
           <w:tab w:val="left" w:pos="720"/>
         </w:tabs>
       </w:pPr>
-      <w:bookmarkStart w:id="56" w:name="_Toc244083349"/>
+      <w:bookmarkStart w:id="56" w:name="_Toc244083944"/>
       <w:r>
         <w:t>B.</w:t>
       </w:r>
@@ -21885,7 +22020,7 @@
         <w:pStyle w:val="TableCaption"/>
         <w:keepNext/>
       </w:pPr>
-      <w:bookmarkStart w:id="57" w:name="_Toc244083378"/>
+      <w:bookmarkStart w:id="57" w:name="_Toc244083973"/>
       <w:r>
         <w:t>Table A.2  Technical summary of Expense Splitter</w:t>
       </w:r>
@@ -22066,6 +22201,7 @@
           </w:tcPr>
           <w:p>
             <w:pPr>
+              <w:keepNext/>
               <w:keepLines/>
             </w:pPr>
             <w:r>
@@ -22095,6 +22231,7 @@
           </w:tcPr>
           <w:p>
             <w:pPr>
+              <w:keepNext/>
               <w:keepLines/>
             </w:pPr>
             <w:r>
@@ -22129,6 +22266,7 @@
           </w:tcPr>
           <w:p>
             <w:pPr>
+              <w:keepNext/>
               <w:keepLines/>
             </w:pPr>
             <w:r>
@@ -22158,6 +22296,7 @@
           </w:tcPr>
           <w:p>
             <w:pPr>
+              <w:keepNext/>
               <w:keepLines/>
             </w:pPr>
             <w:r>
@@ -22192,6 +22331,7 @@
           </w:tcPr>
           <w:p>
             <w:pPr>
+              <w:keepNext/>
               <w:keepLines/>
             </w:pPr>
             <w:r>
@@ -22221,6 +22361,7 @@
           </w:tcPr>
           <w:p>
             <w:pPr>
+              <w:keepNext/>
               <w:keepLines/>
             </w:pPr>
             <w:r>
@@ -22255,6 +22396,7 @@
           </w:tcPr>
           <w:p>
             <w:pPr>
+              <w:keepNext/>
               <w:keepLines/>
             </w:pPr>
             <w:r>
@@ -22284,6 +22426,7 @@
           </w:tcPr>
           <w:p>
             <w:pPr>
+              <w:keepNext/>
               <w:keepLines/>
             </w:pPr>
             <w:r>
@@ -22318,6 +22461,7 @@
           </w:tcPr>
           <w:p>
             <w:pPr>
+              <w:keepNext/>
               <w:keepLines/>
             </w:pPr>
             <w:r>
@@ -22347,6 +22491,7 @@
           </w:tcPr>
           <w:p>
             <w:pPr>
+              <w:keepNext/>
               <w:keepLines/>
             </w:pPr>
             <w:r>
@@ -22381,6 +22526,7 @@
           </w:tcPr>
           <w:p>
             <w:pPr>
+              <w:keepNext/>
               <w:keepLines/>
             </w:pPr>
             <w:r>
@@ -22410,6 +22556,7 @@
           </w:tcPr>
           <w:p>
             <w:pPr>
+              <w:keepNext/>
               <w:keepLines/>
             </w:pPr>
             <w:r>
@@ -22444,6 +22591,7 @@
           </w:tcPr>
           <w:p>
             <w:pPr>
+              <w:keepNext/>
               <w:keepLines/>
             </w:pPr>
             <w:r>
@@ -22473,6 +22621,7 @@
           </w:tcPr>
           <w:p>
             <w:pPr>
+              <w:keepNext/>
               <w:keepLines/>
             </w:pPr>
             <w:r>
@@ -22507,6 +22656,7 @@
           </w:tcPr>
           <w:p>
             <w:pPr>
+              <w:keepNext/>
               <w:keepLines/>
             </w:pPr>
             <w:r>
@@ -22536,6 +22686,7 @@
           </w:tcPr>
           <w:p>
             <w:pPr>
+              <w:keepNext/>
               <w:keepLines/>
             </w:pPr>
             <w:r>
@@ -22623,9 +22774,8 @@
           <w:tab w:val="left" w:pos="720"/>
         </w:tabs>
       </w:pPr>
-      <w:bookmarkStart w:id="58" w:name="_Toc244083350"/>
-      <w:r>
-        <w:lastRenderedPageBreak/>
+      <w:bookmarkStart w:id="58" w:name="_Toc244083945"/>
+      <w:r>
         <w:t>C.</w:t>
       </w:r>
       <w:r>
@@ -22873,7 +23023,7 @@
           <w:rFonts w:ascii="Consolas" w:hAnsi="Consolas"/>
           <w:sz w:val="18"/>
         </w:rPr>
-        <w:t xml:space="preserve">    const expense = expenseRepository.save(new Expense(...));     // 1. save the expense</w:t>
+        <w:t xml:space="preserve">    const expense = expenseRepository.save(new Expense(...)); // 1. save</w:t>
       </w:r>
     </w:p>
     <w:p>
@@ -22888,7 +23038,7 @@
           <w:rFonts w:ascii="Consolas" w:hAnsi="Consolas"/>
           <w:sz w:val="18"/>
         </w:rPr>
-        <w:t xml:space="preserve">    const shares = strategy.calculateShares(amount, splits);      // 2. may throw -&gt; ROLLBACK</w:t>
+        <w:t xml:space="preserve">    const shares = strategy.calculateShares(amount, splits); // 2. may throw</w:t>
       </w:r>
     </w:p>
     <w:p>
@@ -22903,7 +23053,7 @@
           <w:rFonts w:ascii="Consolas" w:hAnsi="Consolas"/>
           <w:sz w:val="18"/>
         </w:rPr>
-        <w:t xml:space="preserve">    for (const [userId, share] of shares) expense.addShare(new ExpenseShare(userService.getUser(userId), share));</w:t>
+        <w:t xml:space="preserve">    for (const [userId, share] of shares) {</w:t>
       </w:r>
     </w:p>
     <w:p>
@@ -22918,7 +23068,37 @@
           <w:rFonts w:ascii="Consolas" w:hAnsi="Consolas"/>
           <w:sz w:val="18"/>
         </w:rPr>
-        <w:t xml:space="preserve">    expenseEventPublisher.notifyExpenseAdded(expense);             // 3. observers (audit log)</w:t>
+        <w:t xml:space="preserve">      expense.addShare(new ExpenseShare(userService.getUser(userId), share));</w:t>
+      </w:r>
+    </w:p>
+    <w:p>
+      <w:pPr>
+        <w:keepNext/>
+        <w:keepLines/>
+        <w:shd w:val="clear" w:color="auto" w:fill="F2F2F2"/>
+        <w:ind w:left="360"/>
+      </w:pPr>
+      <w:r>
+        <w:rPr>
+          <w:rFonts w:ascii="Consolas" w:hAnsi="Consolas"/>
+          <w:sz w:val="18"/>
+        </w:rPr>
+        <w:t xml:space="preserve">    }</w:t>
+      </w:r>
+    </w:p>
+    <w:p>
+      <w:pPr>
+        <w:keepNext/>
+        <w:keepLines/>
+        <w:shd w:val="clear" w:color="auto" w:fill="F2F2F2"/>
+        <w:ind w:left="360"/>
+      </w:pPr>
+      <w:r>
+        <w:rPr>
+          <w:rFonts w:ascii="Consolas" w:hAnsi="Consolas"/>
+          <w:sz w:val="18"/>
+        </w:rPr>
+        <w:t xml:space="preserve">    expenseEventPublisher.notifyExpenseAdded(expense);      // 3. observers</w:t>
       </w:r>
     </w:p>
     <w:p>
@@ -23008,7 +23188,7 @@
           <w:rFonts w:ascii="Consolas" w:hAnsi="Consolas"/>
           <w:sz w:val="18"/>
         </w:rPr>
-        <w:t xml:space="preserve">  currentTransaction = [];                      // undo log filled by save() and delete()</w:t>
+        <w:t xml:space="preserve">  currentTransaction = [];       // undo log, filled by save() and delete()</w:t>
       </w:r>
     </w:p>
     <w:p>
@@ -23023,7 +23203,7 @@
           <w:rFonts w:ascii="Consolas" w:hAnsi="Consolas"/>
           <w:sz w:val="18"/>
         </w:rPr>
-        <w:t xml:space="preserve">  try { return fn(); }</w:t>
+        <w:t xml:space="preserve">  try {</w:t>
       </w:r>
     </w:p>
     <w:p>
@@ -23038,7 +23218,7 @@
           <w:rFonts w:ascii="Consolas" w:hAnsi="Consolas"/>
           <w:sz w:val="18"/>
         </w:rPr>
-        <w:t xml:space="preserve">  catch (err) { currentTransaction.reverse().forEach((undo) =&gt; undo()); throw err; }</w:t>
+        <w:t xml:space="preserve">    return fn();</w:t>
       </w:r>
     </w:p>
     <w:p>
@@ -23053,7 +23233,82 @@
           <w:rFonts w:ascii="Consolas" w:hAnsi="Consolas"/>
           <w:sz w:val="18"/>
         </w:rPr>
-        <w:t xml:space="preserve">  finally { currentTransaction = null; }</w:t>
+        <w:t xml:space="preserve">  } catch (err) {</w:t>
+      </w:r>
+    </w:p>
+    <w:p>
+      <w:pPr>
+        <w:keepNext/>
+        <w:keepLines/>
+        <w:shd w:val="clear" w:color="auto" w:fill="F2F2F2"/>
+        <w:ind w:left="360"/>
+      </w:pPr>
+      <w:r>
+        <w:rPr>
+          <w:rFonts w:ascii="Consolas" w:hAnsi="Consolas"/>
+          <w:sz w:val="18"/>
+        </w:rPr>
+        <w:t xml:space="preserve">    currentTransaction.reverse().forEach((undo) =&gt; undo());   // ROLLBACK</w:t>
+      </w:r>
+    </w:p>
+    <w:p>
+      <w:pPr>
+        <w:keepNext/>
+        <w:keepLines/>
+        <w:shd w:val="clear" w:color="auto" w:fill="F2F2F2"/>
+        <w:ind w:left="360"/>
+      </w:pPr>
+      <w:r>
+        <w:rPr>
+          <w:rFonts w:ascii="Consolas" w:hAnsi="Consolas"/>
+          <w:sz w:val="18"/>
+        </w:rPr>
+        <w:t xml:space="preserve">    throw err;</w:t>
+      </w:r>
+    </w:p>
+    <w:p>
+      <w:pPr>
+        <w:keepNext/>
+        <w:keepLines/>
+        <w:shd w:val="clear" w:color="auto" w:fill="F2F2F2"/>
+        <w:ind w:left="360"/>
+      </w:pPr>
+      <w:r>
+        <w:rPr>
+          <w:rFonts w:ascii="Consolas" w:hAnsi="Consolas"/>
+          <w:sz w:val="18"/>
+        </w:rPr>
+        <w:t xml:space="preserve">  } finally {</w:t>
+      </w:r>
+    </w:p>
+    <w:p>
+      <w:pPr>
+        <w:keepNext/>
+        <w:keepLines/>
+        <w:shd w:val="clear" w:color="auto" w:fill="F2F2F2"/>
+        <w:ind w:left="360"/>
+      </w:pPr>
+      <w:r>
+        <w:rPr>
+          <w:rFonts w:ascii="Consolas" w:hAnsi="Consolas"/>
+          <w:sz w:val="18"/>
+        </w:rPr>
+        <w:t xml:space="preserve">    currentTransaction = null;</w:t>
+      </w:r>
+    </w:p>
+    <w:p>
+      <w:pPr>
+        <w:keepNext/>
+        <w:keepLines/>
+        <w:shd w:val="clear" w:color="auto" w:fill="F2F2F2"/>
+        <w:ind w:left="360"/>
+      </w:pPr>
+      <w:r>
+        <w:rPr>
+          <w:rFonts w:ascii="Consolas" w:hAnsi="Consolas"/>
+          <w:sz w:val="18"/>
+        </w:rPr>
+        <w:t xml:space="preserve">  }</w:t>
       </w:r>
     </w:p>
     <w:p>
@@ -23189,7 +23444,22 @@
           <w:rFonts w:ascii="Consolas" w:hAnsi="Consolas"/>
           <w:sz w:val="18"/>
         </w:rPr>
-        <w:t>const owed = sumBy(expenses.flatMap((e) =&gt; e.shares), (s) =&gt; s.user.id, (s) =&gt; s.shareAmount);</w:t>
+        <w:t>const owed = sumBy(expenses.flatMap((e) =&gt; e.shares),</w:t>
+      </w:r>
+    </w:p>
+    <w:p>
+      <w:pPr>
+        <w:keepNext/>
+        <w:keepLines/>
+        <w:shd w:val="clear" w:color="auto" w:fill="F2F2F2"/>
+        <w:ind w:left="360"/>
+      </w:pPr>
+      <w:r>
+        <w:rPr>
+          <w:rFonts w:ascii="Consolas" w:hAnsi="Consolas"/>
+          <w:sz w:val="18"/>
+        </w:rPr>
+        <w:t xml:space="preserve">                   (s) =&gt; s.user.id, (s) =&gt; s.shareAmount);</w:t>
       </w:r>
     </w:p>
     <w:p>
@@ -23310,7 +23580,22 @@
           <w:rFonts w:ascii="Consolas" w:hAnsi="Consolas"/>
           <w:sz w:val="18"/>
         </w:rPr>
-        <w:t xml:space="preserve">  result.push({ ..., message: `${debtor.name} pays ${creditor.name} ${config.format(pay)}` });</w:t>
+        <w:t xml:space="preserve">  const message = `${debtor.name} pays ${creditor.name} ${config.format(pay)}`;</w:t>
+      </w:r>
+    </w:p>
+    <w:p>
+      <w:pPr>
+        <w:keepNext/>
+        <w:keepLines/>
+        <w:shd w:val="clear" w:color="auto" w:fill="F2F2F2"/>
+        <w:ind w:left="360"/>
+      </w:pPr>
+      <w:r>
+        <w:rPr>
+          <w:rFonts w:ascii="Consolas" w:hAnsi="Consolas"/>
+          <w:sz w:val="18"/>
+        </w:rPr>
+        <w:t xml:space="preserve">  result.push({ ..., amount: pay, message });</w:t>
       </w:r>
     </w:p>
     <w:p>
@@ -23340,7 +23625,6 @@
           <w:rFonts w:ascii="Consolas" w:hAnsi="Consolas"/>
           <w:sz w:val="18"/>
         </w:rPr>
-        <w:lastRenderedPageBreak/>
         <w:t xml:space="preserve">  debtor.amount = config.round(debtor.amount - pay);</w:t>
       </w:r>
     </w:p>
@@ -23477,7 +23761,7 @@
           <w:rFonts w:ascii="Consolas" w:hAnsi="Consolas"/>
           <w:sz w:val="18"/>
         </w:rPr>
-        <w:t xml:space="preserve">    if (token !== TOKEN) throw new Error('Use ConfigService.getInstance()');   // "private"</w:t>
+        <w:t xml:space="preserve">    if (token !== TOKEN) throw new Error('Use getInstance()');   // "private"</w:t>
       </w:r>
     </w:p>
     <w:p>
@@ -23537,7 +23821,37 @@
           <w:rFonts w:ascii="Consolas" w:hAnsi="Consolas"/>
           <w:sz w:val="18"/>
         </w:rPr>
-        <w:t xml:space="preserve">    if (!ConfigService.#instance) ConfigService.#instance = new ConfigService(TOKEN);</w:t>
+        <w:t xml:space="preserve">    if (!ConfigService.#instance) {</w:t>
+      </w:r>
+    </w:p>
+    <w:p>
+      <w:pPr>
+        <w:keepNext/>
+        <w:keepLines/>
+        <w:shd w:val="clear" w:color="auto" w:fill="F2F2F2"/>
+        <w:ind w:left="360"/>
+      </w:pPr>
+      <w:r>
+        <w:rPr>
+          <w:rFonts w:ascii="Consolas" w:hAnsi="Consolas"/>
+          <w:sz w:val="18"/>
+        </w:rPr>
+        <w:t xml:space="preserve">      ConfigService.#instance = new ConfigService(TOKEN);</w:t>
+      </w:r>
+    </w:p>
+    <w:p>
+      <w:pPr>
+        <w:keepNext/>
+        <w:keepLines/>
+        <w:shd w:val="clear" w:color="auto" w:fill="F2F2F2"/>
+        <w:ind w:left="360"/>
+      </w:pPr>
+      <w:r>
+        <w:rPr>
+          <w:rFonts w:ascii="Consolas" w:hAnsi="Consolas"/>
+          <w:sz w:val="18"/>
+        </w:rPr>
+        <w:t xml:space="preserve">    }</w:t>
       </w:r>
     </w:p>
     <w:p>
@@ -23592,7 +23906,7 @@
           <w:tab w:val="left" w:pos="720"/>
         </w:tabs>
       </w:pPr>
-      <w:bookmarkStart w:id="59" w:name="_Toc244083351"/>
+      <w:bookmarkStart w:id="59" w:name="_Toc244083946"/>
       <w:r>
         <w:t>D.</w:t>
       </w:r>
@@ -23645,7 +23959,22 @@
           <w:rFonts w:ascii="Consolas" w:hAnsi="Consolas"/>
           <w:sz w:val="18"/>
         </w:rPr>
-        <w:t xml:space="preserve">  "description": "Cab to airport", "amount": 1000, "paidBy": 2, "splitType": "PERCENTAGE",</w:t>
+        <w:t xml:space="preserve">  "description": "Cab to airport", "amount": 1000, "paidBy": 2,</w:t>
+      </w:r>
+    </w:p>
+    <w:p>
+      <w:pPr>
+        <w:keepNext/>
+        <w:keepLines/>
+        <w:shd w:val="clear" w:color="auto" w:fill="F2F2F2"/>
+        <w:ind w:left="360"/>
+      </w:pPr>
+      <w:r>
+        <w:rPr>
+          <w:rFonts w:ascii="Consolas" w:hAnsi="Consolas"/>
+          <w:sz w:val="18"/>
+        </w:rPr>
+        <w:t xml:space="preserve">  "splitType": "PERCENTAGE",</w:t>
       </w:r>
     </w:p>
     <w:p>
@@ -23765,7 +24094,7 @@
           <w:rFonts w:ascii="Consolas" w:hAnsi="Consolas"/>
           <w:sz w:val="18"/>
         </w:rPr>
-        <w:t>[ { "fromUser": "Diya", "toUser": "Aman",   "amount": 400.0, "message": "Diya pays Aman Rs 400.00" },</w:t>
+        <w:t>[ { "fromUser": "Diya", "toUser": "Aman", "amount": 400,</w:t>
       </w:r>
     </w:p>
     <w:p>
@@ -23780,11 +24109,12 @@
           <w:rFonts w:ascii="Consolas" w:hAnsi="Consolas"/>
           <w:sz w:val="18"/>
         </w:rPr>
-        <w:t xml:space="preserve">  { "fromUser": "Diya", "toUser": "Chirag", "amount": 200.0, "message": "Diya pays Chirag Rs 200.00" },</w:t>
-      </w:r>
-    </w:p>
-    <w:p>
-      <w:pPr>
+        <w:t xml:space="preserve">    "message": "Diya pays Aman Rs 400.00" },</w:t>
+      </w:r>
+    </w:p>
+    <w:p>
+      <w:pPr>
+        <w:keepNext/>
         <w:keepLines/>
         <w:shd w:val="clear" w:color="auto" w:fill="F2F2F2"/>
         <w:ind w:left="360"/>
@@ -23794,7 +24124,52 @@
           <w:rFonts w:ascii="Consolas" w:hAnsi="Consolas"/>
           <w:sz w:val="18"/>
         </w:rPr>
-        <w:t xml:space="preserve">  { "fromUser": "Diya", "toUser": "Bhavya", "amount": 150.0, "message": "Diya pays Bhavya Rs 150.00" } ]</w:t>
+        <w:t xml:space="preserve">  { "fromUser": "Diya", "toUser": "Chirag", "amount": 200,</w:t>
+      </w:r>
+    </w:p>
+    <w:p>
+      <w:pPr>
+        <w:keepNext/>
+        <w:keepLines/>
+        <w:shd w:val="clear" w:color="auto" w:fill="F2F2F2"/>
+        <w:ind w:left="360"/>
+      </w:pPr>
+      <w:r>
+        <w:rPr>
+          <w:rFonts w:ascii="Consolas" w:hAnsi="Consolas"/>
+          <w:sz w:val="18"/>
+        </w:rPr>
+        <w:t xml:space="preserve">    "message": "Diya pays Chirag Rs 200.00" },</w:t>
+      </w:r>
+    </w:p>
+    <w:p>
+      <w:pPr>
+        <w:keepNext/>
+        <w:keepLines/>
+        <w:shd w:val="clear" w:color="auto" w:fill="F2F2F2"/>
+        <w:ind w:left="360"/>
+      </w:pPr>
+      <w:r>
+        <w:rPr>
+          <w:rFonts w:ascii="Consolas" w:hAnsi="Consolas"/>
+          <w:sz w:val="18"/>
+        </w:rPr>
+        <w:t xml:space="preserve">  { "fromUser": "Diya", "toUser": "Bhavya", "amount": 150,</w:t>
+      </w:r>
+    </w:p>
+    <w:p>
+      <w:pPr>
+        <w:keepNext/>
+        <w:keepLines/>
+        <w:shd w:val="clear" w:color="auto" w:fill="F2F2F2"/>
+        <w:ind w:left="360"/>
+      </w:pPr>
+      <w:r>
+        <w:rPr>
+          <w:rFonts w:ascii="Consolas" w:hAnsi="Consolas"/>
+          <w:sz w:val="18"/>
+        </w:rPr>
+        <w:t xml:space="preserve">    "message": "Diya pays Bhavya Rs 150.00" } ]</w:t>
       </w:r>
     </w:p>
     <w:p>
@@ -24003,12 +24378,11 @@
       </w:pPr>
       <w:r>
         <w:rPr>
-          <w:b/>
           <w:bCs/>
           <w:sz w:val="26"/>
           <w:szCs w:val="26"/>
         </w:rPr>
-        <w:t>Harsh Gupta, Assistant Professor</w:t>
+        <w:t>Suchi Sharma, Assistant Professor</w:t>
       </w:r>
     </w:p>
     <w:p>

</xml_diff>

<commit_message>
Add live Vercel link to README, docs and report
Co-Authored-By: Claude Opus 5.5 (1M context) <noreply@anthropic.com>
</commit_message>
<xml_diff>
--- a/docs/ExpenseSplitter_Project_Report.docx
+++ b/docs/ExpenseSplitter_Project_Report.docx
@@ -537,7 +537,7 @@
           <w:r>
             <w:fldChar w:fldCharType="separate"/>
           </w:r>
-          <w:hyperlink w:anchor="_Toc244083914" w:history="1">
+          <w:hyperlink w:anchor="_Toc244084198" w:history="1">
             <w:r>
               <w:rPr>
                 <w:rStyle w:val="Hyperlink"/>
@@ -561,7 +561,7 @@
               <w:rPr>
                 <w:noProof/>
               </w:rPr>
-              <w:instrText xml:space="preserve"> PAGEREF _Toc244083914 \h </w:instrText>
+              <w:instrText xml:space="preserve"> PAGEREF _Toc244084198 \h </w:instrText>
             </w:r>
             <w:r>
               <w:rPr>
@@ -601,7 +601,7 @@
               <w14:ligatures w14:val="standardContextual"/>
             </w:rPr>
           </w:pPr>
-          <w:hyperlink w:anchor="_Toc244083915" w:history="1">
+          <w:hyperlink w:anchor="_Toc244084199" w:history="1">
             <w:r>
               <w:rPr>
                 <w:rStyle w:val="Hyperlink"/>
@@ -625,7 +625,7 @@
               <w:rPr>
                 <w:noProof/>
               </w:rPr>
-              <w:instrText xml:space="preserve"> PAGEREF _Toc244083915 \h </w:instrText>
+              <w:instrText xml:space="preserve"> PAGEREF _Toc244084199 \h </w:instrText>
             </w:r>
             <w:r>
               <w:rPr>
@@ -665,7 +665,7 @@
               <w14:ligatures w14:val="standardContextual"/>
             </w:rPr>
           </w:pPr>
-          <w:hyperlink w:anchor="_Toc244083916" w:history="1">
+          <w:hyperlink w:anchor="_Toc244084200" w:history="1">
             <w:r>
               <w:rPr>
                 <w:rStyle w:val="Hyperlink"/>
@@ -689,7 +689,7 @@
               <w:rPr>
                 <w:noProof/>
               </w:rPr>
-              <w:instrText xml:space="preserve"> PAGEREF _Toc244083916 \h </w:instrText>
+              <w:instrText xml:space="preserve"> PAGEREF _Toc244084200 \h </w:instrText>
             </w:r>
             <w:r>
               <w:rPr>
@@ -730,7 +730,7 @@
               <w14:ligatures w14:val="standardContextual"/>
             </w:rPr>
           </w:pPr>
-          <w:hyperlink w:anchor="_Toc244083917" w:history="1">
+          <w:hyperlink w:anchor="_Toc244084201" w:history="1">
             <w:r>
               <w:rPr>
                 <w:rStyle w:val="Hyperlink"/>
@@ -770,7 +770,7 @@
               <w:rPr>
                 <w:noProof/>
               </w:rPr>
-              <w:instrText xml:space="preserve"> PAGEREF _Toc244083917 \h </w:instrText>
+              <w:instrText xml:space="preserve"> PAGEREF _Toc244084201 \h </w:instrText>
             </w:r>
             <w:r>
               <w:rPr>
@@ -811,7 +811,7 @@
               <w14:ligatures w14:val="standardContextual"/>
             </w:rPr>
           </w:pPr>
-          <w:hyperlink w:anchor="_Toc244083918" w:history="1">
+          <w:hyperlink w:anchor="_Toc244084202" w:history="1">
             <w:r>
               <w:rPr>
                 <w:rStyle w:val="Hyperlink"/>
@@ -851,7 +851,7 @@
               <w:rPr>
                 <w:noProof/>
               </w:rPr>
-              <w:instrText xml:space="preserve"> PAGEREF _Toc244083918 \h </w:instrText>
+              <w:instrText xml:space="preserve"> PAGEREF _Toc244084202 \h </w:instrText>
             </w:r>
             <w:r>
               <w:rPr>
@@ -892,7 +892,7 @@
               <w14:ligatures w14:val="standardContextual"/>
             </w:rPr>
           </w:pPr>
-          <w:hyperlink w:anchor="_Toc244083919" w:history="1">
+          <w:hyperlink w:anchor="_Toc244084203" w:history="1">
             <w:r>
               <w:rPr>
                 <w:rStyle w:val="Hyperlink"/>
@@ -932,7 +932,7 @@
               <w:rPr>
                 <w:noProof/>
               </w:rPr>
-              <w:instrText xml:space="preserve"> PAGEREF _Toc244083919 \h </w:instrText>
+              <w:instrText xml:space="preserve"> PAGEREF _Toc244084203 \h </w:instrText>
             </w:r>
             <w:r>
               <w:rPr>
@@ -973,7 +973,7 @@
               <w14:ligatures w14:val="standardContextual"/>
             </w:rPr>
           </w:pPr>
-          <w:hyperlink w:anchor="_Toc244083920" w:history="1">
+          <w:hyperlink w:anchor="_Toc244084204" w:history="1">
             <w:r>
               <w:rPr>
                 <w:rStyle w:val="Hyperlink"/>
@@ -1013,7 +1013,7 @@
               <w:rPr>
                 <w:noProof/>
               </w:rPr>
-              <w:instrText xml:space="preserve"> PAGEREF _Toc244083920 \h </w:instrText>
+              <w:instrText xml:space="preserve"> PAGEREF _Toc244084204 \h </w:instrText>
             </w:r>
             <w:r>
               <w:rPr>
@@ -1054,7 +1054,7 @@
               <w14:ligatures w14:val="standardContextual"/>
             </w:rPr>
           </w:pPr>
-          <w:hyperlink w:anchor="_Toc244083921" w:history="1">
+          <w:hyperlink w:anchor="_Toc244084205" w:history="1">
             <w:r>
               <w:rPr>
                 <w:rStyle w:val="Hyperlink"/>
@@ -1094,7 +1094,7 @@
               <w:rPr>
                 <w:noProof/>
               </w:rPr>
-              <w:instrText xml:space="preserve"> PAGEREF _Toc244083921 \h </w:instrText>
+              <w:instrText xml:space="preserve"> PAGEREF _Toc244084205 \h </w:instrText>
             </w:r>
             <w:r>
               <w:rPr>
@@ -1134,7 +1134,7 @@
               <w14:ligatures w14:val="standardContextual"/>
             </w:rPr>
           </w:pPr>
-          <w:hyperlink w:anchor="_Toc244083922" w:history="1">
+          <w:hyperlink w:anchor="_Toc244084206" w:history="1">
             <w:r>
               <w:rPr>
                 <w:rStyle w:val="Hyperlink"/>
@@ -1158,7 +1158,7 @@
               <w:rPr>
                 <w:noProof/>
               </w:rPr>
-              <w:instrText xml:space="preserve"> PAGEREF _Toc244083922 \h </w:instrText>
+              <w:instrText xml:space="preserve"> PAGEREF _Toc244084206 \h </w:instrText>
             </w:r>
             <w:r>
               <w:rPr>
@@ -1199,7 +1199,7 @@
               <w14:ligatures w14:val="standardContextual"/>
             </w:rPr>
           </w:pPr>
-          <w:hyperlink w:anchor="_Toc244083923" w:history="1">
+          <w:hyperlink w:anchor="_Toc244084207" w:history="1">
             <w:r>
               <w:rPr>
                 <w:rStyle w:val="Hyperlink"/>
@@ -1239,7 +1239,7 @@
               <w:rPr>
                 <w:noProof/>
               </w:rPr>
-              <w:instrText xml:space="preserve"> PAGEREF _Toc244083923 \h </w:instrText>
+              <w:instrText xml:space="preserve"> PAGEREF _Toc244084207 \h </w:instrText>
             </w:r>
             <w:r>
               <w:rPr>
@@ -1280,7 +1280,7 @@
               <w14:ligatures w14:val="standardContextual"/>
             </w:rPr>
           </w:pPr>
-          <w:hyperlink w:anchor="_Toc244083924" w:history="1">
+          <w:hyperlink w:anchor="_Toc244084208" w:history="1">
             <w:r>
               <w:rPr>
                 <w:rStyle w:val="Hyperlink"/>
@@ -1320,7 +1320,7 @@
               <w:rPr>
                 <w:noProof/>
               </w:rPr>
-              <w:instrText xml:space="preserve"> PAGEREF _Toc244083924 \h </w:instrText>
+              <w:instrText xml:space="preserve"> PAGEREF _Toc244084208 \h </w:instrText>
             </w:r>
             <w:r>
               <w:rPr>
@@ -1361,7 +1361,7 @@
               <w14:ligatures w14:val="standardContextual"/>
             </w:rPr>
           </w:pPr>
-          <w:hyperlink w:anchor="_Toc244083925" w:history="1">
+          <w:hyperlink w:anchor="_Toc244084209" w:history="1">
             <w:r>
               <w:rPr>
                 <w:rStyle w:val="Hyperlink"/>
@@ -1401,7 +1401,7 @@
               <w:rPr>
                 <w:noProof/>
               </w:rPr>
-              <w:instrText xml:space="preserve"> PAGEREF _Toc244083925 \h </w:instrText>
+              <w:instrText xml:space="preserve"> PAGEREF _Toc244084209 \h </w:instrText>
             </w:r>
             <w:r>
               <w:rPr>
@@ -1442,7 +1442,7 @@
               <w14:ligatures w14:val="standardContextual"/>
             </w:rPr>
           </w:pPr>
-          <w:hyperlink w:anchor="_Toc244083926" w:history="1">
+          <w:hyperlink w:anchor="_Toc244084210" w:history="1">
             <w:r>
               <w:rPr>
                 <w:rStyle w:val="Hyperlink"/>
@@ -1482,7 +1482,7 @@
               <w:rPr>
                 <w:noProof/>
               </w:rPr>
-              <w:instrText xml:space="preserve"> PAGEREF _Toc244083926 \h </w:instrText>
+              <w:instrText xml:space="preserve"> PAGEREF _Toc244084210 \h </w:instrText>
             </w:r>
             <w:r>
               <w:rPr>
@@ -1523,7 +1523,7 @@
               <w14:ligatures w14:val="standardContextual"/>
             </w:rPr>
           </w:pPr>
-          <w:hyperlink w:anchor="_Toc244083927" w:history="1">
+          <w:hyperlink w:anchor="_Toc244084211" w:history="1">
             <w:r>
               <w:rPr>
                 <w:rStyle w:val="Hyperlink"/>
@@ -1563,7 +1563,7 @@
               <w:rPr>
                 <w:noProof/>
               </w:rPr>
-              <w:instrText xml:space="preserve"> PAGEREF _Toc244083927 \h </w:instrText>
+              <w:instrText xml:space="preserve"> PAGEREF _Toc244084211 \h </w:instrText>
             </w:r>
             <w:r>
               <w:rPr>
@@ -1604,7 +1604,7 @@
               <w14:ligatures w14:val="standardContextual"/>
             </w:rPr>
           </w:pPr>
-          <w:hyperlink w:anchor="_Toc244083928" w:history="1">
+          <w:hyperlink w:anchor="_Toc244084212" w:history="1">
             <w:r>
               <w:rPr>
                 <w:rStyle w:val="Hyperlink"/>
@@ -1644,7 +1644,7 @@
               <w:rPr>
                 <w:noProof/>
               </w:rPr>
-              <w:instrText xml:space="preserve"> PAGEREF _Toc244083928 \h </w:instrText>
+              <w:instrText xml:space="preserve"> PAGEREF _Toc244084212 \h </w:instrText>
             </w:r>
             <w:r>
               <w:rPr>
@@ -1684,7 +1684,7 @@
               <w14:ligatures w14:val="standardContextual"/>
             </w:rPr>
           </w:pPr>
-          <w:hyperlink w:anchor="_Toc244083929" w:history="1">
+          <w:hyperlink w:anchor="_Toc244084213" w:history="1">
             <w:r>
               <w:rPr>
                 <w:rStyle w:val="Hyperlink"/>
@@ -1708,7 +1708,7 @@
               <w:rPr>
                 <w:noProof/>
               </w:rPr>
-              <w:instrText xml:space="preserve"> PAGEREF _Toc244083929 \h </w:instrText>
+              <w:instrText xml:space="preserve"> PAGEREF _Toc244084213 \h </w:instrText>
             </w:r>
             <w:r>
               <w:rPr>
@@ -1749,7 +1749,7 @@
               <w14:ligatures w14:val="standardContextual"/>
             </w:rPr>
           </w:pPr>
-          <w:hyperlink w:anchor="_Toc244083930" w:history="1">
+          <w:hyperlink w:anchor="_Toc244084214" w:history="1">
             <w:r>
               <w:rPr>
                 <w:rStyle w:val="Hyperlink"/>
@@ -1789,7 +1789,7 @@
               <w:rPr>
                 <w:noProof/>
               </w:rPr>
-              <w:instrText xml:space="preserve"> PAGEREF _Toc244083930 \h </w:instrText>
+              <w:instrText xml:space="preserve"> PAGEREF _Toc244084214 \h </w:instrText>
             </w:r>
             <w:r>
               <w:rPr>
@@ -1830,7 +1830,7 @@
               <w14:ligatures w14:val="standardContextual"/>
             </w:rPr>
           </w:pPr>
-          <w:hyperlink w:anchor="_Toc244083931" w:history="1">
+          <w:hyperlink w:anchor="_Toc244084215" w:history="1">
             <w:r>
               <w:rPr>
                 <w:rStyle w:val="Hyperlink"/>
@@ -1870,7 +1870,7 @@
               <w:rPr>
                 <w:noProof/>
               </w:rPr>
-              <w:instrText xml:space="preserve"> PAGEREF _Toc244083931 \h </w:instrText>
+              <w:instrText xml:space="preserve"> PAGEREF _Toc244084215 \h </w:instrText>
             </w:r>
             <w:r>
               <w:rPr>
@@ -1911,7 +1911,7 @@
               <w14:ligatures w14:val="standardContextual"/>
             </w:rPr>
           </w:pPr>
-          <w:hyperlink w:anchor="_Toc244083932" w:history="1">
+          <w:hyperlink w:anchor="_Toc244084216" w:history="1">
             <w:r>
               <w:rPr>
                 <w:rStyle w:val="Hyperlink"/>
@@ -1951,7 +1951,7 @@
               <w:rPr>
                 <w:noProof/>
               </w:rPr>
-              <w:instrText xml:space="preserve"> PAGEREF _Toc244083932 \h </w:instrText>
+              <w:instrText xml:space="preserve"> PAGEREF _Toc244084216 \h </w:instrText>
             </w:r>
             <w:r>
               <w:rPr>
@@ -1992,7 +1992,7 @@
               <w14:ligatures w14:val="standardContextual"/>
             </w:rPr>
           </w:pPr>
-          <w:hyperlink w:anchor="_Toc244083933" w:history="1">
+          <w:hyperlink w:anchor="_Toc244084217" w:history="1">
             <w:r>
               <w:rPr>
                 <w:rStyle w:val="Hyperlink"/>
@@ -2032,7 +2032,7 @@
               <w:rPr>
                 <w:noProof/>
               </w:rPr>
-              <w:instrText xml:space="preserve"> PAGEREF _Toc244083933 \h </w:instrText>
+              <w:instrText xml:space="preserve"> PAGEREF _Toc244084217 \h </w:instrText>
             </w:r>
             <w:r>
               <w:rPr>
@@ -2073,7 +2073,7 @@
               <w14:ligatures w14:val="standardContextual"/>
             </w:rPr>
           </w:pPr>
-          <w:hyperlink w:anchor="_Toc244083934" w:history="1">
+          <w:hyperlink w:anchor="_Toc244084218" w:history="1">
             <w:r>
               <w:rPr>
                 <w:rStyle w:val="Hyperlink"/>
@@ -2113,7 +2113,7 @@
               <w:rPr>
                 <w:noProof/>
               </w:rPr>
-              <w:instrText xml:space="preserve"> PAGEREF _Toc244083934 \h </w:instrText>
+              <w:instrText xml:space="preserve"> PAGEREF _Toc244084218 \h </w:instrText>
             </w:r>
             <w:r>
               <w:rPr>
@@ -2154,7 +2154,7 @@
               <w14:ligatures w14:val="standardContextual"/>
             </w:rPr>
           </w:pPr>
-          <w:hyperlink w:anchor="_Toc244083935" w:history="1">
+          <w:hyperlink w:anchor="_Toc244084219" w:history="1">
             <w:r>
               <w:rPr>
                 <w:rStyle w:val="Hyperlink"/>
@@ -2194,7 +2194,7 @@
               <w:rPr>
                 <w:noProof/>
               </w:rPr>
-              <w:instrText xml:space="preserve"> PAGEREF _Toc244083935 \h </w:instrText>
+              <w:instrText xml:space="preserve"> PAGEREF _Toc244084219 \h </w:instrText>
             </w:r>
             <w:r>
               <w:rPr>
@@ -2234,7 +2234,7 @@
               <w14:ligatures w14:val="standardContextual"/>
             </w:rPr>
           </w:pPr>
-          <w:hyperlink w:anchor="_Toc244083936" w:history="1">
+          <w:hyperlink w:anchor="_Toc244084220" w:history="1">
             <w:r>
               <w:rPr>
                 <w:rStyle w:val="Hyperlink"/>
@@ -2258,7 +2258,7 @@
               <w:rPr>
                 <w:noProof/>
               </w:rPr>
-              <w:instrText xml:space="preserve"> PAGEREF _Toc244083936 \h </w:instrText>
+              <w:instrText xml:space="preserve"> PAGEREF _Toc244084220 \h </w:instrText>
             </w:r>
             <w:r>
               <w:rPr>
@@ -2299,7 +2299,7 @@
               <w14:ligatures w14:val="standardContextual"/>
             </w:rPr>
           </w:pPr>
-          <w:hyperlink w:anchor="_Toc244083937" w:history="1">
+          <w:hyperlink w:anchor="_Toc244084221" w:history="1">
             <w:r>
               <w:rPr>
                 <w:rStyle w:val="Hyperlink"/>
@@ -2339,7 +2339,7 @@
               <w:rPr>
                 <w:noProof/>
               </w:rPr>
-              <w:instrText xml:space="preserve"> PAGEREF _Toc244083937 \h </w:instrText>
+              <w:instrText xml:space="preserve"> PAGEREF _Toc244084221 \h </w:instrText>
             </w:r>
             <w:r>
               <w:rPr>
@@ -2379,7 +2379,7 @@
               <w14:ligatures w14:val="standardContextual"/>
             </w:rPr>
           </w:pPr>
-          <w:hyperlink w:anchor="_Toc244083938" w:history="1">
+          <w:hyperlink w:anchor="_Toc244084222" w:history="1">
             <w:r>
               <w:rPr>
                 <w:rStyle w:val="Hyperlink"/>
@@ -2403,7 +2403,7 @@
               <w:rPr>
                 <w:noProof/>
               </w:rPr>
-              <w:instrText xml:space="preserve"> PAGEREF _Toc244083938 \h </w:instrText>
+              <w:instrText xml:space="preserve"> PAGEREF _Toc244084222 \h </w:instrText>
             </w:r>
             <w:r>
               <w:rPr>
@@ -2444,7 +2444,7 @@
               <w14:ligatures w14:val="standardContextual"/>
             </w:rPr>
           </w:pPr>
-          <w:hyperlink w:anchor="_Toc244083939" w:history="1">
+          <w:hyperlink w:anchor="_Toc244084223" w:history="1">
             <w:r>
               <w:rPr>
                 <w:rStyle w:val="Hyperlink"/>
@@ -2484,7 +2484,7 @@
               <w:rPr>
                 <w:noProof/>
               </w:rPr>
-              <w:instrText xml:space="preserve"> PAGEREF _Toc244083939 \h </w:instrText>
+              <w:instrText xml:space="preserve"> PAGEREF _Toc244084223 \h </w:instrText>
             </w:r>
             <w:r>
               <w:rPr>
@@ -2525,7 +2525,7 @@
               <w14:ligatures w14:val="standardContextual"/>
             </w:rPr>
           </w:pPr>
-          <w:hyperlink w:anchor="_Toc244083940" w:history="1">
+          <w:hyperlink w:anchor="_Toc244084224" w:history="1">
             <w:r>
               <w:rPr>
                 <w:rStyle w:val="Hyperlink"/>
@@ -2565,7 +2565,7 @@
               <w:rPr>
                 <w:noProof/>
               </w:rPr>
-              <w:instrText xml:space="preserve"> PAGEREF _Toc244083940 \h </w:instrText>
+              <w:instrText xml:space="preserve"> PAGEREF _Toc244084224 \h </w:instrText>
             </w:r>
             <w:r>
               <w:rPr>
@@ -2605,7 +2605,7 @@
               <w14:ligatures w14:val="standardContextual"/>
             </w:rPr>
           </w:pPr>
-          <w:hyperlink w:anchor="_Toc244083941" w:history="1">
+          <w:hyperlink w:anchor="_Toc244084225" w:history="1">
             <w:r>
               <w:rPr>
                 <w:rStyle w:val="Hyperlink"/>
@@ -2629,7 +2629,7 @@
               <w:rPr>
                 <w:noProof/>
               </w:rPr>
-              <w:instrText xml:space="preserve"> PAGEREF _Toc244083941 \h </w:instrText>
+              <w:instrText xml:space="preserve"> PAGEREF _Toc244084225 \h </w:instrText>
             </w:r>
             <w:r>
               <w:rPr>
@@ -2669,7 +2669,7 @@
               <w14:ligatures w14:val="standardContextual"/>
             </w:rPr>
           </w:pPr>
-          <w:hyperlink w:anchor="_Toc244083942" w:history="1">
+          <w:hyperlink w:anchor="_Toc244084226" w:history="1">
             <w:r>
               <w:rPr>
                 <w:rStyle w:val="Hyperlink"/>
@@ -2693,7 +2693,7 @@
               <w:rPr>
                 <w:noProof/>
               </w:rPr>
-              <w:instrText xml:space="preserve"> PAGEREF _Toc244083942 \h </w:instrText>
+              <w:instrText xml:space="preserve"> PAGEREF _Toc244084226 \h </w:instrText>
             </w:r>
             <w:r>
               <w:rPr>
@@ -2734,7 +2734,7 @@
               <w14:ligatures w14:val="standardContextual"/>
             </w:rPr>
           </w:pPr>
-          <w:hyperlink w:anchor="_Toc244083943" w:history="1">
+          <w:hyperlink w:anchor="_Toc244084227" w:history="1">
             <w:r>
               <w:rPr>
                 <w:rStyle w:val="Hyperlink"/>
@@ -2774,7 +2774,7 @@
               <w:rPr>
                 <w:noProof/>
               </w:rPr>
-              <w:instrText xml:space="preserve"> PAGEREF _Toc244083943 \h </w:instrText>
+              <w:instrText xml:space="preserve"> PAGEREF _Toc244084227 \h </w:instrText>
             </w:r>
             <w:r>
               <w:rPr>
@@ -2815,7 +2815,7 @@
               <w14:ligatures w14:val="standardContextual"/>
             </w:rPr>
           </w:pPr>
-          <w:hyperlink w:anchor="_Toc244083944" w:history="1">
+          <w:hyperlink w:anchor="_Toc244084228" w:history="1">
             <w:r>
               <w:rPr>
                 <w:rStyle w:val="Hyperlink"/>
@@ -2855,7 +2855,7 @@
               <w:rPr>
                 <w:noProof/>
               </w:rPr>
-              <w:instrText xml:space="preserve"> PAGEREF _Toc244083944 \h </w:instrText>
+              <w:instrText xml:space="preserve"> PAGEREF _Toc244084228 \h </w:instrText>
             </w:r>
             <w:r>
               <w:rPr>
@@ -2896,7 +2896,7 @@
               <w14:ligatures w14:val="standardContextual"/>
             </w:rPr>
           </w:pPr>
-          <w:hyperlink w:anchor="_Toc244083945" w:history="1">
+          <w:hyperlink w:anchor="_Toc244084229" w:history="1">
             <w:r>
               <w:rPr>
                 <w:rStyle w:val="Hyperlink"/>
@@ -2936,7 +2936,7 @@
               <w:rPr>
                 <w:noProof/>
               </w:rPr>
-              <w:instrText xml:space="preserve"> PAGEREF _Toc244083945 \h </w:instrText>
+              <w:instrText xml:space="preserve"> PAGEREF _Toc244084229 \h </w:instrText>
             </w:r>
             <w:r>
               <w:rPr>
@@ -2977,7 +2977,7 @@
               <w14:ligatures w14:val="standardContextual"/>
             </w:rPr>
           </w:pPr>
-          <w:hyperlink w:anchor="_Toc244083946" w:history="1">
+          <w:hyperlink w:anchor="_Toc244084230" w:history="1">
             <w:r>
               <w:rPr>
                 <w:rStyle w:val="Hyperlink"/>
@@ -3017,7 +3017,7 @@
               <w:rPr>
                 <w:noProof/>
               </w:rPr>
-              <w:instrText xml:space="preserve"> PAGEREF _Toc244083946 \h </w:instrText>
+              <w:instrText xml:space="preserve"> PAGEREF _Toc244084230 \h </w:instrText>
             </w:r>
             <w:r>
               <w:rPr>
@@ -3056,7 +3056,7 @@
         <w:pStyle w:val="Heading1"/>
         <w:pageBreakBefore/>
       </w:pPr>
-      <w:bookmarkStart w:id="0" w:name="_Toc244083914"/>
+      <w:bookmarkStart w:id="0" w:name="_Toc244084198"/>
       <w:r>
         <w:t>List of Figures</w:t>
       </w:r>
@@ -3091,7 +3091,7 @@
           <w:r>
             <w:fldChar w:fldCharType="separate"/>
           </w:r>
-          <w:hyperlink w:anchor="_Toc244083947" w:history="1">
+          <w:hyperlink w:anchor="_Toc244084231" w:history="1">
             <w:r>
               <w:rPr>
                 <w:rStyle w:val="Hyperlink"/>
@@ -3115,7 +3115,7 @@
               <w:rPr>
                 <w:noProof/>
               </w:rPr>
-              <w:instrText xml:space="preserve"> PAGEREF _Toc244083947 \h </w:instrText>
+              <w:instrText xml:space="preserve"> PAGEREF _Toc244084231 \h </w:instrText>
             </w:r>
             <w:r>
               <w:rPr>
@@ -3155,7 +3155,7 @@
               <w14:ligatures w14:val="standardContextual"/>
             </w:rPr>
           </w:pPr>
-          <w:hyperlink w:anchor="_Toc244083948" w:history="1">
+          <w:hyperlink w:anchor="_Toc244084232" w:history="1">
             <w:r>
               <w:rPr>
                 <w:rStyle w:val="Hyperlink"/>
@@ -3179,7 +3179,7 @@
               <w:rPr>
                 <w:noProof/>
               </w:rPr>
-              <w:instrText xml:space="preserve"> PAGEREF _Toc244083948 \h </w:instrText>
+              <w:instrText xml:space="preserve"> PAGEREF _Toc244084232 \h </w:instrText>
             </w:r>
             <w:r>
               <w:rPr>
@@ -3219,7 +3219,7 @@
               <w14:ligatures w14:val="standardContextual"/>
             </w:rPr>
           </w:pPr>
-          <w:hyperlink w:anchor="_Toc244083949" w:history="1">
+          <w:hyperlink w:anchor="_Toc244084233" w:history="1">
             <w:r>
               <w:rPr>
                 <w:rStyle w:val="Hyperlink"/>
@@ -3243,7 +3243,7 @@
               <w:rPr>
                 <w:noProof/>
               </w:rPr>
-              <w:instrText xml:space="preserve"> PAGEREF _Toc244083949 \h </w:instrText>
+              <w:instrText xml:space="preserve"> PAGEREF _Toc244084233 \h </w:instrText>
             </w:r>
             <w:r>
               <w:rPr>
@@ -3283,7 +3283,7 @@
               <w14:ligatures w14:val="standardContextual"/>
             </w:rPr>
           </w:pPr>
-          <w:hyperlink w:anchor="_Toc244083950" w:history="1">
+          <w:hyperlink w:anchor="_Toc244084234" w:history="1">
             <w:r>
               <w:rPr>
                 <w:rStyle w:val="Hyperlink"/>
@@ -3307,7 +3307,7 @@
               <w:rPr>
                 <w:noProof/>
               </w:rPr>
-              <w:instrText xml:space="preserve"> PAGEREF _Toc244083950 \h </w:instrText>
+              <w:instrText xml:space="preserve"> PAGEREF _Toc244084234 \h </w:instrText>
             </w:r>
             <w:r>
               <w:rPr>
@@ -3347,7 +3347,7 @@
               <w14:ligatures w14:val="standardContextual"/>
             </w:rPr>
           </w:pPr>
-          <w:hyperlink w:anchor="_Toc244083951" w:history="1">
+          <w:hyperlink w:anchor="_Toc244084235" w:history="1">
             <w:r>
               <w:rPr>
                 <w:rStyle w:val="Hyperlink"/>
@@ -3371,7 +3371,7 @@
               <w:rPr>
                 <w:noProof/>
               </w:rPr>
-              <w:instrText xml:space="preserve"> PAGEREF _Toc244083951 \h </w:instrText>
+              <w:instrText xml:space="preserve"> PAGEREF _Toc244084235 \h </w:instrText>
             </w:r>
             <w:r>
               <w:rPr>
@@ -3411,7 +3411,7 @@
               <w14:ligatures w14:val="standardContextual"/>
             </w:rPr>
           </w:pPr>
-          <w:hyperlink w:anchor="_Toc244083952" w:history="1">
+          <w:hyperlink w:anchor="_Toc244084236" w:history="1">
             <w:r>
               <w:rPr>
                 <w:rStyle w:val="Hyperlink"/>
@@ -3435,7 +3435,7 @@
               <w:rPr>
                 <w:noProof/>
               </w:rPr>
-              <w:instrText xml:space="preserve"> PAGEREF _Toc244083952 \h </w:instrText>
+              <w:instrText xml:space="preserve"> PAGEREF _Toc244084236 \h </w:instrText>
             </w:r>
             <w:r>
               <w:rPr>
@@ -3475,7 +3475,7 @@
               <w14:ligatures w14:val="standardContextual"/>
             </w:rPr>
           </w:pPr>
-          <w:hyperlink w:anchor="_Toc244083953" w:history="1">
+          <w:hyperlink w:anchor="_Toc244084237" w:history="1">
             <w:r>
               <w:rPr>
                 <w:rStyle w:val="Hyperlink"/>
@@ -3499,7 +3499,7 @@
               <w:rPr>
                 <w:noProof/>
               </w:rPr>
-              <w:instrText xml:space="preserve"> PAGEREF _Toc244083953 \h </w:instrText>
+              <w:instrText xml:space="preserve"> PAGEREF _Toc244084237 \h </w:instrText>
             </w:r>
             <w:r>
               <w:rPr>
@@ -3539,7 +3539,7 @@
               <w14:ligatures w14:val="standardContextual"/>
             </w:rPr>
           </w:pPr>
-          <w:hyperlink w:anchor="_Toc244083954" w:history="1">
+          <w:hyperlink w:anchor="_Toc244084238" w:history="1">
             <w:r>
               <w:rPr>
                 <w:rStyle w:val="Hyperlink"/>
@@ -3563,7 +3563,7 @@
               <w:rPr>
                 <w:noProof/>
               </w:rPr>
-              <w:instrText xml:space="preserve"> PAGEREF _Toc244083954 \h </w:instrText>
+              <w:instrText xml:space="preserve"> PAGEREF _Toc244084238 \h </w:instrText>
             </w:r>
             <w:r>
               <w:rPr>
@@ -3603,7 +3603,7 @@
               <w14:ligatures w14:val="standardContextual"/>
             </w:rPr>
           </w:pPr>
-          <w:hyperlink w:anchor="_Toc244083955" w:history="1">
+          <w:hyperlink w:anchor="_Toc244084239" w:history="1">
             <w:r>
               <w:rPr>
                 <w:rStyle w:val="Hyperlink"/>
@@ -3627,7 +3627,7 @@
               <w:rPr>
                 <w:noProof/>
               </w:rPr>
-              <w:instrText xml:space="preserve"> PAGEREF _Toc244083955 \h </w:instrText>
+              <w:instrText xml:space="preserve"> PAGEREF _Toc244084239 \h </w:instrText>
             </w:r>
             <w:r>
               <w:rPr>
@@ -3667,7 +3667,7 @@
               <w14:ligatures w14:val="standardContextual"/>
             </w:rPr>
           </w:pPr>
-          <w:hyperlink w:anchor="_Toc244083956" w:history="1">
+          <w:hyperlink w:anchor="_Toc244084240" w:history="1">
             <w:r>
               <w:rPr>
                 <w:rStyle w:val="Hyperlink"/>
@@ -3691,7 +3691,7 @@
               <w:rPr>
                 <w:noProof/>
               </w:rPr>
-              <w:instrText xml:space="preserve"> PAGEREF _Toc244083956 \h </w:instrText>
+              <w:instrText xml:space="preserve"> PAGEREF _Toc244084240 \h </w:instrText>
             </w:r>
             <w:r>
               <w:rPr>
@@ -3731,7 +3731,7 @@
               <w14:ligatures w14:val="standardContextual"/>
             </w:rPr>
           </w:pPr>
-          <w:hyperlink w:anchor="_Toc244083957" w:history="1">
+          <w:hyperlink w:anchor="_Toc244084241" w:history="1">
             <w:r>
               <w:rPr>
                 <w:rStyle w:val="Hyperlink"/>
@@ -3755,7 +3755,7 @@
               <w:rPr>
                 <w:noProof/>
               </w:rPr>
-              <w:instrText xml:space="preserve"> PAGEREF _Toc244083957 \h </w:instrText>
+              <w:instrText xml:space="preserve"> PAGEREF _Toc244084241 \h </w:instrText>
             </w:r>
             <w:r>
               <w:rPr>
@@ -3795,7 +3795,7 @@
               <w14:ligatures w14:val="standardContextual"/>
             </w:rPr>
           </w:pPr>
-          <w:hyperlink w:anchor="_Toc244083958" w:history="1">
+          <w:hyperlink w:anchor="_Toc244084242" w:history="1">
             <w:r>
               <w:rPr>
                 <w:rStyle w:val="Hyperlink"/>
@@ -3819,7 +3819,7 @@
               <w:rPr>
                 <w:noProof/>
               </w:rPr>
-              <w:instrText xml:space="preserve"> PAGEREF _Toc244083958 \h </w:instrText>
+              <w:instrText xml:space="preserve"> PAGEREF _Toc244084242 \h </w:instrText>
             </w:r>
             <w:r>
               <w:rPr>
@@ -3859,7 +3859,7 @@
               <w14:ligatures w14:val="standardContextual"/>
             </w:rPr>
           </w:pPr>
-          <w:hyperlink w:anchor="_Toc244083959" w:history="1">
+          <w:hyperlink w:anchor="_Toc244084243" w:history="1">
             <w:r>
               <w:rPr>
                 <w:rStyle w:val="Hyperlink"/>
@@ -3883,7 +3883,7 @@
               <w:rPr>
                 <w:noProof/>
               </w:rPr>
-              <w:instrText xml:space="preserve"> PAGEREF _Toc244083959 \h </w:instrText>
+              <w:instrText xml:space="preserve"> PAGEREF _Toc244084243 \h </w:instrText>
             </w:r>
             <w:r>
               <w:rPr>
@@ -3923,7 +3923,7 @@
               <w14:ligatures w14:val="standardContextual"/>
             </w:rPr>
           </w:pPr>
-          <w:hyperlink w:anchor="_Toc244083960" w:history="1">
+          <w:hyperlink w:anchor="_Toc244084244" w:history="1">
             <w:r>
               <w:rPr>
                 <w:rStyle w:val="Hyperlink"/>
@@ -3947,7 +3947,7 @@
               <w:rPr>
                 <w:noProof/>
               </w:rPr>
-              <w:instrText xml:space="preserve"> PAGEREF _Toc244083960 \h </w:instrText>
+              <w:instrText xml:space="preserve"> PAGEREF _Toc244084244 \h </w:instrText>
             </w:r>
             <w:r>
               <w:rPr>
@@ -3987,7 +3987,7 @@
               <w14:ligatures w14:val="standardContextual"/>
             </w:rPr>
           </w:pPr>
-          <w:hyperlink w:anchor="_Toc244083961" w:history="1">
+          <w:hyperlink w:anchor="_Toc244084245" w:history="1">
             <w:r>
               <w:rPr>
                 <w:rStyle w:val="Hyperlink"/>
@@ -4011,7 +4011,7 @@
               <w:rPr>
                 <w:noProof/>
               </w:rPr>
-              <w:instrText xml:space="preserve"> PAGEREF _Toc244083961 \h </w:instrText>
+              <w:instrText xml:space="preserve"> PAGEREF _Toc244084245 \h </w:instrText>
             </w:r>
             <w:r>
               <w:rPr>
@@ -4050,7 +4050,7 @@
         <w:pStyle w:val="Heading1"/>
         <w:spacing w:before="480"/>
       </w:pPr>
-      <w:bookmarkStart w:id="1" w:name="_Toc244083915"/>
+      <w:bookmarkStart w:id="1" w:name="_Toc244084199"/>
       <w:r>
         <w:t>List of Tables</w:t>
       </w:r>
@@ -4085,7 +4085,7 @@
           <w:r>
             <w:fldChar w:fldCharType="separate"/>
           </w:r>
-          <w:hyperlink w:anchor="_Toc244083962" w:history="1">
+          <w:hyperlink w:anchor="_Toc244084246" w:history="1">
             <w:r>
               <w:rPr>
                 <w:rStyle w:val="Hyperlink"/>
@@ -4109,7 +4109,7 @@
               <w:rPr>
                 <w:noProof/>
               </w:rPr>
-              <w:instrText xml:space="preserve"> PAGEREF _Toc244083962 \h </w:instrText>
+              <w:instrText xml:space="preserve"> PAGEREF _Toc244084246 \h </w:instrText>
             </w:r>
             <w:r>
               <w:rPr>
@@ -4149,7 +4149,7 @@
               <w14:ligatures w14:val="standardContextual"/>
             </w:rPr>
           </w:pPr>
-          <w:hyperlink w:anchor="_Toc244083963" w:history="1">
+          <w:hyperlink w:anchor="_Toc244084247" w:history="1">
             <w:r>
               <w:rPr>
                 <w:rStyle w:val="Hyperlink"/>
@@ -4173,7 +4173,7 @@
               <w:rPr>
                 <w:noProof/>
               </w:rPr>
-              <w:instrText xml:space="preserve"> PAGEREF _Toc244083963 \h </w:instrText>
+              <w:instrText xml:space="preserve"> PAGEREF _Toc244084247 \h </w:instrText>
             </w:r>
             <w:r>
               <w:rPr>
@@ -4213,7 +4213,7 @@
               <w14:ligatures w14:val="standardContextual"/>
             </w:rPr>
           </w:pPr>
-          <w:hyperlink w:anchor="_Toc244083964" w:history="1">
+          <w:hyperlink w:anchor="_Toc244084248" w:history="1">
             <w:r>
               <w:rPr>
                 <w:rStyle w:val="Hyperlink"/>
@@ -4237,7 +4237,7 @@
               <w:rPr>
                 <w:noProof/>
               </w:rPr>
-              <w:instrText xml:space="preserve"> PAGEREF _Toc244083964 \h </w:instrText>
+              <w:instrText xml:space="preserve"> PAGEREF _Toc244084248 \h </w:instrText>
             </w:r>
             <w:r>
               <w:rPr>
@@ -4277,7 +4277,7 @@
               <w14:ligatures w14:val="standardContextual"/>
             </w:rPr>
           </w:pPr>
-          <w:hyperlink w:anchor="_Toc244083965" w:history="1">
+          <w:hyperlink w:anchor="_Toc244084249" w:history="1">
             <w:r>
               <w:rPr>
                 <w:rStyle w:val="Hyperlink"/>
@@ -4301,7 +4301,7 @@
               <w:rPr>
                 <w:noProof/>
               </w:rPr>
-              <w:instrText xml:space="preserve"> PAGEREF _Toc244083965 \h </w:instrText>
+              <w:instrText xml:space="preserve"> PAGEREF _Toc244084249 \h </w:instrText>
             </w:r>
             <w:r>
               <w:rPr>
@@ -4341,7 +4341,7 @@
               <w14:ligatures w14:val="standardContextual"/>
             </w:rPr>
           </w:pPr>
-          <w:hyperlink w:anchor="_Toc244083966" w:history="1">
+          <w:hyperlink w:anchor="_Toc244084250" w:history="1">
             <w:r>
               <w:rPr>
                 <w:rStyle w:val="Hyperlink"/>
@@ -4365,7 +4365,7 @@
               <w:rPr>
                 <w:noProof/>
               </w:rPr>
-              <w:instrText xml:space="preserve"> PAGEREF _Toc244083966 \h </w:instrText>
+              <w:instrText xml:space="preserve"> PAGEREF _Toc244084250 \h </w:instrText>
             </w:r>
             <w:r>
               <w:rPr>
@@ -4405,7 +4405,7 @@
               <w14:ligatures w14:val="standardContextual"/>
             </w:rPr>
           </w:pPr>
-          <w:hyperlink w:anchor="_Toc244083967" w:history="1">
+          <w:hyperlink w:anchor="_Toc244084251" w:history="1">
             <w:r>
               <w:rPr>
                 <w:rStyle w:val="Hyperlink"/>
@@ -4429,7 +4429,7 @@
               <w:rPr>
                 <w:noProof/>
               </w:rPr>
-              <w:instrText xml:space="preserve"> PAGEREF _Toc244083967 \h </w:instrText>
+              <w:instrText xml:space="preserve"> PAGEREF _Toc244084251 \h </w:instrText>
             </w:r>
             <w:r>
               <w:rPr>
@@ -4469,7 +4469,7 @@
               <w14:ligatures w14:val="standardContextual"/>
             </w:rPr>
           </w:pPr>
-          <w:hyperlink w:anchor="_Toc244083968" w:history="1">
+          <w:hyperlink w:anchor="_Toc244084252" w:history="1">
             <w:r>
               <w:rPr>
                 <w:rStyle w:val="Hyperlink"/>
@@ -4493,7 +4493,7 @@
               <w:rPr>
                 <w:noProof/>
               </w:rPr>
-              <w:instrText xml:space="preserve"> PAGEREF _Toc244083968 \h </w:instrText>
+              <w:instrText xml:space="preserve"> PAGEREF _Toc244084252 \h </w:instrText>
             </w:r>
             <w:r>
               <w:rPr>
@@ -4533,7 +4533,7 @@
               <w14:ligatures w14:val="standardContextual"/>
             </w:rPr>
           </w:pPr>
-          <w:hyperlink w:anchor="_Toc244083969" w:history="1">
+          <w:hyperlink w:anchor="_Toc244084253" w:history="1">
             <w:r>
               <w:rPr>
                 <w:rStyle w:val="Hyperlink"/>
@@ -4557,7 +4557,7 @@
               <w:rPr>
                 <w:noProof/>
               </w:rPr>
-              <w:instrText xml:space="preserve"> PAGEREF _Toc244083969 \h </w:instrText>
+              <w:instrText xml:space="preserve"> PAGEREF _Toc244084253 \h </w:instrText>
             </w:r>
             <w:r>
               <w:rPr>
@@ -4597,7 +4597,7 @@
               <w14:ligatures w14:val="standardContextual"/>
             </w:rPr>
           </w:pPr>
-          <w:hyperlink w:anchor="_Toc244083970" w:history="1">
+          <w:hyperlink w:anchor="_Toc244084254" w:history="1">
             <w:r>
               <w:rPr>
                 <w:rStyle w:val="Hyperlink"/>
@@ -4621,7 +4621,7 @@
               <w:rPr>
                 <w:noProof/>
               </w:rPr>
-              <w:instrText xml:space="preserve"> PAGEREF _Toc244083970 \h </w:instrText>
+              <w:instrText xml:space="preserve"> PAGEREF _Toc244084254 \h </w:instrText>
             </w:r>
             <w:r>
               <w:rPr>
@@ -4661,7 +4661,7 @@
               <w14:ligatures w14:val="standardContextual"/>
             </w:rPr>
           </w:pPr>
-          <w:hyperlink w:anchor="_Toc244083971" w:history="1">
+          <w:hyperlink w:anchor="_Toc244084255" w:history="1">
             <w:r>
               <w:rPr>
                 <w:rStyle w:val="Hyperlink"/>
@@ -4685,7 +4685,7 @@
               <w:rPr>
                 <w:noProof/>
               </w:rPr>
-              <w:instrText xml:space="preserve"> PAGEREF _Toc244083971 \h </w:instrText>
+              <w:instrText xml:space="preserve"> PAGEREF _Toc244084255 \h </w:instrText>
             </w:r>
             <w:r>
               <w:rPr>
@@ -4725,7 +4725,7 @@
               <w14:ligatures w14:val="standardContextual"/>
             </w:rPr>
           </w:pPr>
-          <w:hyperlink w:anchor="_Toc244083972" w:history="1">
+          <w:hyperlink w:anchor="_Toc244084256" w:history="1">
             <w:r>
               <w:rPr>
                 <w:rStyle w:val="Hyperlink"/>
@@ -4749,7 +4749,7 @@
               <w:rPr>
                 <w:noProof/>
               </w:rPr>
-              <w:instrText xml:space="preserve"> PAGEREF _Toc244083972 \h </w:instrText>
+              <w:instrText xml:space="preserve"> PAGEREF _Toc244084256 \h </w:instrText>
             </w:r>
             <w:r>
               <w:rPr>
@@ -4789,7 +4789,7 @@
               <w14:ligatures w14:val="standardContextual"/>
             </w:rPr>
           </w:pPr>
-          <w:hyperlink w:anchor="_Toc244083973" w:history="1">
+          <w:hyperlink w:anchor="_Toc244084257" w:history="1">
             <w:r>
               <w:rPr>
                 <w:rStyle w:val="Hyperlink"/>
@@ -4813,7 +4813,7 @@
               <w:rPr>
                 <w:noProof/>
               </w:rPr>
-              <w:instrText xml:space="preserve"> PAGEREF _Toc244083973 \h </w:instrText>
+              <w:instrText xml:space="preserve"> PAGEREF _Toc244084257 \h </w:instrText>
             </w:r>
             <w:r>
               <w:rPr>
@@ -4922,7 +4922,7 @@
         <w:pStyle w:val="Heading1"/>
         <w:pageBreakBefore/>
       </w:pPr>
-      <w:bookmarkStart w:id="2" w:name="_Toc244083916"/>
+      <w:bookmarkStart w:id="2" w:name="_Toc244084200"/>
       <w:r>
         <w:t>CHAPTER 1.</w:t>
       </w:r>
@@ -4939,7 +4939,7 @@
           <w:tab w:val="left" w:pos="720"/>
         </w:tabs>
       </w:pPr>
-      <w:bookmarkStart w:id="3" w:name="_Toc244083917"/>
+      <w:bookmarkStart w:id="3" w:name="_Toc244084201"/>
       <w:r>
         <w:t>1.1.</w:t>
       </w:r>
@@ -5019,7 +5019,7 @@
           <w:tab w:val="left" w:pos="720"/>
         </w:tabs>
       </w:pPr>
-      <w:bookmarkStart w:id="4" w:name="_Toc244083918"/>
+      <w:bookmarkStart w:id="4" w:name="_Toc244084202"/>
       <w:r>
         <w:t>1.2.</w:t>
       </w:r>
@@ -5134,7 +5134,7 @@
           <w:tab w:val="left" w:pos="720"/>
         </w:tabs>
       </w:pPr>
-      <w:bookmarkStart w:id="5" w:name="_Toc244083919"/>
+      <w:bookmarkStart w:id="5" w:name="_Toc244084203"/>
       <w:r>
         <w:t>1.3.</w:t>
       </w:r>
@@ -5280,7 +5280,7 @@
           <w:tab w:val="left" w:pos="720"/>
         </w:tabs>
       </w:pPr>
-      <w:bookmarkStart w:id="6" w:name="_Toc244083920"/>
+      <w:bookmarkStart w:id="6" w:name="_Toc244084204"/>
       <w:r>
         <w:t>1.4.</w:t>
       </w:r>
@@ -5349,7 +5349,7 @@
       <w:pPr>
         <w:pStyle w:val="FigureCaption"/>
       </w:pPr>
-      <w:bookmarkStart w:id="7" w:name="_Toc244083947"/>
+      <w:bookmarkStart w:id="7" w:name="_Toc244084231"/>
       <w:r>
         <w:t>Figure 1.1  Gantt chart of the project schedule</w:t>
       </w:r>
@@ -5362,7 +5362,7 @@
           <w:tab w:val="left" w:pos="720"/>
         </w:tabs>
       </w:pPr>
-      <w:bookmarkStart w:id="8" w:name="_Toc244083921"/>
+      <w:bookmarkStart w:id="8" w:name="_Toc244084205"/>
       <w:r>
         <w:t>1.5.</w:t>
       </w:r>
@@ -5477,7 +5477,7 @@
         <w:pStyle w:val="Heading1"/>
         <w:pageBreakBefore/>
       </w:pPr>
-      <w:bookmarkStart w:id="9" w:name="_Toc244083922"/>
+      <w:bookmarkStart w:id="9" w:name="_Toc244084206"/>
       <w:r>
         <w:t>CHAPTER 2.</w:t>
       </w:r>
@@ -5494,7 +5494,7 @@
           <w:tab w:val="left" w:pos="720"/>
         </w:tabs>
       </w:pPr>
-      <w:bookmarkStart w:id="10" w:name="_Toc244083923"/>
+      <w:bookmarkStart w:id="10" w:name="_Toc244084207"/>
       <w:r>
         <w:t>2.1.</w:t>
       </w:r>
@@ -5509,7 +5509,7 @@
         <w:pStyle w:val="TableCaption"/>
         <w:keepNext/>
       </w:pPr>
-      <w:bookmarkStart w:id="11" w:name="_Toc244083962"/>
+      <w:bookmarkStart w:id="11" w:name="_Toc244084246"/>
       <w:r>
         <w:t>Table 2.1  Timeline of key findings related to the problem</w:t>
       </w:r>
@@ -6393,7 +6393,7 @@
           <w:tab w:val="left" w:pos="720"/>
         </w:tabs>
       </w:pPr>
-      <w:bookmarkStart w:id="12" w:name="_Toc244083924"/>
+      <w:bookmarkStart w:id="12" w:name="_Toc244084208"/>
       <w:r>
         <w:t>2.2.</w:t>
       </w:r>
@@ -6519,7 +6519,7 @@
           <w:tab w:val="left" w:pos="720"/>
         </w:tabs>
       </w:pPr>
-      <w:bookmarkStart w:id="13" w:name="_Toc244083925"/>
+      <w:bookmarkStart w:id="13" w:name="_Toc244084209"/>
       <w:r>
         <w:t>2.3.</w:t>
       </w:r>
@@ -6534,7 +6534,7 @@
         <w:pStyle w:val="TableCaption"/>
         <w:keepNext/>
       </w:pPr>
-      <w:bookmarkStart w:id="14" w:name="_Toc244083963"/>
+      <w:bookmarkStart w:id="14" w:name="_Toc244084247"/>
       <w:r>
         <w:t>Table 2.2  Analysis of reviewed literature and solutions</w:t>
       </w:r>
@@ -7452,7 +7452,7 @@
           <w:tab w:val="left" w:pos="720"/>
         </w:tabs>
       </w:pPr>
-      <w:bookmarkStart w:id="15" w:name="_Toc244083926"/>
+      <w:bookmarkStart w:id="15" w:name="_Toc244084210"/>
       <w:r>
         <w:t>2.4.</w:t>
       </w:r>
@@ -7487,7 +7487,7 @@
           <w:tab w:val="left" w:pos="720"/>
         </w:tabs>
       </w:pPr>
-      <w:bookmarkStart w:id="16" w:name="_Toc244083927"/>
+      <w:bookmarkStart w:id="16" w:name="_Toc244084211"/>
       <w:r>
         <w:t>2.5.</w:t>
       </w:r>
@@ -7549,7 +7549,7 @@
           <w:tab w:val="left" w:pos="720"/>
         </w:tabs>
       </w:pPr>
-      <w:bookmarkStart w:id="17" w:name="_Toc244083928"/>
+      <w:bookmarkStart w:id="17" w:name="_Toc244084212"/>
       <w:r>
         <w:t>2.6.</w:t>
       </w:r>
@@ -7662,7 +7662,7 @@
         <w:pStyle w:val="Heading1"/>
         <w:pageBreakBefore/>
       </w:pPr>
-      <w:bookmarkStart w:id="18" w:name="_Toc244083929"/>
+      <w:bookmarkStart w:id="18" w:name="_Toc244084213"/>
       <w:r>
         <w:t>CHAPTER 3.</w:t>
       </w:r>
@@ -7679,7 +7679,7 @@
           <w:tab w:val="left" w:pos="720"/>
         </w:tabs>
       </w:pPr>
-      <w:bookmarkStart w:id="19" w:name="_Toc244083930"/>
+      <w:bookmarkStart w:id="19" w:name="_Toc244084214"/>
       <w:r>
         <w:t>3.1.</w:t>
       </w:r>
@@ -7703,7 +7703,7 @@
         <w:pStyle w:val="TableCaption"/>
         <w:keepNext/>
       </w:pPr>
-      <w:bookmarkStart w:id="20" w:name="_Toc244083964"/>
+      <w:bookmarkStart w:id="20" w:name="_Toc244084248"/>
       <w:r>
         <w:t>Table 3.1  Evaluation of candidate features</w:t>
       </w:r>
@@ -9169,7 +9169,7 @@
           <w:tab w:val="left" w:pos="720"/>
         </w:tabs>
       </w:pPr>
-      <w:bookmarkStart w:id="21" w:name="_Toc244083931"/>
+      <w:bookmarkStart w:id="21" w:name="_Toc244084215"/>
       <w:r>
         <w:t>3.2.</w:t>
       </w:r>
@@ -9334,7 +9334,7 @@
           <w:tab w:val="left" w:pos="720"/>
         </w:tabs>
       </w:pPr>
-      <w:bookmarkStart w:id="22" w:name="_Toc244083932"/>
+      <w:bookmarkStart w:id="22" w:name="_Toc244084216"/>
       <w:r>
         <w:t>3.3.</w:t>
       </w:r>
@@ -9471,7 +9471,7 @@
           <w:tab w:val="left" w:pos="720"/>
         </w:tabs>
       </w:pPr>
-      <w:bookmarkStart w:id="23" w:name="_Toc244083933"/>
+      <w:bookmarkStart w:id="23" w:name="_Toc244084217"/>
       <w:r>
         <w:t>3.4.</w:t>
       </w:r>
@@ -9527,7 +9527,7 @@
           <w:tab w:val="left" w:pos="720"/>
         </w:tabs>
       </w:pPr>
-      <w:bookmarkStart w:id="24" w:name="_Toc244083934"/>
+      <w:bookmarkStart w:id="24" w:name="_Toc244084218"/>
       <w:r>
         <w:t>3.5.</w:t>
       </w:r>
@@ -9542,7 +9542,7 @@
         <w:pStyle w:val="TableCaption"/>
         <w:keepNext/>
       </w:pPr>
-      <w:bookmarkStart w:id="25" w:name="_Toc244083965"/>
+      <w:bookmarkStart w:id="25" w:name="_Toc244084249"/>
       <w:r>
         <w:t>Table 3.2  Comparison of alternative designs</w:t>
       </w:r>
@@ -10445,7 +10445,7 @@
           <w:tab w:val="left" w:pos="720"/>
         </w:tabs>
       </w:pPr>
-      <w:bookmarkStart w:id="26" w:name="_Toc244083935"/>
+      <w:bookmarkStart w:id="26" w:name="_Toc244084219"/>
       <w:r>
         <w:t>3.6.</w:t>
       </w:r>
@@ -10514,7 +10514,7 @@
       <w:pPr>
         <w:pStyle w:val="FigureCaption"/>
       </w:pPr>
-      <w:bookmarkStart w:id="27" w:name="_Toc244083948"/>
+      <w:bookmarkStart w:id="27" w:name="_Toc244084232"/>
       <w:r>
         <w:t>Figure 3.1  Block diagram of the layered architecture</w:t>
       </w:r>
@@ -10579,7 +10579,7 @@
       <w:pPr>
         <w:pStyle w:val="FigureCaption"/>
       </w:pPr>
-      <w:bookmarkStart w:id="28" w:name="_Toc244083949"/>
+      <w:bookmarkStart w:id="28" w:name="_Toc244084233"/>
       <w:r>
         <w:t>Figure 3.2  Data model of the application (entities and relationships)</w:t>
       </w:r>
@@ -10644,7 +10644,7 @@
       <w:pPr>
         <w:pStyle w:val="FigureCaption"/>
       </w:pPr>
-      <w:bookmarkStart w:id="29" w:name="_Toc244083950"/>
+      <w:bookmarkStart w:id="29" w:name="_Toc244084234"/>
       <w:r>
         <w:t>Figure 3.3  Class diagram of the Strategy, Observer and Singleton patterns</w:t>
       </w:r>
@@ -10700,7 +10700,7 @@
       <w:pPr>
         <w:pStyle w:val="FigureCaption"/>
       </w:pPr>
-      <w:bookmarkStart w:id="30" w:name="_Toc244083951"/>
+      <w:bookmarkStart w:id="30" w:name="_Toc244084235"/>
       <w:r>
         <w:t>Figure 3.4  Flowchart of the transactional add-expense operation</w:t>
       </w:r>
@@ -10835,7 +10835,7 @@
         <w:pStyle w:val="Heading1"/>
         <w:pageBreakBefore/>
       </w:pPr>
-      <w:bookmarkStart w:id="31" w:name="_Toc244083936"/>
+      <w:bookmarkStart w:id="31" w:name="_Toc244084220"/>
       <w:r>
         <w:t>CHAPTER 4.</w:t>
       </w:r>
@@ -10852,7 +10852,7 @@
           <w:tab w:val="left" w:pos="720"/>
         </w:tabs>
       </w:pPr>
-      <w:bookmarkStart w:id="32" w:name="_Toc244083937"/>
+      <w:bookmarkStart w:id="32" w:name="_Toc244084221"/>
       <w:r>
         <w:t>4.1.</w:t>
       </w:r>
@@ -10875,7 +10875,7 @@
         <w:pStyle w:val="TableCaption"/>
         <w:keepNext/>
       </w:pPr>
-      <w:bookmarkStart w:id="33" w:name="_Toc244083966"/>
+      <w:bookmarkStart w:id="33" w:name="_Toc244084250"/>
       <w:r>
         <w:t>Table 4.1  Tools used in the project</w:t>
       </w:r>
@@ -11807,7 +11807,7 @@
         <w:pStyle w:val="TableCaption"/>
         <w:keepNext/>
       </w:pPr>
-      <w:bookmarkStart w:id="34" w:name="_Toc244083967"/>
+      <w:bookmarkStart w:id="34" w:name="_Toc244084251"/>
       <w:r>
         <w:t>Table 4.2  Split strategies</w:t>
       </w:r>
@@ -12513,7 +12513,7 @@
         <w:pStyle w:val="TableCaption"/>
         <w:keepNext/>
       </w:pPr>
-      <w:bookmarkStart w:id="35" w:name="_Toc244083968"/>
+      <w:bookmarkStart w:id="35" w:name="_Toc244084252"/>
       <w:r>
         <w:t>Table 4.3  Balances for the demonstration scenario</w:t>
       </w:r>
@@ -13196,7 +13196,7 @@
         <w:pStyle w:val="TableCaption"/>
         <w:keepNext/>
       </w:pPr>
-      <w:bookmarkStart w:id="36" w:name="_Toc244083969"/>
+      <w:bookmarkStart w:id="36" w:name="_Toc244084253"/>
       <w:r>
         <w:t>Table 4.4  REST endpoints</w:t>
       </w:r>
@@ -15875,7 +15875,7 @@
       <w:pPr>
         <w:pStyle w:val="FigureCaption"/>
       </w:pPr>
-      <w:bookmarkStart w:id="37" w:name="_Toc244083952"/>
+      <w:bookmarkStart w:id="37" w:name="_Toc244084236"/>
       <w:r>
         <w:t>Figure 4.1  Dashboard after loading the demonstration data (light theme)</w:t>
       </w:r>
@@ -15931,7 +15931,7 @@
       <w:pPr>
         <w:pStyle w:val="FigureCaption"/>
       </w:pPr>
-      <w:bookmarkStart w:id="38" w:name="_Toc244083953"/>
+      <w:bookmarkStart w:id="38" w:name="_Toc244084237"/>
       <w:r>
         <w:t>Figure 4.2  PERCENTAGE split with the live split meter showing 10% unallocated</w:t>
       </w:r>
@@ -15987,7 +15987,7 @@
       <w:pPr>
         <w:pStyle w:val="FigureCaption"/>
       </w:pPr>
-      <w:bookmarkStart w:id="39" w:name="_Toc244083954"/>
+      <w:bookmarkStart w:id="39" w:name="_Toc244084238"/>
       <w:r>
         <w:t>Figure 4.3  The server rejects the invalid split with 400 Bad Request</w:t>
       </w:r>
@@ -16043,7 +16043,7 @@
       <w:pPr>
         <w:pStyle w:val="FigureCaption"/>
       </w:pPr>
-      <w:bookmarkStart w:id="40" w:name="_Toc244083955"/>
+      <w:bookmarkStart w:id="40" w:name="_Toc244084239"/>
       <w:r>
         <w:t>Figure 4.4  Expense list with per-member shares and the AuditLogger activity feed</w:t>
       </w:r>
@@ -16099,7 +16099,7 @@
       <w:pPr>
         <w:pStyle w:val="FigureCaption"/>
       </w:pPr>
-      <w:bookmarkStart w:id="41" w:name="_Toc244083956"/>
+      <w:bookmarkStart w:id="41" w:name="_Toc244084240"/>
       <w:r>
         <w:t>Figure 4.5  Settle-up slip after a partial payment, with Settle buttons and payment history</w:t>
       </w:r>
@@ -16155,7 +16155,7 @@
       <w:pPr>
         <w:pStyle w:val="FigureCaption"/>
       </w:pPr>
-      <w:bookmarkStart w:id="42" w:name="_Toc244083957"/>
+      <w:bookmarkStart w:id="42" w:name="_Toc244084241"/>
       <w:r>
         <w:t>Figure 4.6  Deleting a member who still has expenses returns 409 Conflict</w:t>
       </w:r>
@@ -16211,7 +16211,7 @@
       <w:pPr>
         <w:pStyle w:val="FigureCaption"/>
       </w:pPr>
-      <w:bookmarkStart w:id="43" w:name="_Toc244083958"/>
+      <w:bookmarkStart w:id="43" w:name="_Toc244084242"/>
       <w:r>
         <w:t>Figure 4.7  Inline confirmation before deleting a group</w:t>
       </w:r>
@@ -16267,7 +16267,7 @@
       <w:pPr>
         <w:pStyle w:val="FigureCaption"/>
       </w:pPr>
-      <w:bookmarkStart w:id="44" w:name="_Toc244083959"/>
+      <w:bookmarkStart w:id="44" w:name="_Toc244084243"/>
       <w:r>
         <w:t>Figure 4.8  Dashboard in the dark theme</w:t>
       </w:r>
@@ -16323,7 +16323,7 @@
       <w:pPr>
         <w:pStyle w:val="FigureCaption"/>
       </w:pPr>
-      <w:bookmarkStart w:id="45" w:name="_Toc244083960"/>
+      <w:bookmarkStart w:id="45" w:name="_Toc244084244"/>
       <w:r>
         <w:t>Figure 4.9  Backend test suite run with npm test (node:test, 6 tests, 0 failures)</w:t>
       </w:r>
@@ -16351,7 +16351,7 @@
         <w:pStyle w:val="TableCaption"/>
         <w:keepNext/>
       </w:pPr>
-      <w:bookmarkStart w:id="46" w:name="_Toc244083970"/>
+      <w:bookmarkStart w:id="46" w:name="_Toc244084254"/>
       <w:r>
         <w:t>Table 4.5  Functional test cases and results</w:t>
       </w:r>
@@ -18869,7 +18869,7 @@
       <w:pPr>
         <w:pStyle w:val="FigureCaption"/>
       </w:pPr>
-      <w:bookmarkStart w:id="47" w:name="_Toc244083961"/>
+      <w:bookmarkStart w:id="47" w:name="_Toc244084245"/>
       <w:r>
         <w:t>Figure 4.10  Newman run of the Postman collection (last two folders and summary)</w:t>
       </w:r>
@@ -18895,7 +18895,7 @@
         <w:pStyle w:val="TableCaption"/>
         <w:keepNext/>
       </w:pPr>
-      <w:bookmarkStart w:id="48" w:name="_Toc244083971"/>
+      <w:bookmarkStart w:id="48" w:name="_Toc244084255"/>
       <w:r>
         <w:t>Table 4.6  Greedy settlement compared with the exact minimum</w:t>
       </w:r>
@@ -20070,7 +20070,7 @@
         <w:pStyle w:val="Heading1"/>
         <w:pageBreakBefore/>
       </w:pPr>
-      <w:bookmarkStart w:id="49" w:name="_Toc244083938"/>
+      <w:bookmarkStart w:id="49" w:name="_Toc244084222"/>
       <w:r>
         <w:t>CHAPTER 5.</w:t>
       </w:r>
@@ -20087,7 +20087,7 @@
           <w:tab w:val="left" w:pos="720"/>
         </w:tabs>
       </w:pPr>
-      <w:bookmarkStart w:id="50" w:name="_Toc244083939"/>
+      <w:bookmarkStart w:id="50" w:name="_Toc244084223"/>
       <w:r>
         <w:t>5.1.</w:t>
       </w:r>
@@ -20112,7 +20112,7 @@
         <w:jc w:val="both"/>
       </w:pPr>
       <w:r>
-        <w:t>The complete source code, Postman collection, README, Postman test guide and viva cheat-sheet are in the GitHub repository expense-splitter-fsd. The app runs locally with npm run setup, npm run build and npm start, and is deployed on Vercel.</w:t>
+        <w:t>The complete source code, Postman collection, README, Postman test guide and viva cheat-sheet are in the GitHub repository github.com/kaone31056789/expense-splitter-fsd. The app runs locally with npm run setup, npm run build and npm start, and is deployed on Vercel at https://expense-splitter-fsd.vercel.app.</w:t>
       </w:r>
     </w:p>
     <w:p>
@@ -20213,7 +20213,7 @@
           <w:tab w:val="left" w:pos="720"/>
         </w:tabs>
       </w:pPr>
-      <w:bookmarkStart w:id="51" w:name="_Toc244083940"/>
+      <w:bookmarkStart w:id="51" w:name="_Toc244084224"/>
       <w:r>
         <w:t>5.2.</w:t>
       </w:r>
@@ -20388,7 +20388,7 @@
         <w:pStyle w:val="Heading1"/>
         <w:pageBreakBefore/>
       </w:pPr>
-      <w:bookmarkStart w:id="52" w:name="_Toc244083941"/>
+      <w:bookmarkStart w:id="52" w:name="_Toc244084225"/>
       <w:r>
         <w:t>REFERENCES</w:t>
       </w:r>
@@ -20891,7 +20891,7 @@
         <w:pStyle w:val="Heading1"/>
         <w:pageBreakBefore/>
       </w:pPr>
-      <w:bookmarkStart w:id="53" w:name="_Toc244083942"/>
+      <w:bookmarkStart w:id="53" w:name="_Toc244084226"/>
       <w:r>
         <w:t>APPENDIX</w:t>
       </w:r>
@@ -20904,7 +20904,7 @@
           <w:tab w:val="left" w:pos="720"/>
         </w:tabs>
       </w:pPr>
-      <w:bookmarkStart w:id="54" w:name="_Toc244083943"/>
+      <w:bookmarkStart w:id="54" w:name="_Toc244084227"/>
       <w:r>
         <w:t>A.</w:t>
       </w:r>
@@ -20919,7 +20919,7 @@
         <w:pStyle w:val="TableCaption"/>
         <w:keepNext/>
       </w:pPr>
-      <w:bookmarkStart w:id="55" w:name="_Toc244083972"/>
+      <w:bookmarkStart w:id="55" w:name="_Toc244084256"/>
       <w:r>
         <w:t>Table A.1  Design checklist</w:t>
       </w:r>
@@ -22005,7 +22005,7 @@
           <w:tab w:val="left" w:pos="720"/>
         </w:tabs>
       </w:pPr>
-      <w:bookmarkStart w:id="56" w:name="_Toc244083944"/>
+      <w:bookmarkStart w:id="56" w:name="_Toc244084228"/>
       <w:r>
         <w:t>B.</w:t>
       </w:r>
@@ -22020,7 +22020,7 @@
         <w:pStyle w:val="TableCaption"/>
         <w:keepNext/>
       </w:pPr>
-      <w:bookmarkStart w:id="57" w:name="_Toc244083973"/>
+      <w:bookmarkStart w:id="57" w:name="_Toc244084257"/>
       <w:r>
         <w:t>Table A.2  Technical summary of Expense Splitter</w:t>
       </w:r>
@@ -22774,7 +22774,7 @@
           <w:tab w:val="left" w:pos="720"/>
         </w:tabs>
       </w:pPr>
-      <w:bookmarkStart w:id="58" w:name="_Toc244083945"/>
+      <w:bookmarkStart w:id="58" w:name="_Toc244084229"/>
       <w:r>
         <w:t>C.</w:t>
       </w:r>
@@ -23906,7 +23906,7 @@
           <w:tab w:val="left" w:pos="720"/>
         </w:tabs>
       </w:pPr>
-      <w:bookmarkStart w:id="59" w:name="_Toc244083946"/>
+      <w:bookmarkStart w:id="59" w:name="_Toc244084230"/>
       <w:r>
         <w:t>D.</w:t>
       </w:r>
@@ -24400,7 +24400,7 @@
         <w:jc w:val="center"/>
       </w:pPr>
       <w:r>
-        <w:t>GitHub: expense-splitter-fsd  ·  run with npm run setup, npm run build, npm start</w:t>
+        <w:t>Live: expense-splitter-fsd.vercel.app  ·  GitHub: github.com/kaone31056789/expense-splitter-fsd</w:t>
       </w:r>
     </w:p>
     <w:p>

</xml_diff>